<commit_message>
Remove A~G conditions, expand exhibitor list to 10 companies
- Drop confusing A~G checkbox columns from both HTML and Word
- Replace with plain columns: 主要製品 / OEM/ODM / 製造拠点 / 分類 / 商談のポイント / 優先度
- Expand from 5 to 10 companies: 6 targets + 2 partner candidates + 2 competitor research
- Add section divider rows to clearly separate the three groups
</commit_message>
<xml_diff>
--- a/ライフスタイルWeek報告書_Sanhe.docx
+++ b/ライフスタイルWeek報告書_Sanhe.docx
@@ -2278,7 +2278,7 @@
                 <w:color w:val="0F2D5E"/>
                 <w:sz w:val="28"/>
               </w:rPr>
-              <w:t>出展者分析 — アプローチ候補企業</w:t>
+              <w:t>出展者分析（調査済み10社）</w:t>
             </w:r>
           </w:p>
           <w:p>
@@ -2292,7 +2292,7 @@
                 <w:color w:val="64748B"/>
                 <w:sz w:val="16"/>
               </w:rPr>
-              <w:t>EXHIBITOR ANALYSIS — TARGET &amp; COMPETITOR COMPANIES</w:t>
+              <w:t>EXHIBITOR ANALYSIS — 10 COMPANIES IDENTIFIED</w:t>
             </w:r>
           </w:p>
         </w:tc>
@@ -2352,86 +2352,13 @@
                 <w:color w:val="78350F"/>
                 <w:sz w:val="18"/>
               </w:rPr>
-              <w:t>「ファッション雑貨EXPO」「インバウンド向けグッズEXPO」セクションの出展者データ（ユーザー提供）を分析。ログイン認証のためシステムによる全件取得は不可。全1,250社中の一部分析。</w:t>
+              <w:t>「ファッション雑貨EXPO」「インバウンド向けグッズEXPO」セクションの出展者データ（全3バッチ）を分析。ログイン認証のためシステムによる全件取得は不可。全1,250社中の抽出分析。</w:t>
             </w:r>
           </w:p>
         </w:tc>
       </w:tr>
     </w:tbl>
     <w:p/>
-    <w:p>
-      <w:pPr>
-        <w:spacing w:before="0" w:after="80"/>
-      </w:pPr>
-      <w:r>
-        <w:rPr>
-          <w:b/>
-          <w:i w:val="0"/>
-          <w:color w:val="1E3A5F"/>
-          <w:sz w:val="18"/>
-        </w:rPr>
-        <w:t>凡例：</w:t>
-      </w:r>
-      <w:r>
-        <w:rPr>
-          <w:b w:val="0"/>
-          <w:i w:val="0"/>
-          <w:color w:val="166534"/>
-          <w:sz w:val="18"/>
-        </w:rPr>
-        <w:t xml:space="preserve"> ✓ 条件合致  </w:t>
-      </w:r>
-      <w:r>
-        <w:rPr>
-          <w:b w:val="0"/>
-          <w:i w:val="0"/>
-          <w:color w:val="D97706"/>
-          <w:sz w:val="18"/>
-        </w:rPr>
-        <w:t xml:space="preserve">△ 部分合致  </w:t>
-      </w:r>
-      <w:r>
-        <w:rPr>
-          <w:b w:val="0"/>
-          <w:i w:val="0"/>
-          <w:color w:val="64748B"/>
-          <w:sz w:val="18"/>
-        </w:rPr>
-        <w:t xml:space="preserve">? 不明  </w:t>
-      </w:r>
-      <w:r>
-        <w:rPr>
-          <w:b w:val="0"/>
-          <w:i w:val="0"/>
-          <w:color w:val="DC2626"/>
-          <w:sz w:val="18"/>
-        </w:rPr>
-        <w:t xml:space="preserve">✗ 非該当  </w:t>
-      </w:r>
-      <w:r>
-        <w:rPr>
-          <w:b w:val="0"/>
-          <w:i w:val="0"/>
-          <w:color w:val="64748B"/>
-          <w:sz w:val="16"/>
-        </w:rPr>
-        <w:t xml:space="preserve">　条件：A革製品 / B年商 / C東京 / D海外展開 / E海外OEM / F英語対応 / G自社ブランド</w:t>
-      </w:r>
-    </w:p>
-    <w:p>
-      <w:pPr>
-        <w:spacing w:before="80" w:after="40"/>
-      </w:pPr>
-      <w:r>
-        <w:rPr>
-          <w:b/>
-          <w:i w:val="0"/>
-          <w:color w:val="0F2D5E"/>
-          <w:sz w:val="22"/>
-        </w:rPr>
-        <w:t>◎ アプローチ優先ターゲット（5社）</w:t>
-      </w:r>
-    </w:p>
     <w:tbl>
       <w:tblPr>
         <w:tblW w:type="auto" w:w="0"/>
@@ -2439,54 +2366,18 @@
         <w:tblCellSpacing w:w="0" w:type="dxa"/>
       </w:tblPr>
       <w:tblGrid>
-        <w:gridCol w:w="2154"/>
-        <w:gridCol w:w="312"/>
-        <w:gridCol w:w="312"/>
-        <w:gridCol w:w="312"/>
-        <w:gridCol w:w="312"/>
-        <w:gridCol w:w="312"/>
-        <w:gridCol w:w="312"/>
-        <w:gridCol w:w="312"/>
+        <w:gridCol w:w="1984"/>
+        <w:gridCol w:w="1361"/>
+        <w:gridCol w:w="680"/>
         <w:gridCol w:w="1247"/>
-        <w:gridCol w:w="4365"/>
+        <w:gridCol w:w="1247"/>
+        <w:gridCol w:w="3118"/>
+        <w:gridCol w:w="567"/>
       </w:tblGrid>
       <w:tr>
         <w:tc>
           <w:tcPr>
-            <w:tcW w:type="dxa" w:w="941"/>
-            <w:shd w:val="clear" w:color="auto" w:fill="0F2D5E"/>
-            <w:tcMar>
-              <w:top w:w="60" w:type="dxa"/>
-              <w:bottom w:w="60" w:type="dxa"/>
-              <w:left w:w="80" w:type="dxa"/>
-              <w:right w:w="80" w:type="dxa"/>
-            </w:tcMar>
-            <w:tcBorders>
-              <w:top w:val="single" w:sz="4" w:space="0" w:color="DBEAFE"/>
-              <w:bottom w:val="single" w:sz="4" w:space="0" w:color="DBEAFE"/>
-              <w:left w:val="single" w:sz="4" w:space="0" w:color="DBEAFE"/>
-              <w:right w:val="single" w:sz="4" w:space="0" w:color="DBEAFE"/>
-            </w:tcBorders>
-          </w:tcPr>
-          <w:p>
-            <w:pPr>
-              <w:jc w:val="left"/>
-              <w:spacing w:before="40" w:after="40"/>
-            </w:pPr>
-            <w:r>
-              <w:rPr>
-                <w:b/>
-                <w:i w:val="0"/>
-                <w:color w:val="93C5FD"/>
-                <w:sz w:val="18"/>
-              </w:rPr>
-              <w:t>企業名 / 概要</w:t>
-            </w:r>
-          </w:p>
-        </w:tc>
-        <w:tc>
-          <w:tcPr>
-            <w:tcW w:type="dxa" w:w="941"/>
+            <w:tcW w:type="dxa" w:w="1344"/>
             <w:shd w:val="clear" w:color="auto" w:fill="0F2D5E"/>
             <w:tcMar>
               <w:top w:w="60" w:type="dxa"/>
@@ -2513,13 +2404,13 @@
                 <w:color w:val="93C5FD"/>
                 <w:sz w:val="18"/>
               </w:rPr>
-              <w:t>A</w:t>
+              <w:t>企業名 / 所在地</w:t>
             </w:r>
           </w:p>
         </w:tc>
         <w:tc>
           <w:tcPr>
-            <w:tcW w:type="dxa" w:w="941"/>
+            <w:tcW w:type="dxa" w:w="1344"/>
             <w:shd w:val="clear" w:color="auto" w:fill="0F2D5E"/>
             <w:tcMar>
               <w:top w:w="60" w:type="dxa"/>
@@ -2546,13 +2437,13 @@
                 <w:color w:val="93C5FD"/>
                 <w:sz w:val="18"/>
               </w:rPr>
-              <w:t>B</w:t>
+              <w:t>主要製品</w:t>
             </w:r>
           </w:p>
         </w:tc>
         <w:tc>
           <w:tcPr>
-            <w:tcW w:type="dxa" w:w="941"/>
+            <w:tcW w:type="dxa" w:w="1344"/>
             <w:shd w:val="clear" w:color="auto" w:fill="0F2D5E"/>
             <w:tcMar>
               <w:top w:w="60" w:type="dxa"/>
@@ -2579,13 +2470,15 @@
                 <w:color w:val="93C5FD"/>
                 <w:sz w:val="18"/>
               </w:rPr>
-              <w:t>C</w:t>
+              <w:t>OEM/</w:t>
+              <w:br/>
+              <w:t>ODM</w:t>
             </w:r>
           </w:p>
         </w:tc>
         <w:tc>
           <w:tcPr>
-            <w:tcW w:type="dxa" w:w="941"/>
+            <w:tcW w:type="dxa" w:w="1344"/>
             <w:shd w:val="clear" w:color="auto" w:fill="0F2D5E"/>
             <w:tcMar>
               <w:top w:w="60" w:type="dxa"/>
@@ -2612,13 +2505,13 @@
                 <w:color w:val="93C5FD"/>
                 <w:sz w:val="18"/>
               </w:rPr>
-              <w:t>D</w:t>
+              <w:t>製造拠点</w:t>
             </w:r>
           </w:p>
         </w:tc>
         <w:tc>
           <w:tcPr>
-            <w:tcW w:type="dxa" w:w="941"/>
+            <w:tcW w:type="dxa" w:w="1344"/>
             <w:shd w:val="clear" w:color="auto" w:fill="0F2D5E"/>
             <w:tcMar>
               <w:top w:w="60" w:type="dxa"/>
@@ -2645,13 +2538,13 @@
                 <w:color w:val="93C5FD"/>
                 <w:sz w:val="18"/>
               </w:rPr>
-              <w:t>E</w:t>
+              <w:t>分類</w:t>
             </w:r>
           </w:p>
         </w:tc>
         <w:tc>
           <w:tcPr>
-            <w:tcW w:type="dxa" w:w="941"/>
+            <w:tcW w:type="dxa" w:w="1344"/>
             <w:shd w:val="clear" w:color="auto" w:fill="0F2D5E"/>
             <w:tcMar>
               <w:top w:w="60" w:type="dxa"/>
@@ -2678,46 +2571,13 @@
                 <w:color w:val="93C5FD"/>
                 <w:sz w:val="18"/>
               </w:rPr>
-              <w:t>F</w:t>
+              <w:t>商談のポイント</w:t>
             </w:r>
           </w:p>
         </w:tc>
         <w:tc>
           <w:tcPr>
-            <w:tcW w:type="dxa" w:w="941"/>
-            <w:shd w:val="clear" w:color="auto" w:fill="0F2D5E"/>
-            <w:tcMar>
-              <w:top w:w="60" w:type="dxa"/>
-              <w:bottom w:w="60" w:type="dxa"/>
-              <w:left w:w="80" w:type="dxa"/>
-              <w:right w:w="80" w:type="dxa"/>
-            </w:tcMar>
-            <w:tcBorders>
-              <w:top w:val="single" w:sz="4" w:space="0" w:color="DBEAFE"/>
-              <w:bottom w:val="single" w:sz="4" w:space="0" w:color="DBEAFE"/>
-              <w:left w:val="single" w:sz="4" w:space="0" w:color="DBEAFE"/>
-              <w:right w:val="single" w:sz="4" w:space="0" w:color="DBEAFE"/>
-            </w:tcBorders>
-          </w:tcPr>
-          <w:p>
-            <w:pPr>
-              <w:jc w:val="center"/>
-              <w:spacing w:before="40" w:after="40"/>
-            </w:pPr>
-            <w:r>
-              <w:rPr>
-                <w:b/>
-                <w:i w:val="0"/>
-                <w:color w:val="93C5FD"/>
-                <w:sz w:val="18"/>
-              </w:rPr>
-              <w:t>G</w:t>
-            </w:r>
-          </w:p>
-        </w:tc>
-        <w:tc>
-          <w:tcPr>
-            <w:tcW w:type="dxa" w:w="941"/>
+            <w:tcW w:type="dxa" w:w="1344"/>
             <w:shd w:val="clear" w:color="auto" w:fill="0F2D5E"/>
             <w:tcMar>
               <w:top w:w="60" w:type="dxa"/>
@@ -2748,26 +2608,23 @@
             </w:r>
           </w:p>
         </w:tc>
+      </w:tr>
+      <w:tr>
         <w:tc>
           <w:tcPr>
-            <w:tcW w:type="dxa" w:w="941"/>
+            <w:tcW w:type="dxa" w:w="10204"/>
+            <w:gridSpan w:val="7"/>
             <w:shd w:val="clear" w:color="auto" w:fill="0F2D5E"/>
             <w:tcMar>
               <w:top w:w="60" w:type="dxa"/>
               <w:bottom w:w="60" w:type="dxa"/>
-              <w:left w:w="80" w:type="dxa"/>
+              <w:left w:w="140" w:type="dxa"/>
               <w:right w:w="80" w:type="dxa"/>
             </w:tcMar>
-            <w:tcBorders>
-              <w:top w:val="single" w:sz="4" w:space="0" w:color="DBEAFE"/>
-              <w:bottom w:val="single" w:sz="4" w:space="0" w:color="DBEAFE"/>
-              <w:left w:val="single" w:sz="4" w:space="0" w:color="DBEAFE"/>
-              <w:right w:val="single" w:sz="4" w:space="0" w:color="DBEAFE"/>
-            </w:tcBorders>
           </w:tcPr>
           <w:p>
             <w:pPr>
-              <w:jc w:val="center"/>
+              <w:jc w:val="left"/>
               <w:spacing w:before="40" w:after="40"/>
             </w:pPr>
             <w:r>
@@ -2777,7 +2634,7 @@
                 <w:color w:val="93C5FD"/>
                 <w:sz w:val="18"/>
               </w:rPr>
-              <w:t>メモ</w:t>
+              <w:t>▌  アプローチターゲット（商談候補）</w:t>
             </w:r>
           </w:p>
         </w:tc>
@@ -2785,12 +2642,12 @@
       <w:tr>
         <w:tc>
           <w:tcPr>
-            <w:tcW w:type="dxa" w:w="941"/>
+            <w:tcW w:type="dxa" w:w="1984"/>
             <w:shd w:val="clear" w:color="auto" w:fill="EFF6FF"/>
             <w:tcMar>
-              <w:top w:w="50" w:type="dxa"/>
-              <w:bottom w:w="50" w:type="dxa"/>
-              <w:left w:w="80" w:type="dxa"/>
+              <w:top w:w="60" w:type="dxa"/>
+              <w:bottom w:w="60" w:type="dxa"/>
+              <w:left w:w="100" w:type="dxa"/>
               <w:right w:w="80" w:type="dxa"/>
             </w:tcMar>
             <w:tcBorders>
@@ -2799,7 +2656,6 @@
               <w:left w:val="single" w:sz="4" w:space="0" w:color="DBEAFE"/>
               <w:right w:val="single" w:sz="4" w:space="0" w:color="DBEAFE"/>
             </w:tcBorders>
-            <w:vAlign w:val="center"/>
           </w:tcPr>
           <w:p>
             <w:pPr>
@@ -2827,17 +2683,17 @@
                 <w:color w:val="64748B"/>
                 <w:sz w:val="16"/>
               </w:rPr>
-              <w:t>バッグ・財布メーカー / 創業48年 / 東京・中野区</w:t>
+              <w:t>東京・中野区 / 創業48年</w:t>
             </w:r>
           </w:p>
         </w:tc>
         <w:tc>
           <w:tcPr>
-            <w:tcW w:type="dxa" w:w="941"/>
+            <w:tcW w:type="dxa" w:w="1361"/>
             <w:shd w:val="clear" w:color="auto" w:fill="EFF6FF"/>
             <w:tcMar>
-              <w:top w:w="50" w:type="dxa"/>
-              <w:bottom w:w="50" w:type="dxa"/>
+              <w:top w:w="60" w:type="dxa"/>
+              <w:bottom w:w="60" w:type="dxa"/>
               <w:left w:w="80" w:type="dxa"/>
               <w:right w:w="80" w:type="dxa"/>
             </w:tcMar>
@@ -2847,31 +2703,30 @@
               <w:left w:val="single" w:sz="4" w:space="0" w:color="DBEAFE"/>
               <w:right w:val="single" w:sz="4" w:space="0" w:color="DBEAFE"/>
             </w:tcBorders>
-            <w:vAlign w:val="center"/>
           </w:tcPr>
           <w:p>
             <w:pPr>
-              <w:jc w:val="center"/>
+              <w:jc w:val="left"/>
               <w:spacing w:before="40" w:after="40"/>
             </w:pPr>
             <w:r>
               <w:rPr>
-                <w:b/>
+                <w:b w:val="0"/>
                 <w:i w:val="0"/>
-                <w:color w:val="166534"/>
-                <w:sz w:val="22"/>
+                <w:color w:val="475569"/>
+                <w:sz w:val="18"/>
               </w:rPr>
-              <w:t>✓</w:t>
+              <w:t>バッグ・財布・革小物</w:t>
             </w:r>
           </w:p>
         </w:tc>
         <w:tc>
           <w:tcPr>
-            <w:tcW w:type="dxa" w:w="941"/>
+            <w:tcW w:type="dxa" w:w="680"/>
             <w:shd w:val="clear" w:color="auto" w:fill="EFF6FF"/>
             <w:tcMar>
-              <w:top w:w="50" w:type="dxa"/>
-              <w:bottom w:w="50" w:type="dxa"/>
+              <w:top w:w="60" w:type="dxa"/>
+              <w:bottom w:w="60" w:type="dxa"/>
               <w:left w:w="80" w:type="dxa"/>
               <w:right w:w="80" w:type="dxa"/>
             </w:tcMar>
@@ -2881,7 +2736,6 @@
               <w:left w:val="single" w:sz="4" w:space="0" w:color="DBEAFE"/>
               <w:right w:val="single" w:sz="4" w:space="0" w:color="DBEAFE"/>
             </w:tcBorders>
-            <w:vAlign w:val="center"/>
           </w:tcPr>
           <w:p>
             <w:pPr>
@@ -2892,20 +2746,20 @@
               <w:rPr>
                 <w:b w:val="0"/>
                 <w:i w:val="0"/>
-                <w:color w:val="D97706"/>
-                <w:sz w:val="22"/>
+                <w:color w:val="475569"/>
+                <w:sz w:val="18"/>
               </w:rPr>
-              <w:t>△</w:t>
+              <w:t>あり</w:t>
             </w:r>
           </w:p>
         </w:tc>
         <w:tc>
           <w:tcPr>
-            <w:tcW w:type="dxa" w:w="941"/>
+            <w:tcW w:type="dxa" w:w="1247"/>
             <w:shd w:val="clear" w:color="auto" w:fill="EFF6FF"/>
             <w:tcMar>
-              <w:top w:w="50" w:type="dxa"/>
-              <w:bottom w:w="50" w:type="dxa"/>
+              <w:top w:w="60" w:type="dxa"/>
+              <w:bottom w:w="60" w:type="dxa"/>
               <w:left w:w="80" w:type="dxa"/>
               <w:right w:w="80" w:type="dxa"/>
             </w:tcMar>
@@ -2915,41 +2769,6 @@
               <w:left w:val="single" w:sz="4" w:space="0" w:color="DBEAFE"/>
               <w:right w:val="single" w:sz="4" w:space="0" w:color="DBEAFE"/>
             </w:tcBorders>
-            <w:vAlign w:val="center"/>
-          </w:tcPr>
-          <w:p>
-            <w:pPr>
-              <w:jc w:val="center"/>
-              <w:spacing w:before="40" w:after="40"/>
-            </w:pPr>
-            <w:r>
-              <w:rPr>
-                <w:b/>
-                <w:i w:val="0"/>
-                <w:color w:val="166534"/>
-                <w:sz w:val="22"/>
-              </w:rPr>
-              <w:t>✓</w:t>
-            </w:r>
-          </w:p>
-        </w:tc>
-        <w:tc>
-          <w:tcPr>
-            <w:tcW w:type="dxa" w:w="941"/>
-            <w:shd w:val="clear" w:color="auto" w:fill="EFF6FF"/>
-            <w:tcMar>
-              <w:top w:w="50" w:type="dxa"/>
-              <w:bottom w:w="50" w:type="dxa"/>
-              <w:left w:w="80" w:type="dxa"/>
-              <w:right w:w="80" w:type="dxa"/>
-            </w:tcMar>
-            <w:tcBorders>
-              <w:top w:val="single" w:sz="4" w:space="0" w:color="DBEAFE"/>
-              <w:bottom w:val="single" w:sz="4" w:space="0" w:color="DBEAFE"/>
-              <w:left w:val="single" w:sz="4" w:space="0" w:color="DBEAFE"/>
-              <w:right w:val="single" w:sz="4" w:space="0" w:color="DBEAFE"/>
-            </w:tcBorders>
-            <w:vAlign w:val="center"/>
           </w:tcPr>
           <w:p>
             <w:pPr>
@@ -2960,20 +2779,22 @@
               <w:rPr>
                 <w:b w:val="0"/>
                 <w:i w:val="0"/>
-                <w:color w:val="64748B"/>
-                <w:sz w:val="22"/>
+                <w:color w:val="475569"/>
+                <w:sz w:val="18"/>
               </w:rPr>
-              <w:t>?</w:t>
+              <w:t>中国（協力工場</w:t>
+              <w:br/>
+              <w:t>社員常駐）</w:t>
             </w:r>
           </w:p>
         </w:tc>
         <w:tc>
           <w:tcPr>
-            <w:tcW w:type="dxa" w:w="941"/>
+            <w:tcW w:type="dxa" w:w="1247"/>
             <w:shd w:val="clear" w:color="auto" w:fill="EFF6FF"/>
             <w:tcMar>
-              <w:top w:w="50" w:type="dxa"/>
-              <w:bottom w:w="50" w:type="dxa"/>
+              <w:top w:w="60" w:type="dxa"/>
+              <w:bottom w:w="60" w:type="dxa"/>
               <w:left w:w="80" w:type="dxa"/>
               <w:right w:w="80" w:type="dxa"/>
             </w:tcMar>
@@ -2983,113 +2804,10 @@
               <w:left w:val="single" w:sz="4" w:space="0" w:color="DBEAFE"/>
               <w:right w:val="single" w:sz="4" w:space="0" w:color="DBEAFE"/>
             </w:tcBorders>
-            <w:vAlign w:val="center"/>
           </w:tcPr>
           <w:p>
             <w:pPr>
-              <w:jc w:val="center"/>
-              <w:spacing w:before="40" w:after="40"/>
-            </w:pPr>
-            <w:r>
-              <w:rPr>
-                <w:b/>
-                <w:i w:val="0"/>
-                <w:color w:val="166534"/>
-                <w:sz w:val="22"/>
-              </w:rPr>
-              <w:t>✓</w:t>
-            </w:r>
-          </w:p>
-        </w:tc>
-        <w:tc>
-          <w:tcPr>
-            <w:tcW w:type="dxa" w:w="941"/>
-            <w:shd w:val="clear" w:color="auto" w:fill="EFF6FF"/>
-            <w:tcMar>
-              <w:top w:w="50" w:type="dxa"/>
-              <w:bottom w:w="50" w:type="dxa"/>
-              <w:left w:w="80" w:type="dxa"/>
-              <w:right w:w="80" w:type="dxa"/>
-            </w:tcMar>
-            <w:tcBorders>
-              <w:top w:val="single" w:sz="4" w:space="0" w:color="DBEAFE"/>
-              <w:bottom w:val="single" w:sz="4" w:space="0" w:color="DBEAFE"/>
-              <w:left w:val="single" w:sz="4" w:space="0" w:color="DBEAFE"/>
-              <w:right w:val="single" w:sz="4" w:space="0" w:color="DBEAFE"/>
-            </w:tcBorders>
-            <w:vAlign w:val="center"/>
-          </w:tcPr>
-          <w:p>
-            <w:pPr>
-              <w:jc w:val="center"/>
-              <w:spacing w:before="40" w:after="40"/>
-            </w:pPr>
-            <w:r>
-              <w:rPr>
-                <w:b w:val="0"/>
-                <w:i w:val="0"/>
-                <w:color w:val="D97706"/>
-                <w:sz w:val="22"/>
-              </w:rPr>
-              <w:t>△</w:t>
-            </w:r>
-          </w:p>
-        </w:tc>
-        <w:tc>
-          <w:tcPr>
-            <w:tcW w:type="dxa" w:w="941"/>
-            <w:shd w:val="clear" w:color="auto" w:fill="EFF6FF"/>
-            <w:tcMar>
-              <w:top w:w="50" w:type="dxa"/>
-              <w:bottom w:w="50" w:type="dxa"/>
-              <w:left w:w="80" w:type="dxa"/>
-              <w:right w:w="80" w:type="dxa"/>
-            </w:tcMar>
-            <w:tcBorders>
-              <w:top w:val="single" w:sz="4" w:space="0" w:color="DBEAFE"/>
-              <w:bottom w:val="single" w:sz="4" w:space="0" w:color="DBEAFE"/>
-              <w:left w:val="single" w:sz="4" w:space="0" w:color="DBEAFE"/>
-              <w:right w:val="single" w:sz="4" w:space="0" w:color="DBEAFE"/>
-            </w:tcBorders>
-            <w:vAlign w:val="center"/>
-          </w:tcPr>
-          <w:p>
-            <w:pPr>
-              <w:jc w:val="center"/>
-              <w:spacing w:before="40" w:after="40"/>
-            </w:pPr>
-            <w:r>
-              <w:rPr>
-                <w:b/>
-                <w:i w:val="0"/>
-                <w:color w:val="166534"/>
-                <w:sz w:val="22"/>
-              </w:rPr>
-              <w:t>✓</w:t>
-            </w:r>
-          </w:p>
-        </w:tc>
-        <w:tc>
-          <w:tcPr>
-            <w:tcW w:type="dxa" w:w="941"/>
-            <w:shd w:val="clear" w:color="auto" w:fill="EFF6FF"/>
-            <w:tcMar>
-              <w:top w:w="50" w:type="dxa"/>
-              <w:bottom w:w="50" w:type="dxa"/>
-              <w:left w:w="80" w:type="dxa"/>
-              <w:right w:w="80" w:type="dxa"/>
-            </w:tcMar>
-            <w:tcBorders>
-              <w:top w:val="single" w:sz="4" w:space="0" w:color="DBEAFE"/>
-              <w:bottom w:val="single" w:sz="4" w:space="0" w:color="DBEAFE"/>
-              <w:left w:val="single" w:sz="4" w:space="0" w:color="DBEAFE"/>
-              <w:right w:val="single" w:sz="4" w:space="0" w:color="DBEAFE"/>
-            </w:tcBorders>
-            <w:vAlign w:val="center"/>
-          </w:tcPr>
-          <w:p>
-            <w:pPr>
-              <w:jc w:val="center"/>
+              <w:jc w:val="left"/>
               <w:spacing w:before="40" w:after="40"/>
             </w:pPr>
             <w:r>
@@ -3105,11 +2823,11 @@
         </w:tc>
         <w:tc>
           <w:tcPr>
-            <w:tcW w:type="dxa" w:w="941"/>
+            <w:tcW w:type="dxa" w:w="3118"/>
             <w:shd w:val="clear" w:color="auto" w:fill="EFF6FF"/>
             <w:tcMar>
-              <w:top w:w="50" w:type="dxa"/>
-              <w:bottom w:w="50" w:type="dxa"/>
+              <w:top w:w="60" w:type="dxa"/>
+              <w:bottom w:w="60" w:type="dxa"/>
               <w:left w:w="80" w:type="dxa"/>
               <w:right w:w="80" w:type="dxa"/>
             </w:tcMar>
@@ -3119,7 +2837,6 @@
               <w:left w:val="single" w:sz="4" w:space="0" w:color="DBEAFE"/>
               <w:right w:val="single" w:sz="4" w:space="0" w:color="DBEAFE"/>
             </w:tcBorders>
-            <w:vAlign w:val="center"/>
           </w:tcPr>
           <w:p>
             <w:pPr>
@@ -3133,7 +2850,40 @@
                 <w:color w:val="475569"/>
                 <w:sz w:val="18"/>
               </w:rPr>
-              <w:t>自社ブランドMineed by Osel。中国協力工場使用（社員常駐）。韓国工場への切替提案余地あり</w:t>
+              <w:t>自社ブランド「Mineed by Osel」保有。中国工場依存 → 韓国切替提案の余地大。経営者に直接ピッチ可。</w:t>
+            </w:r>
+          </w:p>
+        </w:tc>
+        <w:tc>
+          <w:tcPr>
+            <w:tcW w:type="dxa" w:w="567"/>
+            <w:shd w:val="clear" w:color="auto" w:fill="EFF6FF"/>
+            <w:tcMar>
+              <w:top w:w="60" w:type="dxa"/>
+              <w:bottom w:w="60" w:type="dxa"/>
+              <w:left w:w="60" w:type="dxa"/>
+              <w:right w:w="60" w:type="dxa"/>
+            </w:tcMar>
+            <w:tcBorders>
+              <w:top w:val="single" w:sz="4" w:space="0" w:color="DBEAFE"/>
+              <w:bottom w:val="single" w:sz="4" w:space="0" w:color="DBEAFE"/>
+              <w:left w:val="single" w:sz="4" w:space="0" w:color="DBEAFE"/>
+              <w:right w:val="single" w:sz="4" w:space="0" w:color="DBEAFE"/>
+            </w:tcBorders>
+          </w:tcPr>
+          <w:p>
+            <w:pPr>
+              <w:jc w:val="center"/>
+              <w:spacing w:before="40" w:after="40"/>
+            </w:pPr>
+            <w:r>
+              <w:rPr>
+                <w:b/>
+                <w:i w:val="0"/>
+                <w:color w:val="1A56DB"/>
+                <w:sz w:val="20"/>
+              </w:rPr>
+              <w:t>🔵🔵🔵</w:t>
             </w:r>
           </w:p>
         </w:tc>
@@ -3141,12 +2891,12 @@
       <w:tr>
         <w:tc>
           <w:tcPr>
-            <w:tcW w:type="dxa" w:w="941"/>
-            <w:shd w:val="clear" w:color="auto" w:fill="FFFFFF"/>
+            <w:tcW w:type="dxa" w:w="1984"/>
+            <w:shd w:val="clear" w:color="auto" w:fill="EFF6FF"/>
             <w:tcMar>
-              <w:top w:w="50" w:type="dxa"/>
-              <w:bottom w:w="50" w:type="dxa"/>
-              <w:left w:w="80" w:type="dxa"/>
+              <w:top w:w="60" w:type="dxa"/>
+              <w:bottom w:w="60" w:type="dxa"/>
+              <w:left w:w="100" w:type="dxa"/>
               <w:right w:w="80" w:type="dxa"/>
             </w:tcMar>
             <w:tcBorders>
@@ -3155,7 +2905,6 @@
               <w:left w:val="single" w:sz="4" w:space="0" w:color="DBEAFE"/>
               <w:right w:val="single" w:sz="4" w:space="0" w:color="DBEAFE"/>
             </w:tcBorders>
-            <w:vAlign w:val="center"/>
           </w:tcPr>
           <w:p>
             <w:pPr>
@@ -3169,7 +2918,7 @@
                 <w:color w:val="0F2D5E"/>
                 <w:sz w:val="20"/>
               </w:rPr>
-              <w:t>株式会社 HKM（SIXWHEELSLIFE）</w:t>
+              <w:t>株式会社 HKM</w:t>
             </w:r>
           </w:p>
           <w:p>
@@ -3183,17 +2932,17 @@
                 <w:color w:val="64748B"/>
                 <w:sz w:val="16"/>
               </w:rPr>
-              <w:t>本革バッグ・財布・ポーチ / 浅草橋・日本橋横山町</w:t>
+              <w:t>東京・浅草橋 / SIXWHEELSLIFE</w:t>
             </w:r>
           </w:p>
         </w:tc>
         <w:tc>
           <w:tcPr>
-            <w:tcW w:type="dxa" w:w="941"/>
-            <w:shd w:val="clear" w:color="auto" w:fill="FFFFFF"/>
+            <w:tcW w:type="dxa" w:w="1361"/>
+            <w:shd w:val="clear" w:color="auto" w:fill="EFF6FF"/>
             <w:tcMar>
-              <w:top w:w="50" w:type="dxa"/>
-              <w:bottom w:w="50" w:type="dxa"/>
+              <w:top w:w="60" w:type="dxa"/>
+              <w:bottom w:w="60" w:type="dxa"/>
               <w:left w:w="80" w:type="dxa"/>
               <w:right w:w="80" w:type="dxa"/>
             </w:tcMar>
@@ -3203,31 +2952,30 @@
               <w:left w:val="single" w:sz="4" w:space="0" w:color="DBEAFE"/>
               <w:right w:val="single" w:sz="4" w:space="0" w:color="DBEAFE"/>
             </w:tcBorders>
-            <w:vAlign w:val="center"/>
           </w:tcPr>
           <w:p>
             <w:pPr>
-              <w:jc w:val="center"/>
+              <w:jc w:val="left"/>
               <w:spacing w:before="40" w:after="40"/>
             </w:pPr>
             <w:r>
               <w:rPr>
-                <w:b/>
+                <w:b w:val="0"/>
                 <w:i w:val="0"/>
-                <w:color w:val="166534"/>
-                <w:sz w:val="22"/>
+                <w:color w:val="475569"/>
+                <w:sz w:val="18"/>
               </w:rPr>
-              <w:t>✓</w:t>
+              <w:t>本革バッグ・財布・ポーチ</w:t>
             </w:r>
           </w:p>
         </w:tc>
         <w:tc>
           <w:tcPr>
-            <w:tcW w:type="dxa" w:w="941"/>
-            <w:shd w:val="clear" w:color="auto" w:fill="FFFFFF"/>
+            <w:tcW w:type="dxa" w:w="680"/>
+            <w:shd w:val="clear" w:color="auto" w:fill="EFF6FF"/>
             <w:tcMar>
-              <w:top w:w="50" w:type="dxa"/>
-              <w:bottom w:w="50" w:type="dxa"/>
+              <w:top w:w="60" w:type="dxa"/>
+              <w:bottom w:w="60" w:type="dxa"/>
               <w:left w:w="80" w:type="dxa"/>
               <w:right w:w="80" w:type="dxa"/>
             </w:tcMar>
@@ -3237,7 +2985,6 @@
               <w:left w:val="single" w:sz="4" w:space="0" w:color="DBEAFE"/>
               <w:right w:val="single" w:sz="4" w:space="0" w:color="DBEAFE"/>
             </w:tcBorders>
-            <w:vAlign w:val="center"/>
           </w:tcPr>
           <w:p>
             <w:pPr>
@@ -3248,20 +2995,20 @@
               <w:rPr>
                 <w:b w:val="0"/>
                 <w:i w:val="0"/>
-                <w:color w:val="64748B"/>
-                <w:sz w:val="22"/>
+                <w:color w:val="475569"/>
+                <w:sz w:val="18"/>
               </w:rPr>
-              <w:t>?</w:t>
+              <w:t>ODM可</w:t>
             </w:r>
           </w:p>
         </w:tc>
         <w:tc>
           <w:tcPr>
-            <w:tcW w:type="dxa" w:w="941"/>
-            <w:shd w:val="clear" w:color="auto" w:fill="FFFFFF"/>
+            <w:tcW w:type="dxa" w:w="1247"/>
+            <w:shd w:val="clear" w:color="auto" w:fill="EFF6FF"/>
             <w:tcMar>
-              <w:top w:w="50" w:type="dxa"/>
-              <w:bottom w:w="50" w:type="dxa"/>
+              <w:top w:w="60" w:type="dxa"/>
+              <w:bottom w:w="60" w:type="dxa"/>
               <w:left w:w="80" w:type="dxa"/>
               <w:right w:w="80" w:type="dxa"/>
             </w:tcMar>
@@ -3271,41 +3018,6 @@
               <w:left w:val="single" w:sz="4" w:space="0" w:color="DBEAFE"/>
               <w:right w:val="single" w:sz="4" w:space="0" w:color="DBEAFE"/>
             </w:tcBorders>
-            <w:vAlign w:val="center"/>
-          </w:tcPr>
-          <w:p>
-            <w:pPr>
-              <w:jc w:val="center"/>
-              <w:spacing w:before="40" w:after="40"/>
-            </w:pPr>
-            <w:r>
-              <w:rPr>
-                <w:b/>
-                <w:i w:val="0"/>
-                <w:color w:val="166534"/>
-                <w:sz w:val="22"/>
-              </w:rPr>
-              <w:t>✓</w:t>
-            </w:r>
-          </w:p>
-        </w:tc>
-        <w:tc>
-          <w:tcPr>
-            <w:tcW w:type="dxa" w:w="941"/>
-            <w:shd w:val="clear" w:color="auto" w:fill="FFFFFF"/>
-            <w:tcMar>
-              <w:top w:w="50" w:type="dxa"/>
-              <w:bottom w:w="50" w:type="dxa"/>
-              <w:left w:w="80" w:type="dxa"/>
-              <w:right w:w="80" w:type="dxa"/>
-            </w:tcMar>
-            <w:tcBorders>
-              <w:top w:val="single" w:sz="4" w:space="0" w:color="DBEAFE"/>
-              <w:bottom w:val="single" w:sz="4" w:space="0" w:color="DBEAFE"/>
-              <w:left w:val="single" w:sz="4" w:space="0" w:color="DBEAFE"/>
-              <w:right w:val="single" w:sz="4" w:space="0" w:color="DBEAFE"/>
-            </w:tcBorders>
-            <w:vAlign w:val="center"/>
           </w:tcPr>
           <w:p>
             <w:pPr>
@@ -3316,20 +3028,20 @@
               <w:rPr>
                 <w:b w:val="0"/>
                 <w:i w:val="0"/>
-                <w:color w:val="64748B"/>
-                <w:sz w:val="22"/>
+                <w:color w:val="475569"/>
+                <w:sz w:val="18"/>
               </w:rPr>
-              <w:t>?</w:t>
+              <w:t>外注（詳細未確認）</w:t>
             </w:r>
           </w:p>
         </w:tc>
         <w:tc>
           <w:tcPr>
-            <w:tcW w:type="dxa" w:w="941"/>
-            <w:shd w:val="clear" w:color="auto" w:fill="FFFFFF"/>
+            <w:tcW w:type="dxa" w:w="1247"/>
+            <w:shd w:val="clear" w:color="auto" w:fill="EFF6FF"/>
             <w:tcMar>
-              <w:top w:w="50" w:type="dxa"/>
-              <w:bottom w:w="50" w:type="dxa"/>
+              <w:top w:w="60" w:type="dxa"/>
+              <w:bottom w:w="60" w:type="dxa"/>
               <w:left w:w="80" w:type="dxa"/>
               <w:right w:w="80" w:type="dxa"/>
             </w:tcMar>
@@ -3339,113 +3051,10 @@
               <w:left w:val="single" w:sz="4" w:space="0" w:color="DBEAFE"/>
               <w:right w:val="single" w:sz="4" w:space="0" w:color="DBEAFE"/>
             </w:tcBorders>
-            <w:vAlign w:val="center"/>
           </w:tcPr>
           <w:p>
             <w:pPr>
-              <w:jc w:val="center"/>
-              <w:spacing w:before="40" w:after="40"/>
-            </w:pPr>
-            <w:r>
-              <w:rPr>
-                <w:b w:val="0"/>
-                <w:i w:val="0"/>
-                <w:color w:val="D97706"/>
-                <w:sz w:val="22"/>
-              </w:rPr>
-              <w:t>△</w:t>
-            </w:r>
-          </w:p>
-        </w:tc>
-        <w:tc>
-          <w:tcPr>
-            <w:tcW w:type="dxa" w:w="941"/>
-            <w:shd w:val="clear" w:color="auto" w:fill="FFFFFF"/>
-            <w:tcMar>
-              <w:top w:w="50" w:type="dxa"/>
-              <w:bottom w:w="50" w:type="dxa"/>
-              <w:left w:w="80" w:type="dxa"/>
-              <w:right w:w="80" w:type="dxa"/>
-            </w:tcMar>
-            <w:tcBorders>
-              <w:top w:val="single" w:sz="4" w:space="0" w:color="DBEAFE"/>
-              <w:bottom w:val="single" w:sz="4" w:space="0" w:color="DBEAFE"/>
-              <w:left w:val="single" w:sz="4" w:space="0" w:color="DBEAFE"/>
-              <w:right w:val="single" w:sz="4" w:space="0" w:color="DBEAFE"/>
-            </w:tcBorders>
-            <w:vAlign w:val="center"/>
-          </w:tcPr>
-          <w:p>
-            <w:pPr>
-              <w:jc w:val="center"/>
-              <w:spacing w:before="40" w:after="40"/>
-            </w:pPr>
-            <w:r>
-              <w:rPr>
-                <w:b w:val="0"/>
-                <w:i w:val="0"/>
-                <w:color w:val="D97706"/>
-                <w:sz w:val="22"/>
-              </w:rPr>
-              <w:t>△</w:t>
-            </w:r>
-          </w:p>
-        </w:tc>
-        <w:tc>
-          <w:tcPr>
-            <w:tcW w:type="dxa" w:w="941"/>
-            <w:shd w:val="clear" w:color="auto" w:fill="FFFFFF"/>
-            <w:tcMar>
-              <w:top w:w="50" w:type="dxa"/>
-              <w:bottom w:w="50" w:type="dxa"/>
-              <w:left w:w="80" w:type="dxa"/>
-              <w:right w:w="80" w:type="dxa"/>
-            </w:tcMar>
-            <w:tcBorders>
-              <w:top w:val="single" w:sz="4" w:space="0" w:color="DBEAFE"/>
-              <w:bottom w:val="single" w:sz="4" w:space="0" w:color="DBEAFE"/>
-              <w:left w:val="single" w:sz="4" w:space="0" w:color="DBEAFE"/>
-              <w:right w:val="single" w:sz="4" w:space="0" w:color="DBEAFE"/>
-            </w:tcBorders>
-            <w:vAlign w:val="center"/>
-          </w:tcPr>
-          <w:p>
-            <w:pPr>
-              <w:jc w:val="center"/>
-              <w:spacing w:before="40" w:after="40"/>
-            </w:pPr>
-            <w:r>
-              <w:rPr>
-                <w:b/>
-                <w:i w:val="0"/>
-                <w:color w:val="166534"/>
-                <w:sz w:val="22"/>
-              </w:rPr>
-              <w:t>✓</w:t>
-            </w:r>
-          </w:p>
-        </w:tc>
-        <w:tc>
-          <w:tcPr>
-            <w:tcW w:type="dxa" w:w="941"/>
-            <w:shd w:val="clear" w:color="auto" w:fill="FFFFFF"/>
-            <w:tcMar>
-              <w:top w:w="50" w:type="dxa"/>
-              <w:bottom w:w="50" w:type="dxa"/>
-              <w:left w:w="80" w:type="dxa"/>
-              <w:right w:w="80" w:type="dxa"/>
-            </w:tcMar>
-            <w:tcBorders>
-              <w:top w:val="single" w:sz="4" w:space="0" w:color="DBEAFE"/>
-              <w:bottom w:val="single" w:sz="4" w:space="0" w:color="DBEAFE"/>
-              <w:left w:val="single" w:sz="4" w:space="0" w:color="DBEAFE"/>
-              <w:right w:val="single" w:sz="4" w:space="0" w:color="DBEAFE"/>
-            </w:tcBorders>
-            <w:vAlign w:val="center"/>
-          </w:tcPr>
-          <w:p>
-            <w:pPr>
-              <w:jc w:val="center"/>
+              <w:jc w:val="left"/>
               <w:spacing w:before="40" w:after="40"/>
             </w:pPr>
             <w:r>
@@ -3461,11 +3070,11 @@
         </w:tc>
         <w:tc>
           <w:tcPr>
-            <w:tcW w:type="dxa" w:w="941"/>
-            <w:shd w:val="clear" w:color="auto" w:fill="FFFFFF"/>
+            <w:tcW w:type="dxa" w:w="3118"/>
+            <w:shd w:val="clear" w:color="auto" w:fill="EFF6FF"/>
             <w:tcMar>
-              <w:top w:w="50" w:type="dxa"/>
-              <w:bottom w:w="50" w:type="dxa"/>
+              <w:top w:w="60" w:type="dxa"/>
+              <w:bottom w:w="60" w:type="dxa"/>
               <w:left w:w="80" w:type="dxa"/>
               <w:right w:w="80" w:type="dxa"/>
             </w:tcMar>
@@ -3475,7 +3084,6 @@
               <w:left w:val="single" w:sz="4" w:space="0" w:color="DBEAFE"/>
               <w:right w:val="single" w:sz="4" w:space="0" w:color="DBEAFE"/>
             </w:tcBorders>
-            <w:vAlign w:val="center"/>
           </w:tcPr>
           <w:p>
             <w:pPr>
@@ -3489,7 +3097,40 @@
                 <w:color w:val="475569"/>
                 <w:sz w:val="18"/>
               </w:rPr>
-              <w:t>京都西陣織×本革の独自路線。ODM対応可。インバウンドEXPOセクション出展 → 海外志向強め</w:t>
+              <w:t>京都西陣織×本革の差別化ブランド。ODM対応可・インバウンドEXPOに出展 → 海外展開志向あり。</w:t>
+            </w:r>
+          </w:p>
+        </w:tc>
+        <w:tc>
+          <w:tcPr>
+            <w:tcW w:type="dxa" w:w="567"/>
+            <w:shd w:val="clear" w:color="auto" w:fill="EFF6FF"/>
+            <w:tcMar>
+              <w:top w:w="60" w:type="dxa"/>
+              <w:bottom w:w="60" w:type="dxa"/>
+              <w:left w:w="60" w:type="dxa"/>
+              <w:right w:w="60" w:type="dxa"/>
+            </w:tcMar>
+            <w:tcBorders>
+              <w:top w:val="single" w:sz="4" w:space="0" w:color="DBEAFE"/>
+              <w:bottom w:val="single" w:sz="4" w:space="0" w:color="DBEAFE"/>
+              <w:left w:val="single" w:sz="4" w:space="0" w:color="DBEAFE"/>
+              <w:right w:val="single" w:sz="4" w:space="0" w:color="DBEAFE"/>
+            </w:tcBorders>
+          </w:tcPr>
+          <w:p>
+            <w:pPr>
+              <w:jc w:val="center"/>
+              <w:spacing w:before="40" w:after="40"/>
+            </w:pPr>
+            <w:r>
+              <w:rPr>
+                <w:b/>
+                <w:i w:val="0"/>
+                <w:color w:val="1A56DB"/>
+                <w:sz w:val="20"/>
+              </w:rPr>
+              <w:t>🔵🔵</w:t>
             </w:r>
           </w:p>
         </w:tc>
@@ -3497,12 +3138,12 @@
       <w:tr>
         <w:tc>
           <w:tcPr>
-            <w:tcW w:type="dxa" w:w="941"/>
-            <w:shd w:val="clear" w:color="auto" w:fill="EFF6FF"/>
+            <w:tcW w:type="dxa" w:w="1984"/>
+            <w:shd w:val="clear" w:color="auto" w:fill="FFFFFF"/>
             <w:tcMar>
-              <w:top w:w="50" w:type="dxa"/>
-              <w:bottom w:w="50" w:type="dxa"/>
-              <w:left w:w="80" w:type="dxa"/>
+              <w:top w:w="60" w:type="dxa"/>
+              <w:bottom w:w="60" w:type="dxa"/>
+              <w:left w:w="100" w:type="dxa"/>
               <w:right w:w="80" w:type="dxa"/>
             </w:tcMar>
             <w:tcBorders>
@@ -3511,7 +3152,6 @@
               <w:left w:val="single" w:sz="4" w:space="0" w:color="DBEAFE"/>
               <w:right w:val="single" w:sz="4" w:space="0" w:color="DBEAFE"/>
             </w:tcBorders>
-            <w:vAlign w:val="center"/>
           </w:tcPr>
           <w:p>
             <w:pPr>
@@ -3539,17 +3179,17 @@
                 <w:color w:val="64748B"/>
                 <w:sz w:val="16"/>
               </w:rPr>
-              <w:t>Pig Skin革製品 バッグ・ポーチ / ODM事業あり</w:t>
+              <w:t>所在地調査中</w:t>
             </w:r>
           </w:p>
         </w:tc>
         <w:tc>
           <w:tcPr>
-            <w:tcW w:type="dxa" w:w="941"/>
-            <w:shd w:val="clear" w:color="auto" w:fill="EFF6FF"/>
+            <w:tcW w:type="dxa" w:w="1361"/>
+            <w:shd w:val="clear" w:color="auto" w:fill="FFFFFF"/>
             <w:tcMar>
-              <w:top w:w="50" w:type="dxa"/>
-              <w:bottom w:w="50" w:type="dxa"/>
+              <w:top w:w="60" w:type="dxa"/>
+              <w:bottom w:w="60" w:type="dxa"/>
               <w:left w:w="80" w:type="dxa"/>
               <w:right w:w="80" w:type="dxa"/>
             </w:tcMar>
@@ -3559,31 +3199,32 @@
               <w:left w:val="single" w:sz="4" w:space="0" w:color="DBEAFE"/>
               <w:right w:val="single" w:sz="4" w:space="0" w:color="DBEAFE"/>
             </w:tcBorders>
-            <w:vAlign w:val="center"/>
           </w:tcPr>
           <w:p>
             <w:pPr>
-              <w:jc w:val="center"/>
+              <w:jc w:val="left"/>
               <w:spacing w:before="40" w:after="40"/>
             </w:pPr>
             <w:r>
               <w:rPr>
-                <w:b/>
+                <w:b w:val="0"/>
                 <w:i w:val="0"/>
-                <w:color w:val="166534"/>
-                <w:sz w:val="22"/>
+                <w:color w:val="475569"/>
+                <w:sz w:val="18"/>
               </w:rPr>
-              <w:t>✓</w:t>
+              <w:t>Pig Skin革製品</w:t>
+              <w:br/>
+              <w:t>バッグ・ポーチ</w:t>
             </w:r>
           </w:p>
         </w:tc>
         <w:tc>
           <w:tcPr>
-            <w:tcW w:type="dxa" w:w="941"/>
-            <w:shd w:val="clear" w:color="auto" w:fill="EFF6FF"/>
+            <w:tcW w:type="dxa" w:w="680"/>
+            <w:shd w:val="clear" w:color="auto" w:fill="FFFFFF"/>
             <w:tcMar>
-              <w:top w:w="50" w:type="dxa"/>
-              <w:bottom w:w="50" w:type="dxa"/>
+              <w:top w:w="60" w:type="dxa"/>
+              <w:bottom w:w="60" w:type="dxa"/>
               <w:left w:w="80" w:type="dxa"/>
               <w:right w:w="80" w:type="dxa"/>
             </w:tcMar>
@@ -3593,7 +3234,6 @@
               <w:left w:val="single" w:sz="4" w:space="0" w:color="DBEAFE"/>
               <w:right w:val="single" w:sz="4" w:space="0" w:color="DBEAFE"/>
             </w:tcBorders>
-            <w:vAlign w:val="center"/>
           </w:tcPr>
           <w:p>
             <w:pPr>
@@ -3604,20 +3244,20 @@
               <w:rPr>
                 <w:b w:val="0"/>
                 <w:i w:val="0"/>
-                <w:color w:val="64748B"/>
-                <w:sz w:val="22"/>
+                <w:color w:val="475569"/>
+                <w:sz w:val="18"/>
               </w:rPr>
-              <w:t>?</w:t>
+              <w:t>ODM可</w:t>
             </w:r>
           </w:p>
         </w:tc>
         <w:tc>
           <w:tcPr>
-            <w:tcW w:type="dxa" w:w="941"/>
-            <w:shd w:val="clear" w:color="auto" w:fill="EFF6FF"/>
+            <w:tcW w:type="dxa" w:w="1247"/>
+            <w:shd w:val="clear" w:color="auto" w:fill="FFFFFF"/>
             <w:tcMar>
-              <w:top w:w="50" w:type="dxa"/>
-              <w:bottom w:w="50" w:type="dxa"/>
+              <w:top w:w="60" w:type="dxa"/>
+              <w:bottom w:w="60" w:type="dxa"/>
               <w:left w:w="80" w:type="dxa"/>
               <w:right w:w="80" w:type="dxa"/>
             </w:tcMar>
@@ -3627,7 +3267,6 @@
               <w:left w:val="single" w:sz="4" w:space="0" w:color="DBEAFE"/>
               <w:right w:val="single" w:sz="4" w:space="0" w:color="DBEAFE"/>
             </w:tcBorders>
-            <w:vAlign w:val="center"/>
           </w:tcPr>
           <w:p>
             <w:pPr>
@@ -3638,20 +3277,20 @@
               <w:rPr>
                 <w:b w:val="0"/>
                 <w:i w:val="0"/>
-                <w:color w:val="64748B"/>
-                <w:sz w:val="22"/>
+                <w:color w:val="475569"/>
+                <w:sz w:val="18"/>
               </w:rPr>
-              <w:t>?</w:t>
+              <w:t>Made in Japan主軸</w:t>
             </w:r>
           </w:p>
         </w:tc>
         <w:tc>
           <w:tcPr>
-            <w:tcW w:type="dxa" w:w="941"/>
-            <w:shd w:val="clear" w:color="auto" w:fill="EFF6FF"/>
+            <w:tcW w:type="dxa" w:w="1247"/>
+            <w:shd w:val="clear" w:color="auto" w:fill="FFFFFF"/>
             <w:tcMar>
-              <w:top w:w="50" w:type="dxa"/>
-              <w:bottom w:w="50" w:type="dxa"/>
+              <w:top w:w="60" w:type="dxa"/>
+              <w:bottom w:w="60" w:type="dxa"/>
               <w:left w:w="80" w:type="dxa"/>
               <w:right w:w="80" w:type="dxa"/>
             </w:tcMar>
@@ -3661,147 +3300,10 @@
               <w:left w:val="single" w:sz="4" w:space="0" w:color="DBEAFE"/>
               <w:right w:val="single" w:sz="4" w:space="0" w:color="DBEAFE"/>
             </w:tcBorders>
-            <w:vAlign w:val="center"/>
           </w:tcPr>
           <w:p>
             <w:pPr>
-              <w:jc w:val="center"/>
-              <w:spacing w:before="40" w:after="40"/>
-            </w:pPr>
-            <w:r>
-              <w:rPr>
-                <w:b w:val="0"/>
-                <w:i w:val="0"/>
-                <w:color w:val="64748B"/>
-                <w:sz w:val="22"/>
-              </w:rPr>
-              <w:t>?</w:t>
-            </w:r>
-          </w:p>
-        </w:tc>
-        <w:tc>
-          <w:tcPr>
-            <w:tcW w:type="dxa" w:w="941"/>
-            <w:shd w:val="clear" w:color="auto" w:fill="EFF6FF"/>
-            <w:tcMar>
-              <w:top w:w="50" w:type="dxa"/>
-              <w:bottom w:w="50" w:type="dxa"/>
-              <w:left w:w="80" w:type="dxa"/>
-              <w:right w:w="80" w:type="dxa"/>
-            </w:tcMar>
-            <w:tcBorders>
-              <w:top w:val="single" w:sz="4" w:space="0" w:color="DBEAFE"/>
-              <w:bottom w:val="single" w:sz="4" w:space="0" w:color="DBEAFE"/>
-              <w:left w:val="single" w:sz="4" w:space="0" w:color="DBEAFE"/>
-              <w:right w:val="single" w:sz="4" w:space="0" w:color="DBEAFE"/>
-            </w:tcBorders>
-            <w:vAlign w:val="center"/>
-          </w:tcPr>
-          <w:p>
-            <w:pPr>
-              <w:jc w:val="center"/>
-              <w:spacing w:before="40" w:after="40"/>
-            </w:pPr>
-            <w:r>
-              <w:rPr>
-                <w:b/>
-                <w:i w:val="0"/>
-                <w:color w:val="166534"/>
-                <w:sz w:val="22"/>
-              </w:rPr>
-              <w:t>✓</w:t>
-            </w:r>
-          </w:p>
-        </w:tc>
-        <w:tc>
-          <w:tcPr>
-            <w:tcW w:type="dxa" w:w="941"/>
-            <w:shd w:val="clear" w:color="auto" w:fill="EFF6FF"/>
-            <w:tcMar>
-              <w:top w:w="50" w:type="dxa"/>
-              <w:bottom w:w="50" w:type="dxa"/>
-              <w:left w:w="80" w:type="dxa"/>
-              <w:right w:w="80" w:type="dxa"/>
-            </w:tcMar>
-            <w:tcBorders>
-              <w:top w:val="single" w:sz="4" w:space="0" w:color="DBEAFE"/>
-              <w:bottom w:val="single" w:sz="4" w:space="0" w:color="DBEAFE"/>
-              <w:left w:val="single" w:sz="4" w:space="0" w:color="DBEAFE"/>
-              <w:right w:val="single" w:sz="4" w:space="0" w:color="DBEAFE"/>
-            </w:tcBorders>
-            <w:vAlign w:val="center"/>
-          </w:tcPr>
-          <w:p>
-            <w:pPr>
-              <w:jc w:val="center"/>
-              <w:spacing w:before="40" w:after="40"/>
-            </w:pPr>
-            <w:r>
-              <w:rPr>
-                <w:b w:val="0"/>
-                <w:i w:val="0"/>
-                <w:color w:val="D97706"/>
-                <w:sz w:val="22"/>
-              </w:rPr>
-              <w:t>△</w:t>
-            </w:r>
-          </w:p>
-        </w:tc>
-        <w:tc>
-          <w:tcPr>
-            <w:tcW w:type="dxa" w:w="941"/>
-            <w:shd w:val="clear" w:color="auto" w:fill="EFF6FF"/>
-            <w:tcMar>
-              <w:top w:w="50" w:type="dxa"/>
-              <w:bottom w:w="50" w:type="dxa"/>
-              <w:left w:w="80" w:type="dxa"/>
-              <w:right w:w="80" w:type="dxa"/>
-            </w:tcMar>
-            <w:tcBorders>
-              <w:top w:val="single" w:sz="4" w:space="0" w:color="DBEAFE"/>
-              <w:bottom w:val="single" w:sz="4" w:space="0" w:color="DBEAFE"/>
-              <w:left w:val="single" w:sz="4" w:space="0" w:color="DBEAFE"/>
-              <w:right w:val="single" w:sz="4" w:space="0" w:color="DBEAFE"/>
-            </w:tcBorders>
-            <w:vAlign w:val="center"/>
-          </w:tcPr>
-          <w:p>
-            <w:pPr>
-              <w:jc w:val="center"/>
-              <w:spacing w:before="40" w:after="40"/>
-            </w:pPr>
-            <w:r>
-              <w:rPr>
-                <w:b/>
-                <w:i w:val="0"/>
-                <w:color w:val="166534"/>
-                <w:sz w:val="22"/>
-              </w:rPr>
-              <w:t>✓</w:t>
-            </w:r>
-          </w:p>
-        </w:tc>
-        <w:tc>
-          <w:tcPr>
-            <w:tcW w:type="dxa" w:w="941"/>
-            <w:shd w:val="clear" w:color="auto" w:fill="EFF6FF"/>
-            <w:tcMar>
-              <w:top w:w="50" w:type="dxa"/>
-              <w:bottom w:w="50" w:type="dxa"/>
-              <w:left w:w="80" w:type="dxa"/>
-              <w:right w:w="80" w:type="dxa"/>
-            </w:tcMar>
-            <w:tcBorders>
-              <w:top w:val="single" w:sz="4" w:space="0" w:color="DBEAFE"/>
-              <w:bottom w:val="single" w:sz="4" w:space="0" w:color="DBEAFE"/>
-              <w:left w:val="single" w:sz="4" w:space="0" w:color="DBEAFE"/>
-              <w:right w:val="single" w:sz="4" w:space="0" w:color="DBEAFE"/>
-            </w:tcBorders>
-            <w:vAlign w:val="center"/>
-          </w:tcPr>
-          <w:p>
-            <w:pPr>
-              <w:jc w:val="center"/>
+              <w:jc w:val="left"/>
               <w:spacing w:before="40" w:after="40"/>
             </w:pPr>
             <w:r>
@@ -3817,11 +3319,11 @@
         </w:tc>
         <w:tc>
           <w:tcPr>
-            <w:tcW w:type="dxa" w:w="941"/>
-            <w:shd w:val="clear" w:color="auto" w:fill="EFF6FF"/>
+            <w:tcW w:type="dxa" w:w="3118"/>
+            <w:shd w:val="clear" w:color="auto" w:fill="FFFFFF"/>
             <w:tcMar>
-              <w:top w:w="50" w:type="dxa"/>
-              <w:bottom w:w="50" w:type="dxa"/>
+              <w:top w:w="60" w:type="dxa"/>
+              <w:bottom w:w="60" w:type="dxa"/>
               <w:left w:w="80" w:type="dxa"/>
               <w:right w:w="80" w:type="dxa"/>
             </w:tcMar>
@@ -3831,7 +3333,6 @@
               <w:left w:val="single" w:sz="4" w:space="0" w:color="DBEAFE"/>
               <w:right w:val="single" w:sz="4" w:space="0" w:color="DBEAFE"/>
             </w:tcBorders>
-            <w:vAlign w:val="center"/>
           </w:tcPr>
           <w:p>
             <w:pPr>
@@ -3845,7 +3346,40 @@
                 <w:color w:val="475569"/>
                 <w:sz w:val="18"/>
               </w:rPr>
-              <w:t>代理店募集中・ODM対応可。Made in Japan主軸だが外注先拡大に前向きな可能性</w:t>
+              <w:t>代理店募集中・ODM対応可。外注先拡大に前向きな可能性。Made in Japanからの分散提案が刺さりうる。</w:t>
+            </w:r>
+          </w:p>
+        </w:tc>
+        <w:tc>
+          <w:tcPr>
+            <w:tcW w:type="dxa" w:w="567"/>
+            <w:shd w:val="clear" w:color="auto" w:fill="FFFFFF"/>
+            <w:tcMar>
+              <w:top w:w="60" w:type="dxa"/>
+              <w:bottom w:w="60" w:type="dxa"/>
+              <w:left w:w="60" w:type="dxa"/>
+              <w:right w:w="60" w:type="dxa"/>
+            </w:tcMar>
+            <w:tcBorders>
+              <w:top w:val="single" w:sz="4" w:space="0" w:color="DBEAFE"/>
+              <w:bottom w:val="single" w:sz="4" w:space="0" w:color="DBEAFE"/>
+              <w:left w:val="single" w:sz="4" w:space="0" w:color="DBEAFE"/>
+              <w:right w:val="single" w:sz="4" w:space="0" w:color="DBEAFE"/>
+            </w:tcBorders>
+          </w:tcPr>
+          <w:p>
+            <w:pPr>
+              <w:jc w:val="center"/>
+              <w:spacing w:before="40" w:after="40"/>
+            </w:pPr>
+            <w:r>
+              <w:rPr>
+                <w:b/>
+                <w:i w:val="0"/>
+                <w:color w:val="1A56DB"/>
+                <w:sz w:val="20"/>
+              </w:rPr>
+              <w:t>🔵🔵</w:t>
             </w:r>
           </w:p>
         </w:tc>
@@ -3853,12 +3387,12 @@
       <w:tr>
         <w:tc>
           <w:tcPr>
-            <w:tcW w:type="dxa" w:w="941"/>
-            <w:shd w:val="clear" w:color="auto" w:fill="FFFFFF"/>
+            <w:tcW w:type="dxa" w:w="1984"/>
+            <w:shd w:val="clear" w:color="auto" w:fill="EFF6FF"/>
             <w:tcMar>
-              <w:top w:w="50" w:type="dxa"/>
-              <w:bottom w:w="50" w:type="dxa"/>
-              <w:left w:w="80" w:type="dxa"/>
+              <w:top w:w="60" w:type="dxa"/>
+              <w:bottom w:w="60" w:type="dxa"/>
+              <w:left w:w="100" w:type="dxa"/>
               <w:right w:w="80" w:type="dxa"/>
             </w:tcMar>
             <w:tcBorders>
@@ -3867,7 +3401,6 @@
               <w:left w:val="single" w:sz="4" w:space="0" w:color="DBEAFE"/>
               <w:right w:val="single" w:sz="4" w:space="0" w:color="DBEAFE"/>
             </w:tcBorders>
-            <w:vAlign w:val="center"/>
           </w:tcPr>
           <w:p>
             <w:pPr>
@@ -3895,17 +3428,17 @@
                 <w:color w:val="64748B"/>
                 <w:sz w:val="16"/>
               </w:rPr>
-              <w:t>スーツケース・バッグ / OEM・ODM事業部あり</w:t>
+              <w:t>所在地調査中</w:t>
             </w:r>
           </w:p>
         </w:tc>
         <w:tc>
           <w:tcPr>
-            <w:tcW w:type="dxa" w:w="941"/>
-            <w:shd w:val="clear" w:color="auto" w:fill="FFFFFF"/>
+            <w:tcW w:type="dxa" w:w="1361"/>
+            <w:shd w:val="clear" w:color="auto" w:fill="EFF6FF"/>
             <w:tcMar>
-              <w:top w:w="50" w:type="dxa"/>
-              <w:bottom w:w="50" w:type="dxa"/>
+              <w:top w:w="60" w:type="dxa"/>
+              <w:bottom w:w="60" w:type="dxa"/>
               <w:left w:w="80" w:type="dxa"/>
               <w:right w:w="80" w:type="dxa"/>
             </w:tcMar>
@@ -3915,279 +3448,6 @@
               <w:left w:val="single" w:sz="4" w:space="0" w:color="DBEAFE"/>
               <w:right w:val="single" w:sz="4" w:space="0" w:color="DBEAFE"/>
             </w:tcBorders>
-            <w:vAlign w:val="center"/>
-          </w:tcPr>
-          <w:p>
-            <w:pPr>
-              <w:jc w:val="center"/>
-              <w:spacing w:before="40" w:after="40"/>
-            </w:pPr>
-            <w:r>
-              <w:rPr>
-                <w:b w:val="0"/>
-                <w:i w:val="0"/>
-                <w:color w:val="D97706"/>
-                <w:sz w:val="22"/>
-              </w:rPr>
-              <w:t>△</w:t>
-            </w:r>
-          </w:p>
-        </w:tc>
-        <w:tc>
-          <w:tcPr>
-            <w:tcW w:type="dxa" w:w="941"/>
-            <w:shd w:val="clear" w:color="auto" w:fill="FFFFFF"/>
-            <w:tcMar>
-              <w:top w:w="50" w:type="dxa"/>
-              <w:bottom w:w="50" w:type="dxa"/>
-              <w:left w:w="80" w:type="dxa"/>
-              <w:right w:w="80" w:type="dxa"/>
-            </w:tcMar>
-            <w:tcBorders>
-              <w:top w:val="single" w:sz="4" w:space="0" w:color="DBEAFE"/>
-              <w:bottom w:val="single" w:sz="4" w:space="0" w:color="DBEAFE"/>
-              <w:left w:val="single" w:sz="4" w:space="0" w:color="DBEAFE"/>
-              <w:right w:val="single" w:sz="4" w:space="0" w:color="DBEAFE"/>
-            </w:tcBorders>
-            <w:vAlign w:val="center"/>
-          </w:tcPr>
-          <w:p>
-            <w:pPr>
-              <w:jc w:val="center"/>
-              <w:spacing w:before="40" w:after="40"/>
-            </w:pPr>
-            <w:r>
-              <w:rPr>
-                <w:b w:val="0"/>
-                <w:i w:val="0"/>
-                <w:color w:val="D97706"/>
-                <w:sz w:val="22"/>
-              </w:rPr>
-              <w:t>△</w:t>
-            </w:r>
-          </w:p>
-        </w:tc>
-        <w:tc>
-          <w:tcPr>
-            <w:tcW w:type="dxa" w:w="941"/>
-            <w:shd w:val="clear" w:color="auto" w:fill="FFFFFF"/>
-            <w:tcMar>
-              <w:top w:w="50" w:type="dxa"/>
-              <w:bottom w:w="50" w:type="dxa"/>
-              <w:left w:w="80" w:type="dxa"/>
-              <w:right w:w="80" w:type="dxa"/>
-            </w:tcMar>
-            <w:tcBorders>
-              <w:top w:val="single" w:sz="4" w:space="0" w:color="DBEAFE"/>
-              <w:bottom w:val="single" w:sz="4" w:space="0" w:color="DBEAFE"/>
-              <w:left w:val="single" w:sz="4" w:space="0" w:color="DBEAFE"/>
-              <w:right w:val="single" w:sz="4" w:space="0" w:color="DBEAFE"/>
-            </w:tcBorders>
-            <w:vAlign w:val="center"/>
-          </w:tcPr>
-          <w:p>
-            <w:pPr>
-              <w:jc w:val="center"/>
-              <w:spacing w:before="40" w:after="40"/>
-            </w:pPr>
-            <w:r>
-              <w:rPr>
-                <w:b w:val="0"/>
-                <w:i w:val="0"/>
-                <w:color w:val="64748B"/>
-                <w:sz w:val="22"/>
-              </w:rPr>
-              <w:t>?</w:t>
-            </w:r>
-          </w:p>
-        </w:tc>
-        <w:tc>
-          <w:tcPr>
-            <w:tcW w:type="dxa" w:w="941"/>
-            <w:shd w:val="clear" w:color="auto" w:fill="FFFFFF"/>
-            <w:tcMar>
-              <w:top w:w="50" w:type="dxa"/>
-              <w:bottom w:w="50" w:type="dxa"/>
-              <w:left w:w="80" w:type="dxa"/>
-              <w:right w:w="80" w:type="dxa"/>
-            </w:tcMar>
-            <w:tcBorders>
-              <w:top w:val="single" w:sz="4" w:space="0" w:color="DBEAFE"/>
-              <w:bottom w:val="single" w:sz="4" w:space="0" w:color="DBEAFE"/>
-              <w:left w:val="single" w:sz="4" w:space="0" w:color="DBEAFE"/>
-              <w:right w:val="single" w:sz="4" w:space="0" w:color="DBEAFE"/>
-            </w:tcBorders>
-            <w:vAlign w:val="center"/>
-          </w:tcPr>
-          <w:p>
-            <w:pPr>
-              <w:jc w:val="center"/>
-              <w:spacing w:before="40" w:after="40"/>
-            </w:pPr>
-            <w:r>
-              <w:rPr>
-                <w:b w:val="0"/>
-                <w:i w:val="0"/>
-                <w:color w:val="D97706"/>
-                <w:sz w:val="22"/>
-              </w:rPr>
-              <w:t>△</w:t>
-            </w:r>
-          </w:p>
-        </w:tc>
-        <w:tc>
-          <w:tcPr>
-            <w:tcW w:type="dxa" w:w="941"/>
-            <w:shd w:val="clear" w:color="auto" w:fill="FFFFFF"/>
-            <w:tcMar>
-              <w:top w:w="50" w:type="dxa"/>
-              <w:bottom w:w="50" w:type="dxa"/>
-              <w:left w:w="80" w:type="dxa"/>
-              <w:right w:w="80" w:type="dxa"/>
-            </w:tcMar>
-            <w:tcBorders>
-              <w:top w:val="single" w:sz="4" w:space="0" w:color="DBEAFE"/>
-              <w:bottom w:val="single" w:sz="4" w:space="0" w:color="DBEAFE"/>
-              <w:left w:val="single" w:sz="4" w:space="0" w:color="DBEAFE"/>
-              <w:right w:val="single" w:sz="4" w:space="0" w:color="DBEAFE"/>
-            </w:tcBorders>
-            <w:vAlign w:val="center"/>
-          </w:tcPr>
-          <w:p>
-            <w:pPr>
-              <w:jc w:val="center"/>
-              <w:spacing w:before="40" w:after="40"/>
-            </w:pPr>
-            <w:r>
-              <w:rPr>
-                <w:b/>
-                <w:i w:val="0"/>
-                <w:color w:val="166534"/>
-                <w:sz w:val="22"/>
-              </w:rPr>
-              <w:t>✓</w:t>
-            </w:r>
-          </w:p>
-        </w:tc>
-        <w:tc>
-          <w:tcPr>
-            <w:tcW w:type="dxa" w:w="941"/>
-            <w:shd w:val="clear" w:color="auto" w:fill="FFFFFF"/>
-            <w:tcMar>
-              <w:top w:w="50" w:type="dxa"/>
-              <w:bottom w:w="50" w:type="dxa"/>
-              <w:left w:w="80" w:type="dxa"/>
-              <w:right w:w="80" w:type="dxa"/>
-            </w:tcMar>
-            <w:tcBorders>
-              <w:top w:val="single" w:sz="4" w:space="0" w:color="DBEAFE"/>
-              <w:bottom w:val="single" w:sz="4" w:space="0" w:color="DBEAFE"/>
-              <w:left w:val="single" w:sz="4" w:space="0" w:color="DBEAFE"/>
-              <w:right w:val="single" w:sz="4" w:space="0" w:color="DBEAFE"/>
-            </w:tcBorders>
-            <w:vAlign w:val="center"/>
-          </w:tcPr>
-          <w:p>
-            <w:pPr>
-              <w:jc w:val="center"/>
-              <w:spacing w:before="40" w:after="40"/>
-            </w:pPr>
-            <w:r>
-              <w:rPr>
-                <w:b w:val="0"/>
-                <w:i w:val="0"/>
-                <w:color w:val="D97706"/>
-                <w:sz w:val="22"/>
-              </w:rPr>
-              <w:t>△</w:t>
-            </w:r>
-          </w:p>
-        </w:tc>
-        <w:tc>
-          <w:tcPr>
-            <w:tcW w:type="dxa" w:w="941"/>
-            <w:shd w:val="clear" w:color="auto" w:fill="FFFFFF"/>
-            <w:tcMar>
-              <w:top w:w="50" w:type="dxa"/>
-              <w:bottom w:w="50" w:type="dxa"/>
-              <w:left w:w="80" w:type="dxa"/>
-              <w:right w:w="80" w:type="dxa"/>
-            </w:tcMar>
-            <w:tcBorders>
-              <w:top w:val="single" w:sz="4" w:space="0" w:color="DBEAFE"/>
-              <w:bottom w:val="single" w:sz="4" w:space="0" w:color="DBEAFE"/>
-              <w:left w:val="single" w:sz="4" w:space="0" w:color="DBEAFE"/>
-              <w:right w:val="single" w:sz="4" w:space="0" w:color="DBEAFE"/>
-            </w:tcBorders>
-            <w:vAlign w:val="center"/>
-          </w:tcPr>
-          <w:p>
-            <w:pPr>
-              <w:jc w:val="center"/>
-              <w:spacing w:before="40" w:after="40"/>
-            </w:pPr>
-            <w:r>
-              <w:rPr>
-                <w:b/>
-                <w:i w:val="0"/>
-                <w:color w:val="166534"/>
-                <w:sz w:val="22"/>
-              </w:rPr>
-              <w:t>✓</w:t>
-            </w:r>
-          </w:p>
-        </w:tc>
-        <w:tc>
-          <w:tcPr>
-            <w:tcW w:type="dxa" w:w="941"/>
-            <w:shd w:val="clear" w:color="auto" w:fill="FFFFFF"/>
-            <w:tcMar>
-              <w:top w:w="50" w:type="dxa"/>
-              <w:bottom w:w="50" w:type="dxa"/>
-              <w:left w:w="80" w:type="dxa"/>
-              <w:right w:w="80" w:type="dxa"/>
-            </w:tcMar>
-            <w:tcBorders>
-              <w:top w:val="single" w:sz="4" w:space="0" w:color="DBEAFE"/>
-              <w:bottom w:val="single" w:sz="4" w:space="0" w:color="DBEAFE"/>
-              <w:left w:val="single" w:sz="4" w:space="0" w:color="DBEAFE"/>
-              <w:right w:val="single" w:sz="4" w:space="0" w:color="DBEAFE"/>
-            </w:tcBorders>
-            <w:vAlign w:val="center"/>
-          </w:tcPr>
-          <w:p>
-            <w:pPr>
-              <w:jc w:val="center"/>
-              <w:spacing w:before="40" w:after="40"/>
-            </w:pPr>
-            <w:r>
-              <w:rPr>
-                <w:b/>
-                <w:i w:val="0"/>
-                <w:color w:val="1A56DB"/>
-                <w:sz w:val="18"/>
-              </w:rPr>
-              <w:t>★ 参考</w:t>
-            </w:r>
-          </w:p>
-        </w:tc>
-        <w:tc>
-          <w:tcPr>
-            <w:tcW w:type="dxa" w:w="941"/>
-            <w:shd w:val="clear" w:color="auto" w:fill="FFFFFF"/>
-            <w:tcMar>
-              <w:top w:w="50" w:type="dxa"/>
-              <w:bottom w:w="50" w:type="dxa"/>
-              <w:left w:w="80" w:type="dxa"/>
-              <w:right w:w="80" w:type="dxa"/>
-            </w:tcMar>
-            <w:tcBorders>
-              <w:top w:val="single" w:sz="4" w:space="0" w:color="DBEAFE"/>
-              <w:bottom w:val="single" w:sz="4" w:space="0" w:color="DBEAFE"/>
-              <w:left w:val="single" w:sz="4" w:space="0" w:color="DBEAFE"/>
-              <w:right w:val="single" w:sz="4" w:space="0" w:color="DBEAFE"/>
-            </w:tcBorders>
-            <w:vAlign w:val="center"/>
           </w:tcPr>
           <w:p>
             <w:pPr>
@@ -4201,19 +3461,17 @@
                 <w:color w:val="475569"/>
                 <w:sz w:val="18"/>
               </w:rPr>
-              <w:t>中国工場使用。OEM/ODM事業あり。スーツケースが主力のため革小物との関連性要確認</w:t>
+              <w:t>スーツケース・バッグ全般</w:t>
             </w:r>
           </w:p>
         </w:tc>
-      </w:tr>
-      <w:tr>
         <w:tc>
           <w:tcPr>
-            <w:tcW w:type="dxa" w:w="941"/>
+            <w:tcW w:type="dxa" w:w="680"/>
             <w:shd w:val="clear" w:color="auto" w:fill="EFF6FF"/>
             <w:tcMar>
-              <w:top w:w="50" w:type="dxa"/>
-              <w:bottom w:w="50" w:type="dxa"/>
+              <w:top w:w="60" w:type="dxa"/>
+              <w:bottom w:w="60" w:type="dxa"/>
               <w:left w:w="80" w:type="dxa"/>
               <w:right w:w="80" w:type="dxa"/>
             </w:tcMar>
@@ -4223,7 +3481,173 @@
               <w:left w:val="single" w:sz="4" w:space="0" w:color="DBEAFE"/>
               <w:right w:val="single" w:sz="4" w:space="0" w:color="DBEAFE"/>
             </w:tcBorders>
-            <w:vAlign w:val="center"/>
+          </w:tcPr>
+          <w:p>
+            <w:pPr>
+              <w:jc w:val="center"/>
+              <w:spacing w:before="40" w:after="40"/>
+            </w:pPr>
+            <w:r>
+              <w:rPr>
+                <w:b w:val="0"/>
+                <w:i w:val="0"/>
+                <w:color w:val="475569"/>
+                <w:sz w:val="18"/>
+              </w:rPr>
+              <w:t>あり</w:t>
+            </w:r>
+          </w:p>
+        </w:tc>
+        <w:tc>
+          <w:tcPr>
+            <w:tcW w:type="dxa" w:w="1247"/>
+            <w:shd w:val="clear" w:color="auto" w:fill="EFF6FF"/>
+            <w:tcMar>
+              <w:top w:w="60" w:type="dxa"/>
+              <w:bottom w:w="60" w:type="dxa"/>
+              <w:left w:w="80" w:type="dxa"/>
+              <w:right w:w="80" w:type="dxa"/>
+            </w:tcMar>
+            <w:tcBorders>
+              <w:top w:val="single" w:sz="4" w:space="0" w:color="DBEAFE"/>
+              <w:bottom w:val="single" w:sz="4" w:space="0" w:color="DBEAFE"/>
+              <w:left w:val="single" w:sz="4" w:space="0" w:color="DBEAFE"/>
+              <w:right w:val="single" w:sz="4" w:space="0" w:color="DBEAFE"/>
+            </w:tcBorders>
+          </w:tcPr>
+          <w:p>
+            <w:pPr>
+              <w:jc w:val="center"/>
+              <w:spacing w:before="40" w:after="40"/>
+            </w:pPr>
+            <w:r>
+              <w:rPr>
+                <w:b w:val="0"/>
+                <w:i w:val="0"/>
+                <w:color w:val="475569"/>
+                <w:sz w:val="18"/>
+              </w:rPr>
+              <w:t>中国工場</w:t>
+            </w:r>
+          </w:p>
+        </w:tc>
+        <w:tc>
+          <w:tcPr>
+            <w:tcW w:type="dxa" w:w="1247"/>
+            <w:shd w:val="clear" w:color="auto" w:fill="EFF6FF"/>
+            <w:tcMar>
+              <w:top w:w="60" w:type="dxa"/>
+              <w:bottom w:w="60" w:type="dxa"/>
+              <w:left w:w="80" w:type="dxa"/>
+              <w:right w:w="80" w:type="dxa"/>
+            </w:tcMar>
+            <w:tcBorders>
+              <w:top w:val="single" w:sz="4" w:space="0" w:color="DBEAFE"/>
+              <w:bottom w:val="single" w:sz="4" w:space="0" w:color="DBEAFE"/>
+              <w:left w:val="single" w:sz="4" w:space="0" w:color="DBEAFE"/>
+              <w:right w:val="single" w:sz="4" w:space="0" w:color="DBEAFE"/>
+            </w:tcBorders>
+          </w:tcPr>
+          <w:p>
+            <w:pPr>
+              <w:jc w:val="left"/>
+              <w:spacing w:before="40" w:after="40"/>
+            </w:pPr>
+            <w:r>
+              <w:rPr>
+                <w:b/>
+                <w:i w:val="0"/>
+                <w:color w:val="64748B"/>
+                <w:sz w:val="18"/>
+              </w:rPr>
+              <w:t>★ 参考</w:t>
+            </w:r>
+          </w:p>
+        </w:tc>
+        <w:tc>
+          <w:tcPr>
+            <w:tcW w:type="dxa" w:w="3118"/>
+            <w:shd w:val="clear" w:color="auto" w:fill="EFF6FF"/>
+            <w:tcMar>
+              <w:top w:w="60" w:type="dxa"/>
+              <w:bottom w:w="60" w:type="dxa"/>
+              <w:left w:w="80" w:type="dxa"/>
+              <w:right w:w="80" w:type="dxa"/>
+            </w:tcMar>
+            <w:tcBorders>
+              <w:top w:val="single" w:sz="4" w:space="0" w:color="DBEAFE"/>
+              <w:bottom w:val="single" w:sz="4" w:space="0" w:color="DBEAFE"/>
+              <w:left w:val="single" w:sz="4" w:space="0" w:color="DBEAFE"/>
+              <w:right w:val="single" w:sz="4" w:space="0" w:color="DBEAFE"/>
+            </w:tcBorders>
+          </w:tcPr>
+          <w:p>
+            <w:pPr>
+              <w:jc w:val="left"/>
+              <w:spacing w:before="40" w:after="40"/>
+            </w:pPr>
+            <w:r>
+              <w:rPr>
+                <w:b w:val="0"/>
+                <w:i w:val="0"/>
+                <w:color w:val="475569"/>
+                <w:sz w:val="18"/>
+              </w:rPr>
+              <w:t>OEM/ODM事業部あり。スーツケース主力のため革小物の割合要確認。中国→韓国の切替メリットを訴求。</w:t>
+            </w:r>
+          </w:p>
+        </w:tc>
+        <w:tc>
+          <w:tcPr>
+            <w:tcW w:type="dxa" w:w="567"/>
+            <w:shd w:val="clear" w:color="auto" w:fill="EFF6FF"/>
+            <w:tcMar>
+              <w:top w:w="60" w:type="dxa"/>
+              <w:bottom w:w="60" w:type="dxa"/>
+              <w:left w:w="60" w:type="dxa"/>
+              <w:right w:w="60" w:type="dxa"/>
+            </w:tcMar>
+            <w:tcBorders>
+              <w:top w:val="single" w:sz="4" w:space="0" w:color="DBEAFE"/>
+              <w:bottom w:val="single" w:sz="4" w:space="0" w:color="DBEAFE"/>
+              <w:left w:val="single" w:sz="4" w:space="0" w:color="DBEAFE"/>
+              <w:right w:val="single" w:sz="4" w:space="0" w:color="DBEAFE"/>
+            </w:tcBorders>
+          </w:tcPr>
+          <w:p>
+            <w:pPr>
+              <w:jc w:val="center"/>
+              <w:spacing w:before="40" w:after="40"/>
+            </w:pPr>
+            <w:r>
+              <w:rPr>
+                <w:b/>
+                <w:i w:val="0"/>
+                <w:color w:val="1A56DB"/>
+                <w:sz w:val="20"/>
+              </w:rPr>
+              <w:t>🔵</w:t>
+            </w:r>
+          </w:p>
+        </w:tc>
+      </w:tr>
+      <w:tr>
+        <w:tc>
+          <w:tcPr>
+            <w:tcW w:type="dxa" w:w="1984"/>
+            <w:shd w:val="clear" w:color="auto" w:fill="FFFFFF"/>
+            <w:tcMar>
+              <w:top w:w="60" w:type="dxa"/>
+              <w:bottom w:w="60" w:type="dxa"/>
+              <w:left w:w="100" w:type="dxa"/>
+              <w:right w:w="80" w:type="dxa"/>
+            </w:tcMar>
+            <w:tcBorders>
+              <w:top w:val="single" w:sz="4" w:space="0" w:color="DBEAFE"/>
+              <w:bottom w:val="single" w:sz="4" w:space="0" w:color="DBEAFE"/>
+              <w:left w:val="single" w:sz="4" w:space="0" w:color="DBEAFE"/>
+              <w:right w:val="single" w:sz="4" w:space="0" w:color="DBEAFE"/>
+            </w:tcBorders>
           </w:tcPr>
           <w:p>
             <w:pPr>
@@ -4251,17 +3675,17 @@
                 <w:color w:val="64748B"/>
                 <w:sz w:val="16"/>
               </w:rPr>
-              <w:t>牛革ベルト・革小物 / Ryugasaki4716ブランド</w:t>
+              <w:t>所在地調査中 / Ryugasaki4716</w:t>
             </w:r>
           </w:p>
         </w:tc>
         <w:tc>
           <w:tcPr>
-            <w:tcW w:type="dxa" w:w="941"/>
-            <w:shd w:val="clear" w:color="auto" w:fill="EFF6FF"/>
+            <w:tcW w:type="dxa" w:w="1361"/>
+            <w:shd w:val="clear" w:color="auto" w:fill="FFFFFF"/>
             <w:tcMar>
-              <w:top w:w="50" w:type="dxa"/>
-              <w:bottom w:w="50" w:type="dxa"/>
+              <w:top w:w="60" w:type="dxa"/>
+              <w:bottom w:w="60" w:type="dxa"/>
               <w:left w:w="80" w:type="dxa"/>
               <w:right w:w="80" w:type="dxa"/>
             </w:tcMar>
@@ -4270,590 +3694,6 @@
               <w:bottom w:val="single" w:sz="4" w:space="0" w:color="DBEAFE"/>
               <w:left w:val="single" w:sz="4" w:space="0" w:color="DBEAFE"/>
               <w:right w:val="single" w:sz="4" w:space="0" w:color="DBEAFE"/>
-            </w:tcBorders>
-            <w:vAlign w:val="center"/>
-          </w:tcPr>
-          <w:p>
-            <w:pPr>
-              <w:jc w:val="center"/>
-              <w:spacing w:before="40" w:after="40"/>
-            </w:pPr>
-            <w:r>
-              <w:rPr>
-                <w:b w:val="0"/>
-                <w:i w:val="0"/>
-                <w:color w:val="D97706"/>
-                <w:sz w:val="22"/>
-              </w:rPr>
-              <w:t>△</w:t>
-            </w:r>
-          </w:p>
-        </w:tc>
-        <w:tc>
-          <w:tcPr>
-            <w:tcW w:type="dxa" w:w="941"/>
-            <w:shd w:val="clear" w:color="auto" w:fill="EFF6FF"/>
-            <w:tcMar>
-              <w:top w:w="50" w:type="dxa"/>
-              <w:bottom w:w="50" w:type="dxa"/>
-              <w:left w:w="80" w:type="dxa"/>
-              <w:right w:w="80" w:type="dxa"/>
-            </w:tcMar>
-            <w:tcBorders>
-              <w:top w:val="single" w:sz="4" w:space="0" w:color="DBEAFE"/>
-              <w:bottom w:val="single" w:sz="4" w:space="0" w:color="DBEAFE"/>
-              <w:left w:val="single" w:sz="4" w:space="0" w:color="DBEAFE"/>
-              <w:right w:val="single" w:sz="4" w:space="0" w:color="DBEAFE"/>
-            </w:tcBorders>
-            <w:vAlign w:val="center"/>
-          </w:tcPr>
-          <w:p>
-            <w:pPr>
-              <w:jc w:val="center"/>
-              <w:spacing w:before="40" w:after="40"/>
-            </w:pPr>
-            <w:r>
-              <w:rPr>
-                <w:b w:val="0"/>
-                <w:i w:val="0"/>
-                <w:color w:val="64748B"/>
-                <w:sz w:val="22"/>
-              </w:rPr>
-              <w:t>?</w:t>
-            </w:r>
-          </w:p>
-        </w:tc>
-        <w:tc>
-          <w:tcPr>
-            <w:tcW w:type="dxa" w:w="941"/>
-            <w:shd w:val="clear" w:color="auto" w:fill="EFF6FF"/>
-            <w:tcMar>
-              <w:top w:w="50" w:type="dxa"/>
-              <w:bottom w:w="50" w:type="dxa"/>
-              <w:left w:w="80" w:type="dxa"/>
-              <w:right w:w="80" w:type="dxa"/>
-            </w:tcMar>
-            <w:tcBorders>
-              <w:top w:val="single" w:sz="4" w:space="0" w:color="DBEAFE"/>
-              <w:bottom w:val="single" w:sz="4" w:space="0" w:color="DBEAFE"/>
-              <w:left w:val="single" w:sz="4" w:space="0" w:color="DBEAFE"/>
-              <w:right w:val="single" w:sz="4" w:space="0" w:color="DBEAFE"/>
-            </w:tcBorders>
-            <w:vAlign w:val="center"/>
-          </w:tcPr>
-          <w:p>
-            <w:pPr>
-              <w:jc w:val="center"/>
-              <w:spacing w:before="40" w:after="40"/>
-            </w:pPr>
-            <w:r>
-              <w:rPr>
-                <w:b w:val="0"/>
-                <w:i w:val="0"/>
-                <w:color w:val="64748B"/>
-                <w:sz w:val="22"/>
-              </w:rPr>
-              <w:t>?</w:t>
-            </w:r>
-          </w:p>
-        </w:tc>
-        <w:tc>
-          <w:tcPr>
-            <w:tcW w:type="dxa" w:w="941"/>
-            <w:shd w:val="clear" w:color="auto" w:fill="EFF6FF"/>
-            <w:tcMar>
-              <w:top w:w="50" w:type="dxa"/>
-              <w:bottom w:w="50" w:type="dxa"/>
-              <w:left w:w="80" w:type="dxa"/>
-              <w:right w:w="80" w:type="dxa"/>
-            </w:tcMar>
-            <w:tcBorders>
-              <w:top w:val="single" w:sz="4" w:space="0" w:color="DBEAFE"/>
-              <w:bottom w:val="single" w:sz="4" w:space="0" w:color="DBEAFE"/>
-              <w:left w:val="single" w:sz="4" w:space="0" w:color="DBEAFE"/>
-              <w:right w:val="single" w:sz="4" w:space="0" w:color="DBEAFE"/>
-            </w:tcBorders>
-            <w:vAlign w:val="center"/>
-          </w:tcPr>
-          <w:p>
-            <w:pPr>
-              <w:jc w:val="center"/>
-              <w:spacing w:before="40" w:after="40"/>
-            </w:pPr>
-            <w:r>
-              <w:rPr>
-                <w:b w:val="0"/>
-                <w:i w:val="0"/>
-                <w:color w:val="64748B"/>
-                <w:sz w:val="22"/>
-              </w:rPr>
-              <w:t>?</w:t>
-            </w:r>
-          </w:p>
-        </w:tc>
-        <w:tc>
-          <w:tcPr>
-            <w:tcW w:type="dxa" w:w="941"/>
-            <w:shd w:val="clear" w:color="auto" w:fill="EFF6FF"/>
-            <w:tcMar>
-              <w:top w:w="50" w:type="dxa"/>
-              <w:bottom w:w="50" w:type="dxa"/>
-              <w:left w:w="80" w:type="dxa"/>
-              <w:right w:w="80" w:type="dxa"/>
-            </w:tcMar>
-            <w:tcBorders>
-              <w:top w:val="single" w:sz="4" w:space="0" w:color="DBEAFE"/>
-              <w:bottom w:val="single" w:sz="4" w:space="0" w:color="DBEAFE"/>
-              <w:left w:val="single" w:sz="4" w:space="0" w:color="DBEAFE"/>
-              <w:right w:val="single" w:sz="4" w:space="0" w:color="DBEAFE"/>
-            </w:tcBorders>
-            <w:vAlign w:val="center"/>
-          </w:tcPr>
-          <w:p>
-            <w:pPr>
-              <w:jc w:val="center"/>
-              <w:spacing w:before="40" w:after="40"/>
-            </w:pPr>
-            <w:r>
-              <w:rPr>
-                <w:b w:val="0"/>
-                <w:i w:val="0"/>
-                <w:color w:val="D97706"/>
-                <w:sz w:val="22"/>
-              </w:rPr>
-              <w:t>△</w:t>
-            </w:r>
-          </w:p>
-        </w:tc>
-        <w:tc>
-          <w:tcPr>
-            <w:tcW w:type="dxa" w:w="941"/>
-            <w:shd w:val="clear" w:color="auto" w:fill="EFF6FF"/>
-            <w:tcMar>
-              <w:top w:w="50" w:type="dxa"/>
-              <w:bottom w:w="50" w:type="dxa"/>
-              <w:left w:w="80" w:type="dxa"/>
-              <w:right w:w="80" w:type="dxa"/>
-            </w:tcMar>
-            <w:tcBorders>
-              <w:top w:val="single" w:sz="4" w:space="0" w:color="DBEAFE"/>
-              <w:bottom w:val="single" w:sz="4" w:space="0" w:color="DBEAFE"/>
-              <w:left w:val="single" w:sz="4" w:space="0" w:color="DBEAFE"/>
-              <w:right w:val="single" w:sz="4" w:space="0" w:color="DBEAFE"/>
-            </w:tcBorders>
-            <w:vAlign w:val="center"/>
-          </w:tcPr>
-          <w:p>
-            <w:pPr>
-              <w:jc w:val="center"/>
-              <w:spacing w:before="40" w:after="40"/>
-            </w:pPr>
-            <w:r>
-              <w:rPr>
-                <w:b w:val="0"/>
-                <w:i w:val="0"/>
-                <w:color w:val="64748B"/>
-                <w:sz w:val="22"/>
-              </w:rPr>
-              <w:t>?</w:t>
-            </w:r>
-          </w:p>
-        </w:tc>
-        <w:tc>
-          <w:tcPr>
-            <w:tcW w:type="dxa" w:w="941"/>
-            <w:shd w:val="clear" w:color="auto" w:fill="EFF6FF"/>
-            <w:tcMar>
-              <w:top w:w="50" w:type="dxa"/>
-              <w:bottom w:w="50" w:type="dxa"/>
-              <w:left w:w="80" w:type="dxa"/>
-              <w:right w:w="80" w:type="dxa"/>
-            </w:tcMar>
-            <w:tcBorders>
-              <w:top w:val="single" w:sz="4" w:space="0" w:color="DBEAFE"/>
-              <w:bottom w:val="single" w:sz="4" w:space="0" w:color="DBEAFE"/>
-              <w:left w:val="single" w:sz="4" w:space="0" w:color="DBEAFE"/>
-              <w:right w:val="single" w:sz="4" w:space="0" w:color="DBEAFE"/>
-            </w:tcBorders>
-            <w:vAlign w:val="center"/>
-          </w:tcPr>
-          <w:p>
-            <w:pPr>
-              <w:jc w:val="center"/>
-              <w:spacing w:before="40" w:after="40"/>
-            </w:pPr>
-            <w:r>
-              <w:rPr>
-                <w:b/>
-                <w:i w:val="0"/>
-                <w:color w:val="166534"/>
-                <w:sz w:val="22"/>
-              </w:rPr>
-              <w:t>✓</w:t>
-            </w:r>
-          </w:p>
-        </w:tc>
-        <w:tc>
-          <w:tcPr>
-            <w:tcW w:type="dxa" w:w="941"/>
-            <w:shd w:val="clear" w:color="auto" w:fill="EFF6FF"/>
-            <w:tcMar>
-              <w:top w:w="50" w:type="dxa"/>
-              <w:bottom w:w="50" w:type="dxa"/>
-              <w:left w:w="80" w:type="dxa"/>
-              <w:right w:w="80" w:type="dxa"/>
-            </w:tcMar>
-            <w:tcBorders>
-              <w:top w:val="single" w:sz="4" w:space="0" w:color="DBEAFE"/>
-              <w:bottom w:val="single" w:sz="4" w:space="0" w:color="DBEAFE"/>
-              <w:left w:val="single" w:sz="4" w:space="0" w:color="DBEAFE"/>
-              <w:right w:val="single" w:sz="4" w:space="0" w:color="DBEAFE"/>
-            </w:tcBorders>
-            <w:vAlign w:val="center"/>
-          </w:tcPr>
-          <w:p>
-            <w:pPr>
-              <w:jc w:val="center"/>
-              <w:spacing w:before="40" w:after="40"/>
-            </w:pPr>
-            <w:r>
-              <w:rPr>
-                <w:b/>
-                <w:i w:val="0"/>
-                <w:color w:val="1A56DB"/>
-                <w:sz w:val="18"/>
-              </w:rPr>
-              <w:t>★ 参考</w:t>
-            </w:r>
-          </w:p>
-        </w:tc>
-        <w:tc>
-          <w:tcPr>
-            <w:tcW w:type="dxa" w:w="941"/>
-            <w:shd w:val="clear" w:color="auto" w:fill="EFF6FF"/>
-            <w:tcMar>
-              <w:top w:w="50" w:type="dxa"/>
-              <w:bottom w:w="50" w:type="dxa"/>
-              <w:left w:w="80" w:type="dxa"/>
-              <w:right w:w="80" w:type="dxa"/>
-            </w:tcMar>
-            <w:tcBorders>
-              <w:top w:val="single" w:sz="4" w:space="0" w:color="DBEAFE"/>
-              <w:bottom w:val="single" w:sz="4" w:space="0" w:color="DBEAFE"/>
-              <w:left w:val="single" w:sz="4" w:space="0" w:color="DBEAFE"/>
-              <w:right w:val="single" w:sz="4" w:space="0" w:color="DBEAFE"/>
-            </w:tcBorders>
-            <w:vAlign w:val="center"/>
-          </w:tcPr>
-          <w:p>
-            <w:pPr>
-              <w:jc w:val="left"/>
-              <w:spacing w:before="40" w:after="40"/>
-            </w:pPr>
-            <w:r>
-              <w:rPr>
-                <w:b w:val="0"/>
-                <w:i w:val="0"/>
-                <w:color w:val="475569"/>
-                <w:sz w:val="18"/>
-              </w:rPr>
-              <w:t>国内製造訴求強め。OEM検討余地は要確認。小物特化のため量産規模が小さい可能性</w:t>
-            </w:r>
-          </w:p>
-        </w:tc>
-      </w:tr>
-    </w:tbl>
-    <w:p/>
-    <w:p>
-      <w:pPr>
-        <w:spacing w:before="80" w:after="40"/>
-      </w:pPr>
-      <w:r>
-        <w:rPr>
-          <w:b/>
-          <w:i w:val="0"/>
-          <w:color w:val="991B1B"/>
-          <w:sz w:val="22"/>
-        </w:rPr>
-        <w:t>◎ 競合・参考調査対象（OEM工場 5社）</w:t>
-      </w:r>
-    </w:p>
-    <w:tbl>
-      <w:tblPr>
-        <w:tblW w:type="auto" w:w="0"/>
-        <w:tblLook w:firstColumn="1" w:firstRow="1" w:lastColumn="0" w:lastRow="0" w:noHBand="0" w:noVBand="1" w:val="04A0"/>
-        <w:tblCellSpacing w:w="0" w:type="dxa"/>
-      </w:tblPr>
-      <w:tblGrid>
-        <w:gridCol w:w="2268"/>
-        <w:gridCol w:w="850"/>
-        <w:gridCol w:w="2551"/>
-        <w:gridCol w:w="1417"/>
-        <w:gridCol w:w="3118"/>
-      </w:tblGrid>
-      <w:tr>
-        <w:tc>
-          <w:tcPr>
-            <w:tcW w:type="dxa" w:w="1881"/>
-            <w:shd w:val="clear" w:color="auto" w:fill="7F1D1D"/>
-            <w:tcMar>
-              <w:top w:w="60" w:type="dxa"/>
-              <w:bottom w:w="60" w:type="dxa"/>
-              <w:left w:w="80" w:type="dxa"/>
-              <w:right w:w="80" w:type="dxa"/>
-            </w:tcMar>
-            <w:tcBorders>
-              <w:top w:val="single" w:sz="4" w:space="0" w:color="FECACA"/>
-              <w:bottom w:val="single" w:sz="4" w:space="0" w:color="FECACA"/>
-              <w:left w:val="single" w:sz="4" w:space="0" w:color="FECACA"/>
-              <w:right w:val="single" w:sz="4" w:space="0" w:color="FECACA"/>
-            </w:tcBorders>
-          </w:tcPr>
-          <w:p>
-            <w:pPr>
-              <w:jc w:val="left"/>
-              <w:spacing w:before="40" w:after="40"/>
-            </w:pPr>
-            <w:r>
-              <w:rPr>
-                <w:b/>
-                <w:i w:val="0"/>
-                <w:color w:val="FFFFFF"/>
-                <w:sz w:val="18"/>
-              </w:rPr>
-              <w:t>企業名</w:t>
-            </w:r>
-          </w:p>
-        </w:tc>
-        <w:tc>
-          <w:tcPr>
-            <w:tcW w:type="dxa" w:w="1881"/>
-            <w:shd w:val="clear" w:color="auto" w:fill="7F1D1D"/>
-            <w:tcMar>
-              <w:top w:w="60" w:type="dxa"/>
-              <w:bottom w:w="60" w:type="dxa"/>
-              <w:left w:w="80" w:type="dxa"/>
-              <w:right w:w="80" w:type="dxa"/>
-            </w:tcMar>
-            <w:tcBorders>
-              <w:top w:val="single" w:sz="4" w:space="0" w:color="FECACA"/>
-              <w:bottom w:val="single" w:sz="4" w:space="0" w:color="FECACA"/>
-              <w:left w:val="single" w:sz="4" w:space="0" w:color="FECACA"/>
-              <w:right w:val="single" w:sz="4" w:space="0" w:color="FECACA"/>
-            </w:tcBorders>
-          </w:tcPr>
-          <w:p>
-            <w:pPr>
-              <w:jc w:val="left"/>
-              <w:spacing w:before="40" w:after="40"/>
-            </w:pPr>
-            <w:r>
-              <w:rPr>
-                <w:b/>
-                <w:i w:val="0"/>
-                <w:color w:val="FFFFFF"/>
-                <w:sz w:val="18"/>
-              </w:rPr>
-              <w:t>拠点</w:t>
-            </w:r>
-          </w:p>
-        </w:tc>
-        <w:tc>
-          <w:tcPr>
-            <w:tcW w:type="dxa" w:w="1881"/>
-            <w:shd w:val="clear" w:color="auto" w:fill="7F1D1D"/>
-            <w:tcMar>
-              <w:top w:w="60" w:type="dxa"/>
-              <w:bottom w:w="60" w:type="dxa"/>
-              <w:left w:w="80" w:type="dxa"/>
-              <w:right w:w="80" w:type="dxa"/>
-            </w:tcMar>
-            <w:tcBorders>
-              <w:top w:val="single" w:sz="4" w:space="0" w:color="FECACA"/>
-              <w:bottom w:val="single" w:sz="4" w:space="0" w:color="FECACA"/>
-              <w:left w:val="single" w:sz="4" w:space="0" w:color="FECACA"/>
-              <w:right w:val="single" w:sz="4" w:space="0" w:color="FECACA"/>
-            </w:tcBorders>
-          </w:tcPr>
-          <w:p>
-            <w:pPr>
-              <w:jc w:val="left"/>
-              <w:spacing w:before="40" w:after="40"/>
-            </w:pPr>
-            <w:r>
-              <w:rPr>
-                <w:b/>
-                <w:i w:val="0"/>
-                <w:color w:val="FFFFFF"/>
-                <w:sz w:val="18"/>
-              </w:rPr>
-              <w:t>特徴</w:t>
-            </w:r>
-          </w:p>
-        </w:tc>
-        <w:tc>
-          <w:tcPr>
-            <w:tcW w:type="dxa" w:w="1881"/>
-            <w:shd w:val="clear" w:color="auto" w:fill="7F1D1D"/>
-            <w:tcMar>
-              <w:top w:w="60" w:type="dxa"/>
-              <w:bottom w:w="60" w:type="dxa"/>
-              <w:left w:w="80" w:type="dxa"/>
-              <w:right w:w="80" w:type="dxa"/>
-            </w:tcMar>
-            <w:tcBorders>
-              <w:top w:val="single" w:sz="4" w:space="0" w:color="FECACA"/>
-              <w:bottom w:val="single" w:sz="4" w:space="0" w:color="FECACA"/>
-              <w:left w:val="single" w:sz="4" w:space="0" w:color="FECACA"/>
-              <w:right w:val="single" w:sz="4" w:space="0" w:color="FECACA"/>
-            </w:tcBorders>
-          </w:tcPr>
-          <w:p>
-            <w:pPr>
-              <w:jc w:val="left"/>
-              <w:spacing w:before="40" w:after="40"/>
-            </w:pPr>
-            <w:r>
-              <w:rPr>
-                <w:b/>
-                <w:i w:val="0"/>
-                <w:color w:val="FFFFFF"/>
-                <w:sz w:val="18"/>
-              </w:rPr>
-              <w:t>分類</w:t>
-            </w:r>
-          </w:p>
-        </w:tc>
-        <w:tc>
-          <w:tcPr>
-            <w:tcW w:type="dxa" w:w="1881"/>
-            <w:shd w:val="clear" w:color="auto" w:fill="7F1D1D"/>
-            <w:tcMar>
-              <w:top w:w="60" w:type="dxa"/>
-              <w:bottom w:w="60" w:type="dxa"/>
-              <w:left w:w="80" w:type="dxa"/>
-              <w:right w:w="80" w:type="dxa"/>
-            </w:tcMar>
-            <w:tcBorders>
-              <w:top w:val="single" w:sz="4" w:space="0" w:color="FECACA"/>
-              <w:bottom w:val="single" w:sz="4" w:space="0" w:color="FECACA"/>
-              <w:left w:val="single" w:sz="4" w:space="0" w:color="FECACA"/>
-              <w:right w:val="single" w:sz="4" w:space="0" w:color="FECACA"/>
-            </w:tcBorders>
-          </w:tcPr>
-          <w:p>
-            <w:pPr>
-              <w:jc w:val="left"/>
-              <w:spacing w:before="40" w:after="40"/>
-            </w:pPr>
-            <w:r>
-              <w:rPr>
-                <w:b/>
-                <w:i w:val="0"/>
-                <w:color w:val="FFFFFF"/>
-                <w:sz w:val="18"/>
-              </w:rPr>
-              <w:t>Sanheとの比較ポイント</w:t>
-            </w:r>
-          </w:p>
-        </w:tc>
-      </w:tr>
-      <w:tr>
-        <w:tc>
-          <w:tcPr>
-            <w:tcW w:type="dxa" w:w="1881"/>
-            <w:shd w:val="clear" w:color="auto" w:fill="FEF2F2"/>
-            <w:tcMar>
-              <w:top w:w="50" w:type="dxa"/>
-              <w:bottom w:w="50" w:type="dxa"/>
-              <w:left w:w="80" w:type="dxa"/>
-              <w:right w:w="80" w:type="dxa"/>
-            </w:tcMar>
-            <w:tcBorders>
-              <w:top w:val="single" w:sz="4" w:space="0" w:color="FECACA"/>
-              <w:bottom w:val="single" w:sz="4" w:space="0" w:color="FECACA"/>
-              <w:left w:val="single" w:sz="4" w:space="0" w:color="FECACA"/>
-              <w:right w:val="single" w:sz="4" w:space="0" w:color="FECACA"/>
-            </w:tcBorders>
-          </w:tcPr>
-          <w:p>
-            <w:pPr>
-              <w:jc w:val="left"/>
-              <w:spacing w:before="40" w:after="10"/>
-            </w:pPr>
-            <w:r>
-              <w:rPr>
-                <w:b/>
-                <w:i w:val="0"/>
-                <w:color w:val="991B1B"/>
-                <w:sz w:val="20"/>
-              </w:rPr>
-              <w:t>HAINING ALLBRIGHT TRADING</w:t>
-            </w:r>
-          </w:p>
-          <w:p>
-            <w:pPr>
-              <w:spacing w:before="0" w:after="40"/>
-            </w:pPr>
-            <w:r>
-              <w:rPr>
-                <w:b w:val="0"/>
-                <w:i w:val="0"/>
-                <w:color w:val="64748B"/>
-                <w:sz w:val="16"/>
-              </w:rPr>
-              <w:t>バッグ・財布OEM / 中国・浙江省工場</w:t>
-            </w:r>
-          </w:p>
-        </w:tc>
-        <w:tc>
-          <w:tcPr>
-            <w:tcW w:type="dxa" w:w="1881"/>
-            <w:shd w:val="clear" w:color="auto" w:fill="FEF2F2"/>
-            <w:tcMar>
-              <w:top w:w="50" w:type="dxa"/>
-              <w:bottom w:w="50" w:type="dxa"/>
-              <w:left w:w="80" w:type="dxa"/>
-              <w:right w:w="80" w:type="dxa"/>
-            </w:tcMar>
-            <w:tcBorders>
-              <w:top w:val="single" w:sz="4" w:space="0" w:color="FECACA"/>
-              <w:bottom w:val="single" w:sz="4" w:space="0" w:color="FECACA"/>
-              <w:left w:val="single" w:sz="4" w:space="0" w:color="FECACA"/>
-              <w:right w:val="single" w:sz="4" w:space="0" w:color="FECACA"/>
-            </w:tcBorders>
-          </w:tcPr>
-          <w:p>
-            <w:pPr>
-              <w:jc w:val="left"/>
-              <w:spacing w:before="40" w:after="40"/>
-            </w:pPr>
-            <w:r>
-              <w:rPr>
-                <w:b w:val="0"/>
-                <w:i w:val="0"/>
-                <w:color w:val="1E3A5F"/>
-                <w:sz w:val="20"/>
-              </w:rPr>
-              <w:t>中国</w:t>
-            </w:r>
-          </w:p>
-        </w:tc>
-        <w:tc>
-          <w:tcPr>
-            <w:tcW w:type="dxa" w:w="1881"/>
-            <w:shd w:val="clear" w:color="auto" w:fill="FEF2F2"/>
-            <w:tcMar>
-              <w:top w:w="50" w:type="dxa"/>
-              <w:bottom w:w="50" w:type="dxa"/>
-              <w:left w:w="80" w:type="dxa"/>
-              <w:right w:w="80" w:type="dxa"/>
-            </w:tcMar>
-            <w:tcBorders>
-              <w:top w:val="single" w:sz="4" w:space="0" w:color="FECACA"/>
-              <w:bottom w:val="single" w:sz="4" w:space="0" w:color="FECACA"/>
-              <w:left w:val="single" w:sz="4" w:space="0" w:color="FECACA"/>
-              <w:right w:val="single" w:sz="4" w:space="0" w:color="FECACA"/>
             </w:tcBorders>
           </w:tcPr>
           <w:p>
@@ -4868,25 +3708,1139 @@
                 <w:color w:val="475569"/>
                 <w:sz w:val="18"/>
               </w:rPr>
-              <w:t>中国OEMメーカー。低価格・大ロット対応が強み</w:t>
+              <w:t>牛革ベルト・革小物</w:t>
             </w:r>
           </w:p>
         </w:tc>
         <w:tc>
           <w:tcPr>
-            <w:tcW w:type="dxa" w:w="1881"/>
-            <w:shd w:val="clear" w:color="auto" w:fill="FEF2F2"/>
+            <w:tcW w:type="dxa" w:w="680"/>
+            <w:shd w:val="clear" w:color="auto" w:fill="FFFFFF"/>
             <w:tcMar>
-              <w:top w:w="50" w:type="dxa"/>
-              <w:bottom w:w="50" w:type="dxa"/>
+              <w:top w:w="60" w:type="dxa"/>
+              <w:bottom w:w="60" w:type="dxa"/>
               <w:left w:w="80" w:type="dxa"/>
               <w:right w:w="80" w:type="dxa"/>
             </w:tcMar>
             <w:tcBorders>
-              <w:top w:val="single" w:sz="4" w:space="0" w:color="FECACA"/>
-              <w:bottom w:val="single" w:sz="4" w:space="0" w:color="FECACA"/>
-              <w:left w:val="single" w:sz="4" w:space="0" w:color="FECACA"/>
-              <w:right w:val="single" w:sz="4" w:space="0" w:color="FECACA"/>
+              <w:top w:val="single" w:sz="4" w:space="0" w:color="DBEAFE"/>
+              <w:bottom w:val="single" w:sz="4" w:space="0" w:color="DBEAFE"/>
+              <w:left w:val="single" w:sz="4" w:space="0" w:color="DBEAFE"/>
+              <w:right w:val="single" w:sz="4" w:space="0" w:color="DBEAFE"/>
+            </w:tcBorders>
+          </w:tcPr>
+          <w:p>
+            <w:pPr>
+              <w:jc w:val="center"/>
+              <w:spacing w:before="40" w:after="40"/>
+            </w:pPr>
+            <w:r>
+              <w:rPr>
+                <w:b w:val="0"/>
+                <w:i w:val="0"/>
+                <w:color w:val="475569"/>
+                <w:sz w:val="18"/>
+              </w:rPr>
+              <w:t>要確認</w:t>
+            </w:r>
+          </w:p>
+        </w:tc>
+        <w:tc>
+          <w:tcPr>
+            <w:tcW w:type="dxa" w:w="1247"/>
+            <w:shd w:val="clear" w:color="auto" w:fill="FFFFFF"/>
+            <w:tcMar>
+              <w:top w:w="60" w:type="dxa"/>
+              <w:bottom w:w="60" w:type="dxa"/>
+              <w:left w:w="80" w:type="dxa"/>
+              <w:right w:w="80" w:type="dxa"/>
+            </w:tcMar>
+            <w:tcBorders>
+              <w:top w:val="single" w:sz="4" w:space="0" w:color="DBEAFE"/>
+              <w:bottom w:val="single" w:sz="4" w:space="0" w:color="DBEAFE"/>
+              <w:left w:val="single" w:sz="4" w:space="0" w:color="DBEAFE"/>
+              <w:right w:val="single" w:sz="4" w:space="0" w:color="DBEAFE"/>
+            </w:tcBorders>
+          </w:tcPr>
+          <w:p>
+            <w:pPr>
+              <w:jc w:val="center"/>
+              <w:spacing w:before="40" w:after="40"/>
+            </w:pPr>
+            <w:r>
+              <w:rPr>
+                <w:b w:val="0"/>
+                <w:i w:val="0"/>
+                <w:color w:val="475569"/>
+                <w:sz w:val="18"/>
+              </w:rPr>
+              <w:t>国内製造訴求</w:t>
+            </w:r>
+          </w:p>
+        </w:tc>
+        <w:tc>
+          <w:tcPr>
+            <w:tcW w:type="dxa" w:w="1247"/>
+            <w:shd w:val="clear" w:color="auto" w:fill="FFFFFF"/>
+            <w:tcMar>
+              <w:top w:w="60" w:type="dxa"/>
+              <w:bottom w:w="60" w:type="dxa"/>
+              <w:left w:w="80" w:type="dxa"/>
+              <w:right w:w="80" w:type="dxa"/>
+            </w:tcMar>
+            <w:tcBorders>
+              <w:top w:val="single" w:sz="4" w:space="0" w:color="DBEAFE"/>
+              <w:bottom w:val="single" w:sz="4" w:space="0" w:color="DBEAFE"/>
+              <w:left w:val="single" w:sz="4" w:space="0" w:color="DBEAFE"/>
+              <w:right w:val="single" w:sz="4" w:space="0" w:color="DBEAFE"/>
+            </w:tcBorders>
+          </w:tcPr>
+          <w:p>
+            <w:pPr>
+              <w:jc w:val="left"/>
+              <w:spacing w:before="40" w:after="40"/>
+            </w:pPr>
+            <w:r>
+              <w:rPr>
+                <w:b/>
+                <w:i w:val="0"/>
+                <w:color w:val="64748B"/>
+                <w:sz w:val="18"/>
+              </w:rPr>
+              <w:t>★ 参考</w:t>
+            </w:r>
+          </w:p>
+        </w:tc>
+        <w:tc>
+          <w:tcPr>
+            <w:tcW w:type="dxa" w:w="3118"/>
+            <w:shd w:val="clear" w:color="auto" w:fill="FFFFFF"/>
+            <w:tcMar>
+              <w:top w:w="60" w:type="dxa"/>
+              <w:bottom w:w="60" w:type="dxa"/>
+              <w:left w:w="80" w:type="dxa"/>
+              <w:right w:w="80" w:type="dxa"/>
+            </w:tcMar>
+            <w:tcBorders>
+              <w:top w:val="single" w:sz="4" w:space="0" w:color="DBEAFE"/>
+              <w:bottom w:val="single" w:sz="4" w:space="0" w:color="DBEAFE"/>
+              <w:left w:val="single" w:sz="4" w:space="0" w:color="DBEAFE"/>
+              <w:right w:val="single" w:sz="4" w:space="0" w:color="DBEAFE"/>
+            </w:tcBorders>
+          </w:tcPr>
+          <w:p>
+            <w:pPr>
+              <w:jc w:val="left"/>
+              <w:spacing w:before="40" w:after="40"/>
+            </w:pPr>
+            <w:r>
+              <w:rPr>
+                <w:b w:val="0"/>
+                <w:i w:val="0"/>
+                <w:color w:val="475569"/>
+                <w:sz w:val="18"/>
+              </w:rPr>
+              <w:t>自社ブランド保有。国内製造訴求が強いためOEM移行ハードル高め。小物特化で量産規模が小さい可能性。</w:t>
+            </w:r>
+          </w:p>
+        </w:tc>
+        <w:tc>
+          <w:tcPr>
+            <w:tcW w:type="dxa" w:w="567"/>
+            <w:shd w:val="clear" w:color="auto" w:fill="FFFFFF"/>
+            <w:tcMar>
+              <w:top w:w="60" w:type="dxa"/>
+              <w:bottom w:w="60" w:type="dxa"/>
+              <w:left w:w="60" w:type="dxa"/>
+              <w:right w:w="60" w:type="dxa"/>
+            </w:tcMar>
+            <w:tcBorders>
+              <w:top w:val="single" w:sz="4" w:space="0" w:color="DBEAFE"/>
+              <w:bottom w:val="single" w:sz="4" w:space="0" w:color="DBEAFE"/>
+              <w:left w:val="single" w:sz="4" w:space="0" w:color="DBEAFE"/>
+              <w:right w:val="single" w:sz="4" w:space="0" w:color="DBEAFE"/>
+            </w:tcBorders>
+          </w:tcPr>
+          <w:p>
+            <w:pPr>
+              <w:jc w:val="center"/>
+              <w:spacing w:before="40" w:after="40"/>
+            </w:pPr>
+            <w:r>
+              <w:rPr>
+                <w:b/>
+                <w:i w:val="0"/>
+                <w:color w:val="1A56DB"/>
+                <w:sz w:val="20"/>
+              </w:rPr>
+              <w:t>🔵</w:t>
+            </w:r>
+          </w:p>
+        </w:tc>
+      </w:tr>
+      <w:tr>
+        <w:tc>
+          <w:tcPr>
+            <w:tcW w:type="dxa" w:w="1984"/>
+            <w:shd w:val="clear" w:color="auto" w:fill="EFF6FF"/>
+            <w:tcMar>
+              <w:top w:w="60" w:type="dxa"/>
+              <w:bottom w:w="60" w:type="dxa"/>
+              <w:left w:w="100" w:type="dxa"/>
+              <w:right w:w="80" w:type="dxa"/>
+            </w:tcMar>
+            <w:tcBorders>
+              <w:top w:val="single" w:sz="4" w:space="0" w:color="DBEAFE"/>
+              <w:bottom w:val="single" w:sz="4" w:space="0" w:color="DBEAFE"/>
+              <w:left w:val="single" w:sz="4" w:space="0" w:color="DBEAFE"/>
+              <w:right w:val="single" w:sz="4" w:space="0" w:color="DBEAFE"/>
+            </w:tcBorders>
+          </w:tcPr>
+          <w:p>
+            <w:pPr>
+              <w:jc w:val="left"/>
+              <w:spacing w:before="40" w:after="10"/>
+            </w:pPr>
+            <w:r>
+              <w:rPr>
+                <w:b/>
+                <w:i w:val="0"/>
+                <w:color w:val="0F2D5E"/>
+                <w:sz w:val="20"/>
+              </w:rPr>
+              <w:t>D'JORA Lifestyles</w:t>
+            </w:r>
+          </w:p>
+          <w:p>
+            <w:pPr>
+              <w:spacing w:before="0" w:after="40"/>
+            </w:pPr>
+            <w:r>
+              <w:rPr>
+                <w:b w:val="0"/>
+                <w:i w:val="0"/>
+                <w:color w:val="64748B"/>
+                <w:sz w:val="16"/>
+              </w:rPr>
+              <w:t>シンガポール法人 / 日本出展</w:t>
+            </w:r>
+          </w:p>
+        </w:tc>
+        <w:tc>
+          <w:tcPr>
+            <w:tcW w:type="dxa" w:w="1361"/>
+            <w:shd w:val="clear" w:color="auto" w:fill="EFF6FF"/>
+            <w:tcMar>
+              <w:top w:w="60" w:type="dxa"/>
+              <w:bottom w:w="60" w:type="dxa"/>
+              <w:left w:w="80" w:type="dxa"/>
+              <w:right w:w="80" w:type="dxa"/>
+            </w:tcMar>
+            <w:tcBorders>
+              <w:top w:val="single" w:sz="4" w:space="0" w:color="DBEAFE"/>
+              <w:bottom w:val="single" w:sz="4" w:space="0" w:color="DBEAFE"/>
+              <w:left w:val="single" w:sz="4" w:space="0" w:color="DBEAFE"/>
+              <w:right w:val="single" w:sz="4" w:space="0" w:color="DBEAFE"/>
+            </w:tcBorders>
+          </w:tcPr>
+          <w:p>
+            <w:pPr>
+              <w:jc w:val="left"/>
+              <w:spacing w:before="40" w:after="40"/>
+            </w:pPr>
+            <w:r>
+              <w:rPr>
+                <w:b w:val="0"/>
+                <w:i w:val="0"/>
+                <w:color w:val="475569"/>
+                <w:sz w:val="18"/>
+              </w:rPr>
+              <w:t>バッグ・レザー製品</w:t>
+            </w:r>
+          </w:p>
+        </w:tc>
+        <w:tc>
+          <w:tcPr>
+            <w:tcW w:type="dxa" w:w="680"/>
+            <w:shd w:val="clear" w:color="auto" w:fill="EFF6FF"/>
+            <w:tcMar>
+              <w:top w:w="60" w:type="dxa"/>
+              <w:bottom w:w="60" w:type="dxa"/>
+              <w:left w:w="80" w:type="dxa"/>
+              <w:right w:w="80" w:type="dxa"/>
+            </w:tcMar>
+            <w:tcBorders>
+              <w:top w:val="single" w:sz="4" w:space="0" w:color="DBEAFE"/>
+              <w:bottom w:val="single" w:sz="4" w:space="0" w:color="DBEAFE"/>
+              <w:left w:val="single" w:sz="4" w:space="0" w:color="DBEAFE"/>
+              <w:right w:val="single" w:sz="4" w:space="0" w:color="DBEAFE"/>
+            </w:tcBorders>
+          </w:tcPr>
+          <w:p>
+            <w:pPr>
+              <w:jc w:val="center"/>
+              <w:spacing w:before="40" w:after="40"/>
+            </w:pPr>
+            <w:r>
+              <w:rPr>
+                <w:b w:val="0"/>
+                <w:i w:val="0"/>
+                <w:color w:val="475569"/>
+                <w:sz w:val="18"/>
+              </w:rPr>
+              <w:t>要確認</w:t>
+            </w:r>
+          </w:p>
+        </w:tc>
+        <w:tc>
+          <w:tcPr>
+            <w:tcW w:type="dxa" w:w="1247"/>
+            <w:shd w:val="clear" w:color="auto" w:fill="EFF6FF"/>
+            <w:tcMar>
+              <w:top w:w="60" w:type="dxa"/>
+              <w:bottom w:w="60" w:type="dxa"/>
+              <w:left w:w="80" w:type="dxa"/>
+              <w:right w:w="80" w:type="dxa"/>
+            </w:tcMar>
+            <w:tcBorders>
+              <w:top w:val="single" w:sz="4" w:space="0" w:color="DBEAFE"/>
+              <w:bottom w:val="single" w:sz="4" w:space="0" w:color="DBEAFE"/>
+              <w:left w:val="single" w:sz="4" w:space="0" w:color="DBEAFE"/>
+              <w:right w:val="single" w:sz="4" w:space="0" w:color="DBEAFE"/>
+            </w:tcBorders>
+          </w:tcPr>
+          <w:p>
+            <w:pPr>
+              <w:jc w:val="center"/>
+              <w:spacing w:before="40" w:after="40"/>
+            </w:pPr>
+            <w:r>
+              <w:rPr>
+                <w:b w:val="0"/>
+                <w:i w:val="0"/>
+                <w:color w:val="475569"/>
+                <w:sz w:val="18"/>
+              </w:rPr>
+              <w:t>外注（詳細未確認）</w:t>
+            </w:r>
+          </w:p>
+        </w:tc>
+        <w:tc>
+          <w:tcPr>
+            <w:tcW w:type="dxa" w:w="1247"/>
+            <w:shd w:val="clear" w:color="auto" w:fill="EFF6FF"/>
+            <w:tcMar>
+              <w:top w:w="60" w:type="dxa"/>
+              <w:bottom w:w="60" w:type="dxa"/>
+              <w:left w:w="80" w:type="dxa"/>
+              <w:right w:w="80" w:type="dxa"/>
+            </w:tcMar>
+            <w:tcBorders>
+              <w:top w:val="single" w:sz="4" w:space="0" w:color="DBEAFE"/>
+              <w:bottom w:val="single" w:sz="4" w:space="0" w:color="DBEAFE"/>
+              <w:left w:val="single" w:sz="4" w:space="0" w:color="DBEAFE"/>
+              <w:right w:val="single" w:sz="4" w:space="0" w:color="DBEAFE"/>
+            </w:tcBorders>
+          </w:tcPr>
+          <w:p>
+            <w:pPr>
+              <w:jc w:val="left"/>
+              <w:spacing w:before="40" w:after="40"/>
+            </w:pPr>
+            <w:r>
+              <w:rPr>
+                <w:b/>
+                <w:i w:val="0"/>
+                <w:color w:val="64748B"/>
+                <w:sz w:val="18"/>
+              </w:rPr>
+              <w:t>★ 参考</w:t>
+            </w:r>
+          </w:p>
+        </w:tc>
+        <w:tc>
+          <w:tcPr>
+            <w:tcW w:type="dxa" w:w="3118"/>
+            <w:shd w:val="clear" w:color="auto" w:fill="EFF6FF"/>
+            <w:tcMar>
+              <w:top w:w="60" w:type="dxa"/>
+              <w:bottom w:w="60" w:type="dxa"/>
+              <w:left w:w="80" w:type="dxa"/>
+              <w:right w:w="80" w:type="dxa"/>
+            </w:tcMar>
+            <w:tcBorders>
+              <w:top w:val="single" w:sz="4" w:space="0" w:color="DBEAFE"/>
+              <w:bottom w:val="single" w:sz="4" w:space="0" w:color="DBEAFE"/>
+              <w:left w:val="single" w:sz="4" w:space="0" w:color="DBEAFE"/>
+              <w:right w:val="single" w:sz="4" w:space="0" w:color="DBEAFE"/>
+            </w:tcBorders>
+          </w:tcPr>
+          <w:p>
+            <w:pPr>
+              <w:jc w:val="left"/>
+              <w:spacing w:before="40" w:after="40"/>
+            </w:pPr>
+            <w:r>
+              <w:rPr>
+                <w:b w:val="0"/>
+                <w:i w:val="0"/>
+                <w:color w:val="475569"/>
+                <w:sz w:val="18"/>
+              </w:rPr>
+              <w:t>英語商談可能。東京拠点なし → 優先度低め。ただし海外展開済みのため韓国工場との相性を探る価値あり。</w:t>
+            </w:r>
+          </w:p>
+        </w:tc>
+        <w:tc>
+          <w:tcPr>
+            <w:tcW w:type="dxa" w:w="567"/>
+            <w:shd w:val="clear" w:color="auto" w:fill="EFF6FF"/>
+            <w:tcMar>
+              <w:top w:w="60" w:type="dxa"/>
+              <w:bottom w:w="60" w:type="dxa"/>
+              <w:left w:w="60" w:type="dxa"/>
+              <w:right w:w="60" w:type="dxa"/>
+            </w:tcMar>
+            <w:tcBorders>
+              <w:top w:val="single" w:sz="4" w:space="0" w:color="DBEAFE"/>
+              <w:bottom w:val="single" w:sz="4" w:space="0" w:color="DBEAFE"/>
+              <w:left w:val="single" w:sz="4" w:space="0" w:color="DBEAFE"/>
+              <w:right w:val="single" w:sz="4" w:space="0" w:color="DBEAFE"/>
+            </w:tcBorders>
+          </w:tcPr>
+          <w:p>
+            <w:pPr>
+              <w:jc w:val="center"/>
+              <w:spacing w:before="40" w:after="40"/>
+            </w:pPr>
+            <w:r>
+              <w:rPr>
+                <w:b/>
+                <w:i w:val="0"/>
+                <w:color w:val="1A56DB"/>
+                <w:sz w:val="20"/>
+              </w:rPr>
+              <w:t>🔵</w:t>
+            </w:r>
+          </w:p>
+        </w:tc>
+      </w:tr>
+      <w:tr>
+        <w:tc>
+          <w:tcPr>
+            <w:tcW w:type="dxa" w:w="10204"/>
+            <w:gridSpan w:val="7"/>
+            <w:shd w:val="clear" w:color="auto" w:fill="1E40AF"/>
+            <w:tcMar>
+              <w:top w:w="60" w:type="dxa"/>
+              <w:bottom w:w="60" w:type="dxa"/>
+              <w:left w:w="140" w:type="dxa"/>
+              <w:right w:w="80" w:type="dxa"/>
+            </w:tcMar>
+          </w:tcPr>
+          <w:p>
+            <w:pPr>
+              <w:jc w:val="left"/>
+              <w:spacing w:before="40" w:after="40"/>
+            </w:pPr>
+            <w:r>
+              <w:rPr>
+                <w:b/>
+                <w:i w:val="0"/>
+                <w:color w:val="BFDBFE"/>
+                <w:sz w:val="18"/>
+              </w:rPr>
+              <w:t>▌  代理店・パートナー候補（日本側OEM仲介）</w:t>
+            </w:r>
+          </w:p>
+        </w:tc>
+      </w:tr>
+      <w:tr>
+        <w:tc>
+          <w:tcPr>
+            <w:tcW w:type="dxa" w:w="1984"/>
+            <w:shd w:val="clear" w:color="auto" w:fill="F0F9FF"/>
+            <w:tcMar>
+              <w:top w:w="60" w:type="dxa"/>
+              <w:bottom w:w="60" w:type="dxa"/>
+              <w:left w:w="100" w:type="dxa"/>
+              <w:right w:w="80" w:type="dxa"/>
+            </w:tcMar>
+            <w:tcBorders>
+              <w:top w:val="single" w:sz="4" w:space="0" w:color="DBEAFE"/>
+              <w:bottom w:val="single" w:sz="4" w:space="0" w:color="DBEAFE"/>
+              <w:left w:val="single" w:sz="4" w:space="0" w:color="DBEAFE"/>
+              <w:right w:val="single" w:sz="4" w:space="0" w:color="DBEAFE"/>
+            </w:tcBorders>
+          </w:tcPr>
+          <w:p>
+            <w:pPr>
+              <w:jc w:val="left"/>
+              <w:spacing w:before="40" w:after="10"/>
+            </w:pPr>
+            <w:r>
+              <w:rPr>
+                <w:b/>
+                <w:i w:val="0"/>
+                <w:color w:val="0F2D5E"/>
+                <w:sz w:val="20"/>
+              </w:rPr>
+              <w:t>株式会社 茅</w:t>
+            </w:r>
+          </w:p>
+          <w:p>
+            <w:pPr>
+              <w:spacing w:before="0" w:after="40"/>
+            </w:pPr>
+            <w:r>
+              <w:rPr>
+                <w:b w:val="0"/>
+                <w:i w:val="0"/>
+                <w:color w:val="64748B"/>
+                <w:sz w:val="16"/>
+              </w:rPr>
+              <w:t>日本 / OEM仲介業</w:t>
+            </w:r>
+          </w:p>
+        </w:tc>
+        <w:tc>
+          <w:tcPr>
+            <w:tcW w:type="dxa" w:w="1361"/>
+            <w:shd w:val="clear" w:color="auto" w:fill="F0F9FF"/>
+            <w:tcMar>
+              <w:top w:w="60" w:type="dxa"/>
+              <w:bottom w:w="60" w:type="dxa"/>
+              <w:left w:w="80" w:type="dxa"/>
+              <w:right w:w="80" w:type="dxa"/>
+            </w:tcMar>
+            <w:tcBorders>
+              <w:top w:val="single" w:sz="4" w:space="0" w:color="DBEAFE"/>
+              <w:bottom w:val="single" w:sz="4" w:space="0" w:color="DBEAFE"/>
+              <w:left w:val="single" w:sz="4" w:space="0" w:color="DBEAFE"/>
+              <w:right w:val="single" w:sz="4" w:space="0" w:color="DBEAFE"/>
+            </w:tcBorders>
+          </w:tcPr>
+          <w:p>
+            <w:pPr>
+              <w:jc w:val="left"/>
+              <w:spacing w:before="40" w:after="40"/>
+            </w:pPr>
+            <w:r>
+              <w:rPr>
+                <w:b w:val="0"/>
+                <w:i w:val="0"/>
+                <w:color w:val="475569"/>
+                <w:sz w:val="18"/>
+              </w:rPr>
+              <w:t>バッグ・小物OEM仲介</w:t>
+            </w:r>
+          </w:p>
+        </w:tc>
+        <w:tc>
+          <w:tcPr>
+            <w:tcW w:type="dxa" w:w="680"/>
+            <w:shd w:val="clear" w:color="auto" w:fill="F0F9FF"/>
+            <w:tcMar>
+              <w:top w:w="60" w:type="dxa"/>
+              <w:bottom w:w="60" w:type="dxa"/>
+              <w:left w:w="80" w:type="dxa"/>
+              <w:right w:w="80" w:type="dxa"/>
+            </w:tcMar>
+            <w:tcBorders>
+              <w:top w:val="single" w:sz="4" w:space="0" w:color="DBEAFE"/>
+              <w:bottom w:val="single" w:sz="4" w:space="0" w:color="DBEAFE"/>
+              <w:left w:val="single" w:sz="4" w:space="0" w:color="DBEAFE"/>
+              <w:right w:val="single" w:sz="4" w:space="0" w:color="DBEAFE"/>
+            </w:tcBorders>
+          </w:tcPr>
+          <w:p>
+            <w:pPr>
+              <w:jc w:val="center"/>
+              <w:spacing w:before="40" w:after="40"/>
+            </w:pPr>
+            <w:r>
+              <w:rPr>
+                <w:b w:val="0"/>
+                <w:i w:val="0"/>
+                <w:color w:val="475569"/>
+                <w:sz w:val="18"/>
+              </w:rPr>
+              <w:t>あり</w:t>
+            </w:r>
+          </w:p>
+        </w:tc>
+        <w:tc>
+          <w:tcPr>
+            <w:tcW w:type="dxa" w:w="1247"/>
+            <w:shd w:val="clear" w:color="auto" w:fill="F0F9FF"/>
+            <w:tcMar>
+              <w:top w:w="60" w:type="dxa"/>
+              <w:bottom w:w="60" w:type="dxa"/>
+              <w:left w:w="80" w:type="dxa"/>
+              <w:right w:w="80" w:type="dxa"/>
+            </w:tcMar>
+            <w:tcBorders>
+              <w:top w:val="single" w:sz="4" w:space="0" w:color="DBEAFE"/>
+              <w:bottom w:val="single" w:sz="4" w:space="0" w:color="DBEAFE"/>
+              <w:left w:val="single" w:sz="4" w:space="0" w:color="DBEAFE"/>
+              <w:right w:val="single" w:sz="4" w:space="0" w:color="DBEAFE"/>
+            </w:tcBorders>
+          </w:tcPr>
+          <w:p>
+            <w:pPr>
+              <w:jc w:val="center"/>
+              <w:spacing w:before="40" w:after="40"/>
+            </w:pPr>
+            <w:r>
+              <w:rPr>
+                <w:b w:val="0"/>
+                <w:i w:val="0"/>
+                <w:color w:val="475569"/>
+                <w:sz w:val="18"/>
+              </w:rPr>
+              <w:t>中国（自社工場）</w:t>
+            </w:r>
+          </w:p>
+        </w:tc>
+        <w:tc>
+          <w:tcPr>
+            <w:tcW w:type="dxa" w:w="1247"/>
+            <w:shd w:val="clear" w:color="auto" w:fill="F0F9FF"/>
+            <w:tcMar>
+              <w:top w:w="60" w:type="dxa"/>
+              <w:bottom w:w="60" w:type="dxa"/>
+              <w:left w:w="80" w:type="dxa"/>
+              <w:right w:w="80" w:type="dxa"/>
+            </w:tcMar>
+            <w:tcBorders>
+              <w:top w:val="single" w:sz="4" w:space="0" w:color="DBEAFE"/>
+              <w:bottom w:val="single" w:sz="4" w:space="0" w:color="DBEAFE"/>
+              <w:left w:val="single" w:sz="4" w:space="0" w:color="DBEAFE"/>
+              <w:right w:val="single" w:sz="4" w:space="0" w:color="DBEAFE"/>
+            </w:tcBorders>
+          </w:tcPr>
+          <w:p>
+            <w:pPr>
+              <w:jc w:val="left"/>
+              <w:spacing w:before="40" w:after="40"/>
+            </w:pPr>
+            <w:r>
+              <w:rPr>
+                <w:b/>
+                <w:i w:val="0"/>
+                <w:color w:val="1E40AF"/>
+                <w:sz w:val="18"/>
+              </w:rPr>
+              <w:t>代理店候補</w:t>
+            </w:r>
+          </w:p>
+        </w:tc>
+        <w:tc>
+          <w:tcPr>
+            <w:tcW w:type="dxa" w:w="3118"/>
+            <w:shd w:val="clear" w:color="auto" w:fill="F0F9FF"/>
+            <w:tcMar>
+              <w:top w:w="60" w:type="dxa"/>
+              <w:bottom w:w="60" w:type="dxa"/>
+              <w:left w:w="80" w:type="dxa"/>
+              <w:right w:w="80" w:type="dxa"/>
+            </w:tcMar>
+            <w:tcBorders>
+              <w:top w:val="single" w:sz="4" w:space="0" w:color="DBEAFE"/>
+              <w:bottom w:val="single" w:sz="4" w:space="0" w:color="DBEAFE"/>
+              <w:left w:val="single" w:sz="4" w:space="0" w:color="DBEAFE"/>
+              <w:right w:val="single" w:sz="4" w:space="0" w:color="DBEAFE"/>
+            </w:tcBorders>
+          </w:tcPr>
+          <w:p>
+            <w:pPr>
+              <w:jc w:val="left"/>
+              <w:spacing w:before="40" w:after="40"/>
+            </w:pPr>
+            <w:r>
+              <w:rPr>
+                <w:b w:val="0"/>
+                <w:i w:val="0"/>
+                <w:color w:val="475569"/>
+                <w:sz w:val="18"/>
+              </w:rPr>
+              <w:t>中国工場を自社保有するOEM仲介。競合だが日本側代理店として取り込める可能性あり。中国→韓国への切替提案から関係構築。</w:t>
+            </w:r>
+          </w:p>
+        </w:tc>
+        <w:tc>
+          <w:tcPr>
+            <w:tcW w:type="dxa" w:w="567"/>
+            <w:shd w:val="clear" w:color="auto" w:fill="F0F9FF"/>
+            <w:tcMar>
+              <w:top w:w="60" w:type="dxa"/>
+              <w:bottom w:w="60" w:type="dxa"/>
+              <w:left w:w="60" w:type="dxa"/>
+              <w:right w:w="60" w:type="dxa"/>
+            </w:tcMar>
+            <w:tcBorders>
+              <w:top w:val="single" w:sz="4" w:space="0" w:color="DBEAFE"/>
+              <w:bottom w:val="single" w:sz="4" w:space="0" w:color="DBEAFE"/>
+              <w:left w:val="single" w:sz="4" w:space="0" w:color="DBEAFE"/>
+              <w:right w:val="single" w:sz="4" w:space="0" w:color="DBEAFE"/>
+            </w:tcBorders>
+          </w:tcPr>
+          <w:p>
+            <w:pPr>
+              <w:jc w:val="center"/>
+              <w:spacing w:before="40" w:after="40"/>
+            </w:pPr>
+            <w:r>
+              <w:rPr>
+                <w:b/>
+                <w:i w:val="0"/>
+                <w:color w:val="1A56DB"/>
+                <w:sz w:val="20"/>
+              </w:rPr>
+              <w:t>🟡</w:t>
+            </w:r>
+          </w:p>
+        </w:tc>
+      </w:tr>
+      <w:tr>
+        <w:tc>
+          <w:tcPr>
+            <w:tcW w:type="dxa" w:w="1984"/>
+            <w:shd w:val="clear" w:color="auto" w:fill="FFFFFF"/>
+            <w:tcMar>
+              <w:top w:w="60" w:type="dxa"/>
+              <w:bottom w:w="60" w:type="dxa"/>
+              <w:left w:w="100" w:type="dxa"/>
+              <w:right w:w="80" w:type="dxa"/>
+            </w:tcMar>
+            <w:tcBorders>
+              <w:top w:val="single" w:sz="4" w:space="0" w:color="DBEAFE"/>
+              <w:bottom w:val="single" w:sz="4" w:space="0" w:color="DBEAFE"/>
+              <w:left w:val="single" w:sz="4" w:space="0" w:color="DBEAFE"/>
+              <w:right w:val="single" w:sz="4" w:space="0" w:color="DBEAFE"/>
+            </w:tcBorders>
+          </w:tcPr>
+          <w:p>
+            <w:pPr>
+              <w:jc w:val="left"/>
+              <w:spacing w:before="40" w:after="10"/>
+            </w:pPr>
+            <w:r>
+              <w:rPr>
+                <w:b/>
+                <w:i w:val="0"/>
+                <w:color w:val="0F2D5E"/>
+                <w:sz w:val="20"/>
+              </w:rPr>
+              <w:t>株式会社 ユーティ</w:t>
+            </w:r>
+          </w:p>
+          <w:p>
+            <w:pPr>
+              <w:spacing w:before="0" w:after="40"/>
+            </w:pPr>
+            <w:r>
+              <w:rPr>
+                <w:b w:val="0"/>
+                <w:i w:val="0"/>
+                <w:color w:val="64748B"/>
+                <w:sz w:val="16"/>
+              </w:rPr>
+              <w:t>日本 / OEM受託</w:t>
+            </w:r>
+          </w:p>
+        </w:tc>
+        <w:tc>
+          <w:tcPr>
+            <w:tcW w:type="dxa" w:w="1361"/>
+            <w:shd w:val="clear" w:color="auto" w:fill="FFFFFF"/>
+            <w:tcMar>
+              <w:top w:w="60" w:type="dxa"/>
+              <w:bottom w:w="60" w:type="dxa"/>
+              <w:left w:w="80" w:type="dxa"/>
+              <w:right w:w="80" w:type="dxa"/>
+            </w:tcMar>
+            <w:tcBorders>
+              <w:top w:val="single" w:sz="4" w:space="0" w:color="DBEAFE"/>
+              <w:bottom w:val="single" w:sz="4" w:space="0" w:color="DBEAFE"/>
+              <w:left w:val="single" w:sz="4" w:space="0" w:color="DBEAFE"/>
+              <w:right w:val="single" w:sz="4" w:space="0" w:color="DBEAFE"/>
+            </w:tcBorders>
+          </w:tcPr>
+          <w:p>
+            <w:pPr>
+              <w:jc w:val="left"/>
+              <w:spacing w:before="40" w:after="40"/>
+            </w:pPr>
+            <w:r>
+              <w:rPr>
+                <w:b w:val="0"/>
+                <w:i w:val="0"/>
+                <w:color w:val="475569"/>
+                <w:sz w:val="18"/>
+              </w:rPr>
+              <w:t>バッグ・雑貨OEM受託</w:t>
+            </w:r>
+          </w:p>
+        </w:tc>
+        <w:tc>
+          <w:tcPr>
+            <w:tcW w:type="dxa" w:w="680"/>
+            <w:shd w:val="clear" w:color="auto" w:fill="FFFFFF"/>
+            <w:tcMar>
+              <w:top w:w="60" w:type="dxa"/>
+              <w:bottom w:w="60" w:type="dxa"/>
+              <w:left w:w="80" w:type="dxa"/>
+              <w:right w:w="80" w:type="dxa"/>
+            </w:tcMar>
+            <w:tcBorders>
+              <w:top w:val="single" w:sz="4" w:space="0" w:color="DBEAFE"/>
+              <w:bottom w:val="single" w:sz="4" w:space="0" w:color="DBEAFE"/>
+              <w:left w:val="single" w:sz="4" w:space="0" w:color="DBEAFE"/>
+              <w:right w:val="single" w:sz="4" w:space="0" w:color="DBEAFE"/>
+            </w:tcBorders>
+          </w:tcPr>
+          <w:p>
+            <w:pPr>
+              <w:jc w:val="center"/>
+              <w:spacing w:before="40" w:after="40"/>
+            </w:pPr>
+            <w:r>
+              <w:rPr>
+                <w:b w:val="0"/>
+                <w:i w:val="0"/>
+                <w:color w:val="475569"/>
+                <w:sz w:val="18"/>
+              </w:rPr>
+              <w:t>あり</w:t>
+            </w:r>
+          </w:p>
+        </w:tc>
+        <w:tc>
+          <w:tcPr>
+            <w:tcW w:type="dxa" w:w="1247"/>
+            <w:shd w:val="clear" w:color="auto" w:fill="FFFFFF"/>
+            <w:tcMar>
+              <w:top w:w="60" w:type="dxa"/>
+              <w:bottom w:w="60" w:type="dxa"/>
+              <w:left w:w="80" w:type="dxa"/>
+              <w:right w:w="80" w:type="dxa"/>
+            </w:tcMar>
+            <w:tcBorders>
+              <w:top w:val="single" w:sz="4" w:space="0" w:color="DBEAFE"/>
+              <w:bottom w:val="single" w:sz="4" w:space="0" w:color="DBEAFE"/>
+              <w:left w:val="single" w:sz="4" w:space="0" w:color="DBEAFE"/>
+              <w:right w:val="single" w:sz="4" w:space="0" w:color="DBEAFE"/>
+            </w:tcBorders>
+          </w:tcPr>
+          <w:p>
+            <w:pPr>
+              <w:jc w:val="center"/>
+              <w:spacing w:before="40" w:after="40"/>
+            </w:pPr>
+            <w:r>
+              <w:rPr>
+                <w:b w:val="0"/>
+                <w:i w:val="0"/>
+                <w:color w:val="475569"/>
+                <w:sz w:val="18"/>
+              </w:rPr>
+              <w:t>中国工場ネットワーク</w:t>
+            </w:r>
+          </w:p>
+        </w:tc>
+        <w:tc>
+          <w:tcPr>
+            <w:tcW w:type="dxa" w:w="1247"/>
+            <w:shd w:val="clear" w:color="auto" w:fill="FFFFFF"/>
+            <w:tcMar>
+              <w:top w:w="60" w:type="dxa"/>
+              <w:bottom w:w="60" w:type="dxa"/>
+              <w:left w:w="80" w:type="dxa"/>
+              <w:right w:w="80" w:type="dxa"/>
+            </w:tcMar>
+            <w:tcBorders>
+              <w:top w:val="single" w:sz="4" w:space="0" w:color="DBEAFE"/>
+              <w:bottom w:val="single" w:sz="4" w:space="0" w:color="DBEAFE"/>
+              <w:left w:val="single" w:sz="4" w:space="0" w:color="DBEAFE"/>
+              <w:right w:val="single" w:sz="4" w:space="0" w:color="DBEAFE"/>
+            </w:tcBorders>
+          </w:tcPr>
+          <w:p>
+            <w:pPr>
+              <w:jc w:val="left"/>
+              <w:spacing w:before="40" w:after="40"/>
+            </w:pPr>
+            <w:r>
+              <w:rPr>
+                <w:b/>
+                <w:i w:val="0"/>
+                <w:color w:val="1E40AF"/>
+                <w:sz w:val="18"/>
+              </w:rPr>
+              <w:t>代理店候補</w:t>
+            </w:r>
+          </w:p>
+        </w:tc>
+        <w:tc>
+          <w:tcPr>
+            <w:tcW w:type="dxa" w:w="3118"/>
+            <w:shd w:val="clear" w:color="auto" w:fill="FFFFFF"/>
+            <w:tcMar>
+              <w:top w:w="60" w:type="dxa"/>
+              <w:bottom w:w="60" w:type="dxa"/>
+              <w:left w:w="80" w:type="dxa"/>
+              <w:right w:w="80" w:type="dxa"/>
+            </w:tcMar>
+            <w:tcBorders>
+              <w:top w:val="single" w:sz="4" w:space="0" w:color="DBEAFE"/>
+              <w:bottom w:val="single" w:sz="4" w:space="0" w:color="DBEAFE"/>
+              <w:left w:val="single" w:sz="4" w:space="0" w:color="DBEAFE"/>
+              <w:right w:val="single" w:sz="4" w:space="0" w:color="DBEAFE"/>
+            </w:tcBorders>
+          </w:tcPr>
+          <w:p>
+            <w:pPr>
+              <w:jc w:val="left"/>
+              <w:spacing w:before="40" w:after="40"/>
+            </w:pPr>
+            <w:r>
+              <w:rPr>
+                <w:b w:val="0"/>
+                <w:i w:val="0"/>
+                <w:color w:val="475569"/>
+                <w:sz w:val="18"/>
+              </w:rPr>
+              <w:t>日本語対応OEM仲介。中国工場依存 → Sanheを供給元として提案。日本ブランドへの間接アプローチルートになりうる。</w:t>
+            </w:r>
+          </w:p>
+        </w:tc>
+        <w:tc>
+          <w:tcPr>
+            <w:tcW w:type="dxa" w:w="567"/>
+            <w:shd w:val="clear" w:color="auto" w:fill="FFFFFF"/>
+            <w:tcMar>
+              <w:top w:w="60" w:type="dxa"/>
+              <w:bottom w:w="60" w:type="dxa"/>
+              <w:left w:w="60" w:type="dxa"/>
+              <w:right w:w="60" w:type="dxa"/>
+            </w:tcMar>
+            <w:tcBorders>
+              <w:top w:val="single" w:sz="4" w:space="0" w:color="DBEAFE"/>
+              <w:bottom w:val="single" w:sz="4" w:space="0" w:color="DBEAFE"/>
+              <w:left w:val="single" w:sz="4" w:space="0" w:color="DBEAFE"/>
+              <w:right w:val="single" w:sz="4" w:space="0" w:color="DBEAFE"/>
+            </w:tcBorders>
+          </w:tcPr>
+          <w:p>
+            <w:pPr>
+              <w:jc w:val="center"/>
+              <w:spacing w:before="40" w:after="40"/>
+            </w:pPr>
+            <w:r>
+              <w:rPr>
+                <w:b/>
+                <w:i w:val="0"/>
+                <w:color w:val="1A56DB"/>
+                <w:sz w:val="20"/>
+              </w:rPr>
+              <w:t>🟡</w:t>
+            </w:r>
+          </w:p>
+        </w:tc>
+      </w:tr>
+      <w:tr>
+        <w:tc>
+          <w:tcPr>
+            <w:tcW w:type="dxa" w:w="10204"/>
+            <w:gridSpan w:val="7"/>
+            <w:shd w:val="clear" w:color="auto" w:fill="7F1D1D"/>
+            <w:tcMar>
+              <w:top w:w="60" w:type="dxa"/>
+              <w:bottom w:w="60" w:type="dxa"/>
+              <w:left w:w="140" w:type="dxa"/>
+              <w:right w:w="80" w:type="dxa"/>
+            </w:tcMar>
+          </w:tcPr>
+          <w:p>
+            <w:pPr>
+              <w:jc w:val="left"/>
+              <w:spacing w:before="40" w:after="40"/>
+            </w:pPr>
+            <w:r>
+              <w:rPr>
+                <w:b/>
+                <w:i w:val="0"/>
+                <w:color w:val="FECACA"/>
+                <w:sz w:val="18"/>
+              </w:rPr>
+              <w:t>▌  競合調査対象（価格・品質ベンチマーク用）</w:t>
+            </w:r>
+          </w:p>
+        </w:tc>
+      </w:tr>
+      <w:tr>
+        <w:tc>
+          <w:tcPr>
+            <w:tcW w:type="dxa" w:w="1984"/>
+            <w:shd w:val="clear" w:color="auto" w:fill="FEF2F2"/>
+            <w:tcMar>
+              <w:top w:w="60" w:type="dxa"/>
+              <w:bottom w:w="60" w:type="dxa"/>
+              <w:left w:w="100" w:type="dxa"/>
+              <w:right w:w="80" w:type="dxa"/>
+            </w:tcMar>
+            <w:tcBorders>
+              <w:top w:val="single" w:sz="4" w:space="0" w:color="DBEAFE"/>
+              <w:bottom w:val="single" w:sz="4" w:space="0" w:color="DBEAFE"/>
+              <w:left w:val="single" w:sz="4" w:space="0" w:color="DBEAFE"/>
+              <w:right w:val="single" w:sz="4" w:space="0" w:color="DBEAFE"/>
+            </w:tcBorders>
+          </w:tcPr>
+          <w:p>
+            <w:pPr>
+              <w:jc w:val="left"/>
+              <w:spacing w:before="40" w:after="10"/>
+            </w:pPr>
+            <w:r>
+              <w:rPr>
+                <w:b/>
+                <w:i w:val="0"/>
+                <w:color w:val="0F2D5E"/>
+                <w:sz w:val="20"/>
+              </w:rPr>
+              <w:t>HAINING ALLBRIGHT</w:t>
+            </w:r>
+          </w:p>
+          <w:p>
+            <w:pPr>
+              <w:spacing w:before="0" w:after="40"/>
+            </w:pPr>
+            <w:r>
+              <w:rPr>
+                <w:b w:val="0"/>
+                <w:i w:val="0"/>
+                <w:color w:val="64748B"/>
+                <w:sz w:val="16"/>
+              </w:rPr>
+              <w:t>中国・浙江省 / OEM工場</w:t>
+            </w:r>
+          </w:p>
+        </w:tc>
+        <w:tc>
+          <w:tcPr>
+            <w:tcW w:type="dxa" w:w="1361"/>
+            <w:shd w:val="clear" w:color="auto" w:fill="FEF2F2"/>
+            <w:tcMar>
+              <w:top w:w="60" w:type="dxa"/>
+              <w:bottom w:w="60" w:type="dxa"/>
+              <w:left w:w="80" w:type="dxa"/>
+              <w:right w:w="80" w:type="dxa"/>
+            </w:tcMar>
+            <w:tcBorders>
+              <w:top w:val="single" w:sz="4" w:space="0" w:color="DBEAFE"/>
+              <w:bottom w:val="single" w:sz="4" w:space="0" w:color="DBEAFE"/>
+              <w:left w:val="single" w:sz="4" w:space="0" w:color="DBEAFE"/>
+              <w:right w:val="single" w:sz="4" w:space="0" w:color="DBEAFE"/>
+            </w:tcBorders>
+          </w:tcPr>
+          <w:p>
+            <w:pPr>
+              <w:jc w:val="left"/>
+              <w:spacing w:before="40" w:after="40"/>
+            </w:pPr>
+            <w:r>
+              <w:rPr>
+                <w:b w:val="0"/>
+                <w:i w:val="0"/>
+                <w:color w:val="475569"/>
+                <w:sz w:val="18"/>
+              </w:rPr>
+              <w:t>バッグ・財布OEM</w:t>
+            </w:r>
+          </w:p>
+        </w:tc>
+        <w:tc>
+          <w:tcPr>
+            <w:tcW w:type="dxa" w:w="680"/>
+            <w:shd w:val="clear" w:color="auto" w:fill="FEF2F2"/>
+            <w:tcMar>
+              <w:top w:w="60" w:type="dxa"/>
+              <w:bottom w:w="60" w:type="dxa"/>
+              <w:left w:w="80" w:type="dxa"/>
+              <w:right w:w="80" w:type="dxa"/>
+            </w:tcMar>
+            <w:tcBorders>
+              <w:top w:val="single" w:sz="4" w:space="0" w:color="DBEAFE"/>
+              <w:bottom w:val="single" w:sz="4" w:space="0" w:color="DBEAFE"/>
+              <w:left w:val="single" w:sz="4" w:space="0" w:color="DBEAFE"/>
+              <w:right w:val="single" w:sz="4" w:space="0" w:color="DBEAFE"/>
+            </w:tcBorders>
+          </w:tcPr>
+          <w:p>
+            <w:pPr>
+              <w:jc w:val="center"/>
+              <w:spacing w:before="40" w:after="40"/>
+            </w:pPr>
+            <w:r>
+              <w:rPr>
+                <w:b w:val="0"/>
+                <w:i w:val="0"/>
+                <w:color w:val="475569"/>
+                <w:sz w:val="18"/>
+              </w:rPr>
+              <w:t>あり</w:t>
+            </w:r>
+          </w:p>
+        </w:tc>
+        <w:tc>
+          <w:tcPr>
+            <w:tcW w:type="dxa" w:w="1247"/>
+            <w:shd w:val="clear" w:color="auto" w:fill="FEF2F2"/>
+            <w:tcMar>
+              <w:top w:w="60" w:type="dxa"/>
+              <w:bottom w:w="60" w:type="dxa"/>
+              <w:left w:w="80" w:type="dxa"/>
+              <w:right w:w="80" w:type="dxa"/>
+            </w:tcMar>
+            <w:tcBorders>
+              <w:top w:val="single" w:sz="4" w:space="0" w:color="DBEAFE"/>
+              <w:bottom w:val="single" w:sz="4" w:space="0" w:color="DBEAFE"/>
+              <w:left w:val="single" w:sz="4" w:space="0" w:color="DBEAFE"/>
+              <w:right w:val="single" w:sz="4" w:space="0" w:color="DBEAFE"/>
+            </w:tcBorders>
+          </w:tcPr>
+          <w:p>
+            <w:pPr>
+              <w:jc w:val="center"/>
+              <w:spacing w:before="40" w:after="40"/>
+            </w:pPr>
+            <w:r>
+              <w:rPr>
+                <w:b w:val="0"/>
+                <w:i w:val="0"/>
+                <w:color w:val="475569"/>
+                <w:sz w:val="18"/>
+              </w:rPr>
+              <w:t>中国</w:t>
+            </w:r>
+          </w:p>
+        </w:tc>
+        <w:tc>
+          <w:tcPr>
+            <w:tcW w:type="dxa" w:w="1247"/>
+            <w:shd w:val="clear" w:color="auto" w:fill="FEF2F2"/>
+            <w:tcMar>
+              <w:top w:w="60" w:type="dxa"/>
+              <w:bottom w:w="60" w:type="dxa"/>
+              <w:left w:w="80" w:type="dxa"/>
+              <w:right w:w="80" w:type="dxa"/>
+            </w:tcMar>
+            <w:tcBorders>
+              <w:top w:val="single" w:sz="4" w:space="0" w:color="DBEAFE"/>
+              <w:bottom w:val="single" w:sz="4" w:space="0" w:color="DBEAFE"/>
+              <w:left w:val="single" w:sz="4" w:space="0" w:color="DBEAFE"/>
+              <w:right w:val="single" w:sz="4" w:space="0" w:color="DBEAFE"/>
             </w:tcBorders>
           </w:tcPr>
           <w:p>
@@ -4907,19 +4861,19 @@
         </w:tc>
         <w:tc>
           <w:tcPr>
-            <w:tcW w:type="dxa" w:w="1881"/>
+            <w:tcW w:type="dxa" w:w="3118"/>
             <w:shd w:val="clear" w:color="auto" w:fill="FEF2F2"/>
             <w:tcMar>
-              <w:top w:w="50" w:type="dxa"/>
-              <w:bottom w:w="50" w:type="dxa"/>
+              <w:top w:w="60" w:type="dxa"/>
+              <w:bottom w:w="60" w:type="dxa"/>
               <w:left w:w="80" w:type="dxa"/>
               <w:right w:w="80" w:type="dxa"/>
             </w:tcMar>
             <w:tcBorders>
-              <w:top w:val="single" w:sz="4" w:space="0" w:color="FECACA"/>
-              <w:bottom w:val="single" w:sz="4" w:space="0" w:color="FECACA"/>
-              <w:left w:val="single" w:sz="4" w:space="0" w:color="FECACA"/>
-              <w:right w:val="single" w:sz="4" w:space="0" w:color="FECACA"/>
+              <w:top w:val="single" w:sz="4" w:space="0" w:color="DBEAFE"/>
+              <w:bottom w:val="single" w:sz="4" w:space="0" w:color="DBEAFE"/>
+              <w:left w:val="single" w:sz="4" w:space="0" w:color="DBEAFE"/>
+              <w:right w:val="single" w:sz="4" w:space="0" w:color="DBEAFE"/>
             </w:tcBorders>
           </w:tcPr>
           <w:p>
@@ -4934,7 +4888,40 @@
                 <w:color w:val="475569"/>
                 <w:sz w:val="18"/>
               </w:rPr>
-              <w:t>価格帯・MOQ・素材ラインナップを詳細調査。Sanheの韓国品質との差別化材料</w:t>
+              <w:t>低価格・大ロット対応。価格帯・MOQ・リードタイムを調査してSanheの差別化ポジションを数値化する。</w:t>
+            </w:r>
+          </w:p>
+        </w:tc>
+        <w:tc>
+          <w:tcPr>
+            <w:tcW w:type="dxa" w:w="567"/>
+            <w:shd w:val="clear" w:color="auto" w:fill="FEF2F2"/>
+            <w:tcMar>
+              <w:top w:w="60" w:type="dxa"/>
+              <w:bottom w:w="60" w:type="dxa"/>
+              <w:left w:w="60" w:type="dxa"/>
+              <w:right w:w="60" w:type="dxa"/>
+            </w:tcMar>
+            <w:tcBorders>
+              <w:top w:val="single" w:sz="4" w:space="0" w:color="DBEAFE"/>
+              <w:bottom w:val="single" w:sz="4" w:space="0" w:color="DBEAFE"/>
+              <w:left w:val="single" w:sz="4" w:space="0" w:color="DBEAFE"/>
+              <w:right w:val="single" w:sz="4" w:space="0" w:color="DBEAFE"/>
+            </w:tcBorders>
+          </w:tcPr>
+          <w:p>
+            <w:pPr>
+              <w:jc w:val="center"/>
+              <w:spacing w:before="40" w:after="40"/>
+            </w:pPr>
+            <w:r>
+              <w:rPr>
+                <w:b/>
+                <w:i w:val="0"/>
+                <w:color w:val="1A56DB"/>
+                <w:sz w:val="20"/>
+              </w:rPr>
+              <w:t>🔴</w:t>
             </w:r>
           </w:p>
         </w:tc>
@@ -4942,19 +4929,19 @@
       <w:tr>
         <w:tc>
           <w:tcPr>
-            <w:tcW w:type="dxa" w:w="1881"/>
+            <w:tcW w:type="dxa" w:w="1984"/>
             <w:shd w:val="clear" w:color="auto" w:fill="FFFFFF"/>
             <w:tcMar>
-              <w:top w:w="50" w:type="dxa"/>
-              <w:bottom w:w="50" w:type="dxa"/>
-              <w:left w:w="80" w:type="dxa"/>
+              <w:top w:w="60" w:type="dxa"/>
+              <w:bottom w:w="60" w:type="dxa"/>
+              <w:left w:w="100" w:type="dxa"/>
               <w:right w:w="80" w:type="dxa"/>
             </w:tcMar>
             <w:tcBorders>
-              <w:top w:val="single" w:sz="4" w:space="0" w:color="FECACA"/>
-              <w:bottom w:val="single" w:sz="4" w:space="0" w:color="FECACA"/>
-              <w:left w:val="single" w:sz="4" w:space="0" w:color="FECACA"/>
-              <w:right w:val="single" w:sz="4" w:space="0" w:color="FECACA"/>
+              <w:top w:val="single" w:sz="4" w:space="0" w:color="DBEAFE"/>
+              <w:bottom w:val="single" w:sz="4" w:space="0" w:color="DBEAFE"/>
+              <w:left w:val="single" w:sz="4" w:space="0" w:color="DBEAFE"/>
+              <w:right w:val="single" w:sz="4" w:space="0" w:color="DBEAFE"/>
             </w:tcBorders>
           </w:tcPr>
           <w:p>
@@ -4966,7 +4953,7 @@
               <w:rPr>
                 <w:b/>
                 <w:i w:val="0"/>
-                <w:color w:val="991B1B"/>
+                <w:color w:val="0F2D5E"/>
                 <w:sz w:val="20"/>
               </w:rPr>
               <w:t>RIDER ENTERPRISE CO.</w:t>
@@ -4983,58 +4970,25 @@
                 <w:color w:val="64748B"/>
                 <w:sz w:val="16"/>
               </w:rPr>
-              <w:t>台湾・中国・ベトナム 3工場OEM</w:t>
+              <w:t>台湾 / 台中・中国・ベトナム</w:t>
             </w:r>
           </w:p>
         </w:tc>
         <w:tc>
           <w:tcPr>
-            <w:tcW w:type="dxa" w:w="1881"/>
+            <w:tcW w:type="dxa" w:w="1361"/>
             <w:shd w:val="clear" w:color="auto" w:fill="FFFFFF"/>
             <w:tcMar>
-              <w:top w:w="50" w:type="dxa"/>
-              <w:bottom w:w="50" w:type="dxa"/>
+              <w:top w:w="60" w:type="dxa"/>
+              <w:bottom w:w="60" w:type="dxa"/>
               <w:left w:w="80" w:type="dxa"/>
               <w:right w:w="80" w:type="dxa"/>
             </w:tcMar>
             <w:tcBorders>
-              <w:top w:val="single" w:sz="4" w:space="0" w:color="FECACA"/>
-              <w:bottom w:val="single" w:sz="4" w:space="0" w:color="FECACA"/>
-              <w:left w:val="single" w:sz="4" w:space="0" w:color="FECACA"/>
-              <w:right w:val="single" w:sz="4" w:space="0" w:color="FECACA"/>
-            </w:tcBorders>
-          </w:tcPr>
-          <w:p>
-            <w:pPr>
-              <w:jc w:val="left"/>
-              <w:spacing w:before="40" w:after="40"/>
-            </w:pPr>
-            <w:r>
-              <w:rPr>
-                <w:b w:val="0"/>
-                <w:i w:val="0"/>
-                <w:color w:val="1E3A5F"/>
-                <w:sz w:val="20"/>
-              </w:rPr>
-              <w:t>台湾</w:t>
-            </w:r>
-          </w:p>
-        </w:tc>
-        <w:tc>
-          <w:tcPr>
-            <w:tcW w:type="dxa" w:w="1881"/>
-            <w:shd w:val="clear" w:color="auto" w:fill="FFFFFF"/>
-            <w:tcMar>
-              <w:top w:w="50" w:type="dxa"/>
-              <w:bottom w:w="50" w:type="dxa"/>
-              <w:left w:w="80" w:type="dxa"/>
-              <w:right w:w="80" w:type="dxa"/>
-            </w:tcMar>
-            <w:tcBorders>
-              <w:top w:val="single" w:sz="4" w:space="0" w:color="FECACA"/>
-              <w:bottom w:val="single" w:sz="4" w:space="0" w:color="FECACA"/>
-              <w:left w:val="single" w:sz="4" w:space="0" w:color="FECACA"/>
-              <w:right w:val="single" w:sz="4" w:space="0" w:color="FECACA"/>
+              <w:top w:val="single" w:sz="4" w:space="0" w:color="DBEAFE"/>
+              <w:bottom w:val="single" w:sz="4" w:space="0" w:color="DBEAFE"/>
+              <w:left w:val="single" w:sz="4" w:space="0" w:color="DBEAFE"/>
+              <w:right w:val="single" w:sz="4" w:space="0" w:color="DBEAFE"/>
             </w:tcBorders>
           </w:tcPr>
           <w:p>
@@ -5049,25 +5003,91 @@
                 <w:color w:val="475569"/>
                 <w:sz w:val="18"/>
               </w:rPr>
-              <w:t>複数国3工場体制。多様なMOQ対応</w:t>
+              <w:t>バッグ・小物OEM</w:t>
             </w:r>
           </w:p>
         </w:tc>
         <w:tc>
           <w:tcPr>
-            <w:tcW w:type="dxa" w:w="1881"/>
+            <w:tcW w:type="dxa" w:w="680"/>
             <w:shd w:val="clear" w:color="auto" w:fill="FFFFFF"/>
             <w:tcMar>
-              <w:top w:w="50" w:type="dxa"/>
-              <w:bottom w:w="50" w:type="dxa"/>
+              <w:top w:w="60" w:type="dxa"/>
+              <w:bottom w:w="60" w:type="dxa"/>
               <w:left w:w="80" w:type="dxa"/>
               <w:right w:w="80" w:type="dxa"/>
             </w:tcMar>
             <w:tcBorders>
-              <w:top w:val="single" w:sz="4" w:space="0" w:color="FECACA"/>
-              <w:bottom w:val="single" w:sz="4" w:space="0" w:color="FECACA"/>
-              <w:left w:val="single" w:sz="4" w:space="0" w:color="FECACA"/>
-              <w:right w:val="single" w:sz="4" w:space="0" w:color="FECACA"/>
+              <w:top w:val="single" w:sz="4" w:space="0" w:color="DBEAFE"/>
+              <w:bottom w:val="single" w:sz="4" w:space="0" w:color="DBEAFE"/>
+              <w:left w:val="single" w:sz="4" w:space="0" w:color="DBEAFE"/>
+              <w:right w:val="single" w:sz="4" w:space="0" w:color="DBEAFE"/>
+            </w:tcBorders>
+          </w:tcPr>
+          <w:p>
+            <w:pPr>
+              <w:jc w:val="center"/>
+              <w:spacing w:before="40" w:after="40"/>
+            </w:pPr>
+            <w:r>
+              <w:rPr>
+                <w:b w:val="0"/>
+                <w:i w:val="0"/>
+                <w:color w:val="475569"/>
+                <w:sz w:val="18"/>
+              </w:rPr>
+              <w:t>あり</w:t>
+            </w:r>
+          </w:p>
+        </w:tc>
+        <w:tc>
+          <w:tcPr>
+            <w:tcW w:type="dxa" w:w="1247"/>
+            <w:shd w:val="clear" w:color="auto" w:fill="FFFFFF"/>
+            <w:tcMar>
+              <w:top w:w="60" w:type="dxa"/>
+              <w:bottom w:w="60" w:type="dxa"/>
+              <w:left w:w="80" w:type="dxa"/>
+              <w:right w:w="80" w:type="dxa"/>
+            </w:tcMar>
+            <w:tcBorders>
+              <w:top w:val="single" w:sz="4" w:space="0" w:color="DBEAFE"/>
+              <w:bottom w:val="single" w:sz="4" w:space="0" w:color="DBEAFE"/>
+              <w:left w:val="single" w:sz="4" w:space="0" w:color="DBEAFE"/>
+              <w:right w:val="single" w:sz="4" w:space="0" w:color="DBEAFE"/>
+            </w:tcBorders>
+          </w:tcPr>
+          <w:p>
+            <w:pPr>
+              <w:jc w:val="center"/>
+              <w:spacing w:before="40" w:after="40"/>
+            </w:pPr>
+            <w:r>
+              <w:rPr>
+                <w:b w:val="0"/>
+                <w:i w:val="0"/>
+                <w:color w:val="475569"/>
+                <w:sz w:val="18"/>
+              </w:rPr>
+              <w:t>台湾・中国・ベトナム</w:t>
+            </w:r>
+          </w:p>
+        </w:tc>
+        <w:tc>
+          <w:tcPr>
+            <w:tcW w:type="dxa" w:w="1247"/>
+            <w:shd w:val="clear" w:color="auto" w:fill="FFFFFF"/>
+            <w:tcMar>
+              <w:top w:w="60" w:type="dxa"/>
+              <w:bottom w:w="60" w:type="dxa"/>
+              <w:left w:w="80" w:type="dxa"/>
+              <w:right w:w="80" w:type="dxa"/>
+            </w:tcMar>
+            <w:tcBorders>
+              <w:top w:val="single" w:sz="4" w:space="0" w:color="DBEAFE"/>
+              <w:bottom w:val="single" w:sz="4" w:space="0" w:color="DBEAFE"/>
+              <w:left w:val="single" w:sz="4" w:space="0" w:color="DBEAFE"/>
+              <w:right w:val="single" w:sz="4" w:space="0" w:color="DBEAFE"/>
             </w:tcBorders>
           </w:tcPr>
           <w:p>
@@ -5088,19 +5108,19 @@
         </w:tc>
         <w:tc>
           <w:tcPr>
-            <w:tcW w:type="dxa" w:w="1881"/>
+            <w:tcW w:type="dxa" w:w="3118"/>
             <w:shd w:val="clear" w:color="auto" w:fill="FFFFFF"/>
             <w:tcMar>
-              <w:top w:w="50" w:type="dxa"/>
-              <w:bottom w:w="50" w:type="dxa"/>
+              <w:top w:w="60" w:type="dxa"/>
+              <w:bottom w:w="60" w:type="dxa"/>
               <w:left w:w="80" w:type="dxa"/>
               <w:right w:w="80" w:type="dxa"/>
             </w:tcMar>
             <w:tcBorders>
-              <w:top w:val="single" w:sz="4" w:space="0" w:color="FECACA"/>
-              <w:bottom w:val="single" w:sz="4" w:space="0" w:color="FECACA"/>
-              <w:left w:val="single" w:sz="4" w:space="0" w:color="FECACA"/>
-              <w:right w:val="single" w:sz="4" w:space="0" w:color="FECACA"/>
+              <w:top w:val="single" w:sz="4" w:space="0" w:color="DBEAFE"/>
+              <w:bottom w:val="single" w:sz="4" w:space="0" w:color="DBEAFE"/>
+              <w:left w:val="single" w:sz="4" w:space="0" w:color="DBEAFE"/>
+              <w:right w:val="single" w:sz="4" w:space="0" w:color="DBEAFE"/>
             </w:tcBorders>
           </w:tcPr>
           <w:p>
@@ -5115,556 +5135,105 @@
                 <w:color w:val="475569"/>
                 <w:sz w:val="18"/>
               </w:rPr>
-              <w:t>多拠点が強み。Sanheの「韓国専門特化」の逆算ポジションを整理する素材</w:t>
-            </w:r>
-          </w:p>
-        </w:tc>
-      </w:tr>
-      <w:tr>
-        <w:tc>
-          <w:tcPr>
-            <w:tcW w:type="dxa" w:w="1881"/>
-            <w:shd w:val="clear" w:color="auto" w:fill="FEF2F2"/>
-            <w:tcMar>
-              <w:top w:w="50" w:type="dxa"/>
-              <w:bottom w:w="50" w:type="dxa"/>
-              <w:left w:w="80" w:type="dxa"/>
-              <w:right w:w="80" w:type="dxa"/>
-            </w:tcMar>
-            <w:tcBorders>
-              <w:top w:val="single" w:sz="4" w:space="0" w:color="FECACA"/>
-              <w:bottom w:val="single" w:sz="4" w:space="0" w:color="FECACA"/>
-              <w:left w:val="single" w:sz="4" w:space="0" w:color="FECACA"/>
-              <w:right w:val="single" w:sz="4" w:space="0" w:color="FECACA"/>
-            </w:tcBorders>
-          </w:tcPr>
-          <w:p>
-            <w:pPr>
-              <w:jc w:val="left"/>
-              <w:spacing w:before="40" w:after="10"/>
-            </w:pPr>
-            <w:r>
-              <w:rPr>
-                <w:b/>
-                <w:i w:val="0"/>
-                <w:color w:val="991B1B"/>
-                <w:sz w:val="20"/>
-              </w:rPr>
-              <w:t>ANHUI RONGDA BAGS</w:t>
-            </w:r>
-          </w:p>
-          <w:p>
-            <w:pPr>
-              <w:spacing w:before="0" w:after="40"/>
-            </w:pPr>
-            <w:r>
-              <w:rPr>
-                <w:b w:val="0"/>
-                <w:i w:val="0"/>
-                <w:color w:val="64748B"/>
-                <w:sz w:val="16"/>
-              </w:rPr>
-              <w:t>バッグ・小物OEM / 中国・安徽省</w:t>
+              <w:t>3カ国工場体制が強み。多拠点対応 vs Sanheの「韓国品質特化」の差別化軸を整理する比較材料。</w:t>
             </w:r>
           </w:p>
         </w:tc>
         <w:tc>
           <w:tcPr>
-            <w:tcW w:type="dxa" w:w="1881"/>
-            <w:shd w:val="clear" w:color="auto" w:fill="FEF2F2"/>
+            <w:tcW w:type="dxa" w:w="567"/>
+            <w:shd w:val="clear" w:color="auto" w:fill="FFFFFF"/>
             <w:tcMar>
-              <w:top w:w="50" w:type="dxa"/>
-              <w:bottom w:w="50" w:type="dxa"/>
-              <w:left w:w="80" w:type="dxa"/>
-              <w:right w:w="80" w:type="dxa"/>
+              <w:top w:w="60" w:type="dxa"/>
+              <w:bottom w:w="60" w:type="dxa"/>
+              <w:left w:w="60" w:type="dxa"/>
+              <w:right w:w="60" w:type="dxa"/>
             </w:tcMar>
             <w:tcBorders>
-              <w:top w:val="single" w:sz="4" w:space="0" w:color="FECACA"/>
-              <w:bottom w:val="single" w:sz="4" w:space="0" w:color="FECACA"/>
-              <w:left w:val="single" w:sz="4" w:space="0" w:color="FECACA"/>
-              <w:right w:val="single" w:sz="4" w:space="0" w:color="FECACA"/>
+              <w:top w:val="single" w:sz="4" w:space="0" w:color="DBEAFE"/>
+              <w:bottom w:val="single" w:sz="4" w:space="0" w:color="DBEAFE"/>
+              <w:left w:val="single" w:sz="4" w:space="0" w:color="DBEAFE"/>
+              <w:right w:val="single" w:sz="4" w:space="0" w:color="DBEAFE"/>
             </w:tcBorders>
           </w:tcPr>
           <w:p>
             <w:pPr>
-              <w:jc w:val="left"/>
-              <w:spacing w:before="40" w:after="40"/>
-            </w:pPr>
-            <w:r>
-              <w:rPr>
-                <w:b w:val="0"/>
-                <w:i w:val="0"/>
-                <w:color w:val="1E3A5F"/>
-                <w:sz w:val="20"/>
-              </w:rPr>
-              <w:t>中国</w:t>
-            </w:r>
-          </w:p>
-        </w:tc>
-        <w:tc>
-          <w:tcPr>
-            <w:tcW w:type="dxa" w:w="1881"/>
-            <w:shd w:val="clear" w:color="auto" w:fill="FEF2F2"/>
-            <w:tcMar>
-              <w:top w:w="50" w:type="dxa"/>
-              <w:bottom w:w="50" w:type="dxa"/>
-              <w:left w:w="80" w:type="dxa"/>
-              <w:right w:w="80" w:type="dxa"/>
-            </w:tcMar>
-            <w:tcBorders>
-              <w:top w:val="single" w:sz="4" w:space="0" w:color="FECACA"/>
-              <w:bottom w:val="single" w:sz="4" w:space="0" w:color="FECACA"/>
-              <w:left w:val="single" w:sz="4" w:space="0" w:color="FECACA"/>
-              <w:right w:val="single" w:sz="4" w:space="0" w:color="FECACA"/>
-            </w:tcBorders>
-          </w:tcPr>
-          <w:p>
-            <w:pPr>
-              <w:jc w:val="left"/>
-              <w:spacing w:before="40" w:after="40"/>
-            </w:pPr>
-            <w:r>
-              <w:rPr>
-                <w:b w:val="0"/>
-                <w:i w:val="0"/>
-                <w:color w:val="475569"/>
-                <w:sz w:val="18"/>
-              </w:rPr>
-              <w:t>中国OEM工場。合成皮革・本革対応</w:t>
-            </w:r>
-          </w:p>
-        </w:tc>
-        <w:tc>
-          <w:tcPr>
-            <w:tcW w:type="dxa" w:w="1881"/>
-            <w:shd w:val="clear" w:color="auto" w:fill="FEF2F2"/>
-            <w:tcMar>
-              <w:top w:w="50" w:type="dxa"/>
-              <w:bottom w:w="50" w:type="dxa"/>
-              <w:left w:w="80" w:type="dxa"/>
-              <w:right w:w="80" w:type="dxa"/>
-            </w:tcMar>
-            <w:tcBorders>
-              <w:top w:val="single" w:sz="4" w:space="0" w:color="FECACA"/>
-              <w:bottom w:val="single" w:sz="4" w:space="0" w:color="FECACA"/>
-              <w:left w:val="single" w:sz="4" w:space="0" w:color="FECACA"/>
-              <w:right w:val="single" w:sz="4" w:space="0" w:color="FECACA"/>
-            </w:tcBorders>
-          </w:tcPr>
-          <w:p>
-            <w:pPr>
-              <w:jc w:val="left"/>
+              <w:jc w:val="center"/>
               <w:spacing w:before="40" w:after="40"/>
             </w:pPr>
             <w:r>
               <w:rPr>
                 <w:b/>
                 <w:i w:val="0"/>
-                <w:color w:val="991B1B"/>
-                <w:sz w:val="18"/>
-              </w:rPr>
-              <w:t>直接競合</w:t>
-            </w:r>
-          </w:p>
-        </w:tc>
-        <w:tc>
-          <w:tcPr>
-            <w:tcW w:type="dxa" w:w="1881"/>
-            <w:shd w:val="clear" w:color="auto" w:fill="FEF2F2"/>
-            <w:tcMar>
-              <w:top w:w="50" w:type="dxa"/>
-              <w:bottom w:w="50" w:type="dxa"/>
-              <w:left w:w="80" w:type="dxa"/>
-              <w:right w:w="80" w:type="dxa"/>
-            </w:tcMar>
-            <w:tcBorders>
-              <w:top w:val="single" w:sz="4" w:space="0" w:color="FECACA"/>
-              <w:bottom w:val="single" w:sz="4" w:space="0" w:color="FECACA"/>
-              <w:left w:val="single" w:sz="4" w:space="0" w:color="FECACA"/>
-              <w:right w:val="single" w:sz="4" w:space="0" w:color="FECACA"/>
-            </w:tcBorders>
-          </w:tcPr>
-          <w:p>
-            <w:pPr>
-              <w:jc w:val="left"/>
-              <w:spacing w:before="40" w:after="40"/>
-            </w:pPr>
-            <w:r>
-              <w:rPr>
-                <w:b w:val="0"/>
-                <w:i w:val="0"/>
-                <w:color w:val="475569"/>
-                <w:sz w:val="18"/>
-              </w:rPr>
-              <w:t>素材別の価格差・リードタイム差を比較。バイヤーの評価軸を収集</w:t>
-            </w:r>
-          </w:p>
-        </w:tc>
-      </w:tr>
-      <w:tr>
-        <w:tc>
-          <w:tcPr>
-            <w:tcW w:type="dxa" w:w="1881"/>
-            <w:shd w:val="clear" w:color="auto" w:fill="FFFFFF"/>
-            <w:tcMar>
-              <w:top w:w="50" w:type="dxa"/>
-              <w:bottom w:w="50" w:type="dxa"/>
-              <w:left w:w="80" w:type="dxa"/>
-              <w:right w:w="80" w:type="dxa"/>
-            </w:tcMar>
-            <w:tcBorders>
-              <w:top w:val="single" w:sz="4" w:space="0" w:color="FECACA"/>
-              <w:bottom w:val="single" w:sz="4" w:space="0" w:color="FECACA"/>
-              <w:left w:val="single" w:sz="4" w:space="0" w:color="FECACA"/>
-              <w:right w:val="single" w:sz="4" w:space="0" w:color="FECACA"/>
-            </w:tcBorders>
-          </w:tcPr>
-          <w:p>
-            <w:pPr>
-              <w:jc w:val="left"/>
-              <w:spacing w:before="40" w:after="10"/>
-            </w:pPr>
-            <w:r>
-              <w:rPr>
-                <w:b/>
-                <w:i w:val="0"/>
-                <w:color w:val="991B1B"/>
+                <w:color w:val="1A56DB"/>
                 <w:sz w:val="20"/>
               </w:rPr>
-              <w:t>株式会社 茅</w:t>
-            </w:r>
-          </w:p>
-          <w:p>
-            <w:pPr>
-              <w:spacing w:before="0" w:after="40"/>
-            </w:pPr>
-            <w:r>
-              <w:rPr>
-                <w:b w:val="0"/>
-                <w:i w:val="0"/>
-                <w:color w:val="64748B"/>
-                <w:sz w:val="16"/>
-              </w:rPr>
-              <w:t>日本OEM仲介・中国自社工場使用</w:t>
-            </w:r>
-          </w:p>
-        </w:tc>
-        <w:tc>
-          <w:tcPr>
-            <w:tcW w:type="dxa" w:w="1881"/>
-            <w:shd w:val="clear" w:color="auto" w:fill="FFFFFF"/>
-            <w:tcMar>
-              <w:top w:w="50" w:type="dxa"/>
-              <w:bottom w:w="50" w:type="dxa"/>
-              <w:left w:w="80" w:type="dxa"/>
-              <w:right w:w="80" w:type="dxa"/>
-            </w:tcMar>
-            <w:tcBorders>
-              <w:top w:val="single" w:sz="4" w:space="0" w:color="FECACA"/>
-              <w:bottom w:val="single" w:sz="4" w:space="0" w:color="FECACA"/>
-              <w:left w:val="single" w:sz="4" w:space="0" w:color="FECACA"/>
-              <w:right w:val="single" w:sz="4" w:space="0" w:color="FECACA"/>
-            </w:tcBorders>
-          </w:tcPr>
-          <w:p>
-            <w:pPr>
-              <w:jc w:val="left"/>
-              <w:spacing w:before="40" w:after="40"/>
-            </w:pPr>
-            <w:r>
-              <w:rPr>
-                <w:b w:val="0"/>
-                <w:i w:val="0"/>
-                <w:color w:val="1E3A5F"/>
-                <w:sz w:val="20"/>
-              </w:rPr>
-              <w:t>日本</w:t>
-            </w:r>
-          </w:p>
-        </w:tc>
-        <w:tc>
-          <w:tcPr>
-            <w:tcW w:type="dxa" w:w="1881"/>
-            <w:shd w:val="clear" w:color="auto" w:fill="FFFFFF"/>
-            <w:tcMar>
-              <w:top w:w="50" w:type="dxa"/>
-              <w:bottom w:w="50" w:type="dxa"/>
-              <w:left w:w="80" w:type="dxa"/>
-              <w:right w:w="80" w:type="dxa"/>
-            </w:tcMar>
-            <w:tcBorders>
-              <w:top w:val="single" w:sz="4" w:space="0" w:color="FECACA"/>
-              <w:bottom w:val="single" w:sz="4" w:space="0" w:color="FECACA"/>
-              <w:left w:val="single" w:sz="4" w:space="0" w:color="FECACA"/>
-              <w:right w:val="single" w:sz="4" w:space="0" w:color="FECACA"/>
-            </w:tcBorders>
-          </w:tcPr>
-          <w:p>
-            <w:pPr>
-              <w:jc w:val="left"/>
-              <w:spacing w:before="40" w:after="40"/>
-            </w:pPr>
-            <w:r>
-              <w:rPr>
-                <w:b w:val="0"/>
-                <w:i w:val="0"/>
-                <w:color w:val="475569"/>
-                <w:sz w:val="18"/>
-              </w:rPr>
-              <w:t>日本語対応OEM仲介業。日本ブランドの中間層</w:t>
-            </w:r>
-          </w:p>
-        </w:tc>
-        <w:tc>
-          <w:tcPr>
-            <w:tcW w:type="dxa" w:w="1881"/>
-            <w:shd w:val="clear" w:color="auto" w:fill="FFFFFF"/>
-            <w:tcMar>
-              <w:top w:w="50" w:type="dxa"/>
-              <w:bottom w:w="50" w:type="dxa"/>
-              <w:left w:w="80" w:type="dxa"/>
-              <w:right w:w="80" w:type="dxa"/>
-            </w:tcMar>
-            <w:tcBorders>
-              <w:top w:val="single" w:sz="4" w:space="0" w:color="FECACA"/>
-              <w:bottom w:val="single" w:sz="4" w:space="0" w:color="FECACA"/>
-              <w:left w:val="single" w:sz="4" w:space="0" w:color="FECACA"/>
-              <w:right w:val="single" w:sz="4" w:space="0" w:color="FECACA"/>
-            </w:tcBorders>
-          </w:tcPr>
-          <w:p>
-            <w:pPr>
-              <w:jc w:val="left"/>
-              <w:spacing w:before="40" w:after="40"/>
-            </w:pPr>
-            <w:r>
-              <w:rPr>
-                <w:b/>
-                <w:i w:val="0"/>
-                <w:color w:val="991B1B"/>
-                <w:sz w:val="18"/>
-              </w:rPr>
-              <w:t>競合 / 代理店候補</w:t>
-            </w:r>
-          </w:p>
-        </w:tc>
-        <w:tc>
-          <w:tcPr>
-            <w:tcW w:type="dxa" w:w="1881"/>
-            <w:shd w:val="clear" w:color="auto" w:fill="FFFFFF"/>
-            <w:tcMar>
-              <w:top w:w="50" w:type="dxa"/>
-              <w:bottom w:w="50" w:type="dxa"/>
-              <w:left w:w="80" w:type="dxa"/>
-              <w:right w:w="80" w:type="dxa"/>
-            </w:tcMar>
-            <w:tcBorders>
-              <w:top w:val="single" w:sz="4" w:space="0" w:color="FECACA"/>
-              <w:bottom w:val="single" w:sz="4" w:space="0" w:color="FECACA"/>
-              <w:left w:val="single" w:sz="4" w:space="0" w:color="FECACA"/>
-              <w:right w:val="single" w:sz="4" w:space="0" w:color="FECACA"/>
-            </w:tcBorders>
-          </w:tcPr>
-          <w:p>
-            <w:pPr>
-              <w:jc w:val="left"/>
-              <w:spacing w:before="40" w:after="40"/>
-            </w:pPr>
-            <w:r>
-              <w:rPr>
-                <w:b w:val="0"/>
-                <w:i w:val="0"/>
-                <w:color w:val="475569"/>
-                <w:sz w:val="18"/>
-              </w:rPr>
-              <w:t>競合だが日本代理店化できる可能性あり。中国工場依存からの切替提案</w:t>
-            </w:r>
-          </w:p>
-        </w:tc>
-      </w:tr>
-      <w:tr>
-        <w:tc>
-          <w:tcPr>
-            <w:tcW w:type="dxa" w:w="1881"/>
-            <w:shd w:val="clear" w:color="auto" w:fill="FEF2F2"/>
-            <w:tcMar>
-              <w:top w:w="50" w:type="dxa"/>
-              <w:bottom w:w="50" w:type="dxa"/>
-              <w:left w:w="80" w:type="dxa"/>
-              <w:right w:w="80" w:type="dxa"/>
-            </w:tcMar>
-            <w:tcBorders>
-              <w:top w:val="single" w:sz="4" w:space="0" w:color="FECACA"/>
-              <w:bottom w:val="single" w:sz="4" w:space="0" w:color="FECACA"/>
-              <w:left w:val="single" w:sz="4" w:space="0" w:color="FECACA"/>
-              <w:right w:val="single" w:sz="4" w:space="0" w:color="FECACA"/>
-            </w:tcBorders>
-          </w:tcPr>
-          <w:p>
-            <w:pPr>
-              <w:jc w:val="left"/>
-              <w:spacing w:before="40" w:after="10"/>
-            </w:pPr>
-            <w:r>
-              <w:rPr>
-                <w:b/>
-                <w:i w:val="0"/>
-                <w:color w:val="991B1B"/>
-                <w:sz w:val="20"/>
-              </w:rPr>
-              <w:t>株式会社 ユーティ</w:t>
-            </w:r>
-          </w:p>
-          <w:p>
-            <w:pPr>
-              <w:spacing w:before="0" w:after="40"/>
-            </w:pPr>
-            <w:r>
-              <w:rPr>
-                <w:b w:val="0"/>
-                <w:i w:val="0"/>
-                <w:color w:val="64748B"/>
-                <w:sz w:val="16"/>
-              </w:rPr>
-              <w:t>OEM受託製造（中国工場）/ バッグ・雑貨</w:t>
-            </w:r>
-          </w:p>
-        </w:tc>
-        <w:tc>
-          <w:tcPr>
-            <w:tcW w:type="dxa" w:w="1881"/>
-            <w:shd w:val="clear" w:color="auto" w:fill="FEF2F2"/>
-            <w:tcMar>
-              <w:top w:w="50" w:type="dxa"/>
-              <w:bottom w:w="50" w:type="dxa"/>
-              <w:left w:w="80" w:type="dxa"/>
-              <w:right w:w="80" w:type="dxa"/>
-            </w:tcMar>
-            <w:tcBorders>
-              <w:top w:val="single" w:sz="4" w:space="0" w:color="FECACA"/>
-              <w:bottom w:val="single" w:sz="4" w:space="0" w:color="FECACA"/>
-              <w:left w:val="single" w:sz="4" w:space="0" w:color="FECACA"/>
-              <w:right w:val="single" w:sz="4" w:space="0" w:color="FECACA"/>
-            </w:tcBorders>
-          </w:tcPr>
-          <w:p>
-            <w:pPr>
-              <w:jc w:val="left"/>
-              <w:spacing w:before="40" w:after="40"/>
-            </w:pPr>
-            <w:r>
-              <w:rPr>
-                <w:b w:val="0"/>
-                <w:i w:val="0"/>
-                <w:color w:val="1E3A5F"/>
-                <w:sz w:val="20"/>
-              </w:rPr>
-              <w:t>日本</w:t>
-            </w:r>
-          </w:p>
-        </w:tc>
-        <w:tc>
-          <w:tcPr>
-            <w:tcW w:type="dxa" w:w="1881"/>
-            <w:shd w:val="clear" w:color="auto" w:fill="FEF2F2"/>
-            <w:tcMar>
-              <w:top w:w="50" w:type="dxa"/>
-              <w:bottom w:w="50" w:type="dxa"/>
-              <w:left w:w="80" w:type="dxa"/>
-              <w:right w:w="80" w:type="dxa"/>
-            </w:tcMar>
-            <w:tcBorders>
-              <w:top w:val="single" w:sz="4" w:space="0" w:color="FECACA"/>
-              <w:bottom w:val="single" w:sz="4" w:space="0" w:color="FECACA"/>
-              <w:left w:val="single" w:sz="4" w:space="0" w:color="FECACA"/>
-              <w:right w:val="single" w:sz="4" w:space="0" w:color="FECACA"/>
-            </w:tcBorders>
-          </w:tcPr>
-          <w:p>
-            <w:pPr>
-              <w:jc w:val="left"/>
-              <w:spacing w:before="40" w:after="40"/>
-            </w:pPr>
-            <w:r>
-              <w:rPr>
-                <w:b w:val="0"/>
-                <w:i w:val="0"/>
-                <w:color w:val="475569"/>
-                <w:sz w:val="18"/>
-              </w:rPr>
-              <w:t>日本OEM仲介業。中国工場ネットワーク保有</w:t>
-            </w:r>
-          </w:p>
-        </w:tc>
-        <w:tc>
-          <w:tcPr>
-            <w:tcW w:type="dxa" w:w="1881"/>
-            <w:shd w:val="clear" w:color="auto" w:fill="FEF2F2"/>
-            <w:tcMar>
-              <w:top w:w="50" w:type="dxa"/>
-              <w:bottom w:w="50" w:type="dxa"/>
-              <w:left w:w="80" w:type="dxa"/>
-              <w:right w:w="80" w:type="dxa"/>
-            </w:tcMar>
-            <w:tcBorders>
-              <w:top w:val="single" w:sz="4" w:space="0" w:color="FECACA"/>
-              <w:bottom w:val="single" w:sz="4" w:space="0" w:color="FECACA"/>
-              <w:left w:val="single" w:sz="4" w:space="0" w:color="FECACA"/>
-              <w:right w:val="single" w:sz="4" w:space="0" w:color="FECACA"/>
-            </w:tcBorders>
-          </w:tcPr>
-          <w:p>
-            <w:pPr>
-              <w:jc w:val="left"/>
-              <w:spacing w:before="40" w:after="40"/>
-            </w:pPr>
-            <w:r>
-              <w:rPr>
-                <w:b/>
-                <w:i w:val="0"/>
-                <w:color w:val="991B1B"/>
-                <w:sz w:val="18"/>
-              </w:rPr>
-              <w:t>競合 / 代理店候補</w:t>
-            </w:r>
-          </w:p>
-        </w:tc>
-        <w:tc>
-          <w:tcPr>
-            <w:tcW w:type="dxa" w:w="1881"/>
-            <w:shd w:val="clear" w:color="auto" w:fill="FEF2F2"/>
-            <w:tcMar>
-              <w:top w:w="50" w:type="dxa"/>
-              <w:bottom w:w="50" w:type="dxa"/>
-              <w:left w:w="80" w:type="dxa"/>
-              <w:right w:w="80" w:type="dxa"/>
-            </w:tcMar>
-            <w:tcBorders>
-              <w:top w:val="single" w:sz="4" w:space="0" w:color="FECACA"/>
-              <w:bottom w:val="single" w:sz="4" w:space="0" w:color="FECACA"/>
-              <w:left w:val="single" w:sz="4" w:space="0" w:color="FECACA"/>
-              <w:right w:val="single" w:sz="4" w:space="0" w:color="FECACA"/>
-            </w:tcBorders>
-          </w:tcPr>
-          <w:p>
-            <w:pPr>
-              <w:jc w:val="left"/>
-              <w:spacing w:before="40" w:after="40"/>
-            </w:pPr>
-            <w:r>
-              <w:rPr>
-                <w:b w:val="0"/>
-                <w:i w:val="0"/>
-                <w:color w:val="475569"/>
-                <w:sz w:val="18"/>
-              </w:rPr>
-              <w:t>ユーティを通じたバイヤーへの間接アプローチも検討可能</w:t>
+              <w:t>🔴</w:t>
             </w:r>
           </w:p>
         </w:tc>
       </w:tr>
     </w:tbl>
     <w:p/>
+    <w:p>
+      <w:pPr>
+        <w:spacing w:before="40" w:after="80"/>
+      </w:pPr>
+      <w:r>
+        <w:rPr>
+          <w:b/>
+          <w:i w:val="0"/>
+          <w:color w:val="1E3A5F"/>
+          <w:sz w:val="18"/>
+        </w:rPr>
+        <w:t>優先度：</w:t>
+      </w:r>
+      <w:r>
+        <w:rPr>
+          <w:b w:val="0"/>
+          <w:i w:val="0"/>
+          <w:color w:val="64748B"/>
+          <w:sz w:val="18"/>
+        </w:rPr>
+        <w:t xml:space="preserve"> 🔵🔵🔵 最優先商談  </w:t>
+      </w:r>
+      <w:r>
+        <w:rPr>
+          <w:b w:val="0"/>
+          <w:i w:val="0"/>
+          <w:color w:val="64748B"/>
+          <w:sz w:val="18"/>
+        </w:rPr>
+        <w:t xml:space="preserve">🔵🔵 優先訪問  </w:t>
+      </w:r>
+      <w:r>
+        <w:rPr>
+          <w:b w:val="0"/>
+          <w:i w:val="0"/>
+          <w:color w:val="64748B"/>
+          <w:sz w:val="18"/>
+        </w:rPr>
+        <w:t xml:space="preserve">🔵 可能なら接触  </w:t>
+      </w:r>
+      <w:r>
+        <w:rPr>
+          <w:b w:val="0"/>
+          <w:i w:val="0"/>
+          <w:color w:val="64748B"/>
+          <w:sz w:val="18"/>
+        </w:rPr>
+        <w:t xml:space="preserve">🟡 関係構築候補  </w:t>
+      </w:r>
+      <w:r>
+        <w:rPr>
+          <w:b w:val="0"/>
+          <w:i w:val="0"/>
+          <w:color w:val="64748B"/>
+          <w:sz w:val="18"/>
+        </w:rPr>
+        <w:t>🔴 競合調査のみ</w:t>
+      </w:r>
+    </w:p>
     <w:tbl>
       <w:tblPr>
         <w:tblW w:type="auto" w:w="0"/>
@@ -5698,7 +5267,7 @@
                 <w:color w:val="93C5FD"/>
                 <w:sz w:val="22"/>
               </w:rPr>
-              <w:t>▌ 分析サマリー — 全バッチ調査の結論</w:t>
+              <w:t>▌ 分析サマリー</w:t>
             </w:r>
           </w:p>
           <w:p>
@@ -5712,7 +5281,7 @@
                 <w:color w:val="FFFFFF"/>
                 <w:sz w:val="20"/>
               </w:rPr>
-              <w:t>調査した出展者（ファッション雑貨EXPO・インバウンドEXPO計3バッチ）では、直接アプローチ候補は5社に絞られた。多くはOEM競合または非関連雑貨。</w:t>
+              <w:t>調査した出展者（全3バッチ）の中から10社を選定。うちターゲット商談候補6社、代理店候補2社、競合調査対象2社。</w:t>
             </w:r>
           </w:p>
           <w:p>
@@ -5735,7 +5304,7 @@
                 <w:color w:val="FFFFFF"/>
                 <w:sz w:val="20"/>
               </w:rPr>
-              <w:t>最優先：株式会社ラビット（中国工場からの切替余地、創業48年の実績あり）</w:t>
+              <w:t>最優先：株式会社ラビット（創業48年・中国工場依存からの切替余地が最も大きい）</w:t>
             </w:r>
           </w:p>
           <w:p>
@@ -5758,7 +5327,7 @@
                 <w:color w:val="FFFFFF"/>
                 <w:sz w:val="20"/>
               </w:rPr>
-              <w:t>競合OEM工場5社は「価格・品質調査対象」として積極的にブースを訪問する</w:t>
+              <w:t>競合2社は商談ではなく「ブース立ち寄り・カタログ収集・価格確認」のみで十分</w:t>
             </w:r>
           </w:p>
           <w:p>
@@ -5781,7 +5350,7 @@
                 <w:color w:val="FFFFFF"/>
                 <w:sz w:val="20"/>
               </w:rPr>
-              <w:t>全1,250社のうちまだ未調査セクションが多数 → 来場後のフロア探索が依然重要</w:t>
+              <w:t>全1,250社のうち未調査セクションが多数残存 → 来場後のフロア探索でさらに候補を増やせる</w:t>
             </w:r>
           </w:p>
         </w:tc>

</xml_diff>